<commit_message>
khac phuc loi create
</commit_message>
<xml_diff>
--- a/src/main/resources/templates/BaoCaoDeNghiGiaiNganKiemGiayNhanNo.docx
+++ b/src/main/resources/templates/BaoCaoDeNghiGiaiNganKiemGiayNhanNo.docx
@@ -141,7 +141,23 @@
           <w:i/>
           <w:sz w:val="28"/>
         </w:rPr>
-        <w:t>, ngày 09 tháng 01 năm 2026</w:t>
+        <w:t>, ngày…. t</w:t>
+      </w:r>
+      <w:r>
+        <w:rPr>
+          <w:rFonts w:ascii="Times New Roman" w:hAnsi="Times New Roman"/>
+          <w:i/>
+          <w:sz w:val="28"/>
+        </w:rPr>
+        <w:t>háng….</w:t>
+      </w:r>
+      <w:r>
+        <w:rPr>
+          <w:rFonts w:ascii="Times New Roman" w:hAnsi="Times New Roman"/>
+          <w:i/>
+          <w:sz w:val="28"/>
+        </w:rPr>
+        <w:t xml:space="preserve"> năm 2026</w:t>
       </w:r>
     </w:p>
     <w:p>
@@ -175,7 +191,14 @@
           <w:rFonts w:ascii="Times New Roman" w:hAnsi="Times New Roman"/>
           <w:sz w:val="28"/>
         </w:rPr>
-        <w:t>Số giải ngân: ………………..</w:t>
+        <w:t xml:space="preserve">Số giải ngân: </w:t>
+      </w:r>
+      <w:r>
+        <w:rPr>
+          <w:rFonts w:ascii="Times New Roman" w:hAnsi="Times New Roman"/>
+          <w:sz w:val="28"/>
+        </w:rPr>
+        <w:t>{{shdtd}}</w:t>
       </w:r>
     </w:p>
     <w:p>
@@ -403,8 +426,6 @@
         </w:rPr>
         <w:t>ng chú: {{ttkh}}</w:t>
       </w:r>
-      <w:bookmarkStart w:id="0" w:name="_GoBack"/>
-      <w:bookmarkEnd w:id="0"/>
     </w:p>
     <w:p>
       <w:pPr>
@@ -442,7 +463,14 @@
           <w:rFonts w:ascii="Times New Roman" w:hAnsi="Times New Roman"/>
           <w:sz w:val="28"/>
         </w:rPr>
-        <w:t>Sinh ngày: {{nsnt}}</w:t>
+        <w:t>Sinh năm</w:t>
+      </w:r>
+      <w:r>
+        <w:rPr>
+          <w:rFonts w:ascii="Times New Roman" w:hAnsi="Times New Roman"/>
+          <w:sz w:val="28"/>
+        </w:rPr>
+        <w:t>: {{nsnt}}</w:t>
       </w:r>
       <w:r>
         <w:rPr>
@@ -722,8 +750,8 @@
       <w:pPr>
         <w:pStyle w:val="ListParagraph"/>
         <w:numPr>
-          <w:ilvl w:val="1"/>
-          <w:numId w:val="1"/>
+          <w:ilvl w:val="0"/>
+          <w:numId w:val="4"/>
         </w:numPr>
         <w:rPr>
           <w:rFonts w:ascii="Times New Roman" w:hAnsi="Times New Roman"/>
@@ -735,7 +763,309 @@
           <w:rFonts w:ascii="Times New Roman" w:hAnsi="Times New Roman"/>
           <w:sz w:val="28"/>
         </w:rPr>
-        <w:t>Nguồn trả nợ</w:t>
+        <w:t xml:space="preserve">Tổng nhu cầu vốn của phương án = tổng chi phí của phương án – tổng chi phí gián tiếp:              </w:t>
+      </w:r>
+      <w:r>
+        <w:rPr>
+          <w:rFonts w:ascii="Times New Roman" w:hAnsi="Times New Roman"/>
+          <w:sz w:val="28"/>
+        </w:rPr>
+        <w:t xml:space="preserve">      </w:t>
+      </w:r>
+      <w:r>
+        <w:rPr>
+          <w:rFonts w:ascii="Times New Roman" w:hAnsi="Times New Roman"/>
+          <w:sz w:val="28"/>
+        </w:rPr>
+        <w:t xml:space="preserve">{{tongNCV}}           </w:t>
+      </w:r>
+      <w:r>
+        <w:rPr>
+          <w:rFonts w:ascii="Times New Roman" w:hAnsi="Times New Roman"/>
+          <w:sz w:val="28"/>
+        </w:rPr>
+        <w:t xml:space="preserve">          </w:t>
+      </w:r>
+      <w:r>
+        <w:rPr>
+          <w:rFonts w:ascii="Times New Roman" w:hAnsi="Times New Roman"/>
+          <w:sz w:val="28"/>
+        </w:rPr>
+        <w:t xml:space="preserve">     </w:t>
+      </w:r>
+      <w:r>
+        <w:rPr>
+          <w:rFonts w:ascii="Times New Roman" w:hAnsi="Times New Roman"/>
+          <w:sz w:val="28"/>
+        </w:rPr>
+        <w:t>đồng</w:t>
+      </w:r>
+    </w:p>
+    <w:p>
+      <w:pPr>
+        <w:pStyle w:val="ListParagraph"/>
+        <w:numPr>
+          <w:ilvl w:val="0"/>
+          <w:numId w:val="5"/>
+        </w:numPr>
+        <w:rPr>
+          <w:rFonts w:ascii="Times New Roman" w:hAnsi="Times New Roman"/>
+          <w:sz w:val="28"/>
+        </w:rPr>
+      </w:pPr>
+      <w:r>
+        <w:rPr>
+          <w:rFonts w:ascii="Times New Roman" w:hAnsi="Times New Roman"/>
+          <w:sz w:val="28"/>
+        </w:rPr>
+        <w:t xml:space="preserve">Vốn tự có:                        {{vonTuCo}}           </w:t>
+      </w:r>
+      <w:r>
+        <w:rPr>
+          <w:rFonts w:ascii="Times New Roman" w:hAnsi="Times New Roman"/>
+          <w:sz w:val="28"/>
+        </w:rPr>
+        <w:t xml:space="preserve">          </w:t>
+      </w:r>
+      <w:r>
+        <w:rPr>
+          <w:rFonts w:ascii="Times New Roman" w:hAnsi="Times New Roman"/>
+          <w:sz w:val="28"/>
+        </w:rPr>
+        <w:t xml:space="preserve">     </w:t>
+      </w:r>
+      <w:r>
+        <w:rPr>
+          <w:rFonts w:ascii="Times New Roman" w:hAnsi="Times New Roman"/>
+          <w:sz w:val="28"/>
+        </w:rPr>
+        <w:t>đồng</w:t>
+      </w:r>
+    </w:p>
+    <w:p>
+      <w:pPr>
+        <w:pStyle w:val="ListParagraph"/>
+        <w:numPr>
+          <w:ilvl w:val="0"/>
+          <w:numId w:val="5"/>
+        </w:numPr>
+        <w:rPr>
+          <w:rFonts w:ascii="Times New Roman" w:hAnsi="Times New Roman"/>
+          <w:sz w:val="28"/>
+        </w:rPr>
+      </w:pPr>
+      <w:r>
+        <w:rPr>
+          <w:rFonts w:ascii="Times New Roman" w:hAnsi="Times New Roman"/>
+          <w:sz w:val="28"/>
+        </w:rPr>
+        <w:t xml:space="preserve">Vốn xin vay của Quỹ:      {{tienso}}                </w:t>
+      </w:r>
+      <w:r>
+        <w:rPr>
+          <w:rFonts w:ascii="Times New Roman" w:hAnsi="Times New Roman"/>
+          <w:sz w:val="28"/>
+        </w:rPr>
+        <w:t xml:space="preserve">     </w:t>
+      </w:r>
+      <w:r>
+        <w:rPr>
+          <w:rFonts w:ascii="Times New Roman" w:hAnsi="Times New Roman"/>
+          <w:sz w:val="28"/>
+        </w:rPr>
+        <w:t xml:space="preserve"> </w:t>
+      </w:r>
+      <w:r>
+        <w:rPr>
+          <w:rFonts w:ascii="Times New Roman" w:hAnsi="Times New Roman"/>
+          <w:sz w:val="28"/>
+        </w:rPr>
+        <w:t xml:space="preserve">    </w:t>
+      </w:r>
+      <w:r>
+        <w:rPr>
+          <w:rFonts w:ascii="Times New Roman" w:hAnsi="Times New Roman"/>
+          <w:sz w:val="28"/>
+        </w:rPr>
+        <w:t>đồng</w:t>
+      </w:r>
+    </w:p>
+    <w:p>
+      <w:pPr>
+        <w:pStyle w:val="ListParagraph"/>
+        <w:numPr>
+          <w:ilvl w:val="0"/>
+          <w:numId w:val="4"/>
+        </w:numPr>
+        <w:rPr>
+          <w:rFonts w:ascii="Times New Roman" w:hAnsi="Times New Roman"/>
+          <w:sz w:val="28"/>
+        </w:rPr>
+      </w:pPr>
+      <w:r>
+        <w:rPr>
+          <w:rFonts w:ascii="Times New Roman" w:hAnsi="Times New Roman"/>
+          <w:sz w:val="28"/>
+        </w:rPr>
+        <w:t>Hiệu quả của phương án:</w:t>
+      </w:r>
+    </w:p>
+    <w:p>
+      <w:pPr>
+        <w:pStyle w:val="ListParagraph"/>
+        <w:numPr>
+          <w:ilvl w:val="0"/>
+          <w:numId w:val="5"/>
+        </w:numPr>
+        <w:rPr>
+          <w:rFonts w:ascii="Times New Roman" w:hAnsi="Times New Roman"/>
+          <w:sz w:val="28"/>
+        </w:rPr>
+      </w:pPr>
+      <w:r>
+        <w:rPr>
+          <w:rFonts w:ascii="Times New Roman" w:hAnsi="Times New Roman"/>
+          <w:sz w:val="28"/>
+        </w:rPr>
+        <w:t xml:space="preserve">Dự kiến thu nhập: </w:t>
+      </w:r>
+      <w:r>
+        <w:rPr>
+          <w:rFonts w:ascii="Times New Roman" w:hAnsi="Times New Roman"/>
+          <w:sz w:val="28"/>
+        </w:rPr>
+        <w:t xml:space="preserve">            {{tongDoanhThu}}</w:t>
+      </w:r>
+      <w:r>
+        <w:rPr>
+          <w:rFonts w:ascii="Times New Roman" w:hAnsi="Times New Roman"/>
+          <w:sz w:val="28"/>
+        </w:rPr>
+        <w:t xml:space="preserve">        </w:t>
+      </w:r>
+      <w:r>
+        <w:rPr>
+          <w:rFonts w:ascii="Times New Roman" w:hAnsi="Times New Roman"/>
+          <w:sz w:val="28"/>
+        </w:rPr>
+        <w:t xml:space="preserve">               </w:t>
+      </w:r>
+      <w:r>
+        <w:rPr>
+          <w:rFonts w:ascii="Times New Roman" w:hAnsi="Times New Roman"/>
+          <w:sz w:val="28"/>
+        </w:rPr>
+        <w:t xml:space="preserve">  </w:t>
+      </w:r>
+      <w:r>
+        <w:rPr>
+          <w:rFonts w:ascii="Times New Roman" w:hAnsi="Times New Roman"/>
+          <w:sz w:val="28"/>
+        </w:rPr>
+        <w:t>đồng</w:t>
+      </w:r>
+    </w:p>
+    <w:p>
+      <w:pPr>
+        <w:pStyle w:val="ListParagraph"/>
+        <w:numPr>
+          <w:ilvl w:val="0"/>
+          <w:numId w:val="5"/>
+        </w:numPr>
+        <w:rPr>
+          <w:rFonts w:ascii="Times New Roman" w:hAnsi="Times New Roman"/>
+          <w:sz w:val="28"/>
+        </w:rPr>
+      </w:pPr>
+      <w:r>
+        <w:rPr>
+          <w:rFonts w:ascii="Times New Roman" w:hAnsi="Times New Roman"/>
+          <w:sz w:val="28"/>
+        </w:rPr>
+        <w:t xml:space="preserve">Dự kiến chi phí:                {{tongChiPhi}}                 </w:t>
+      </w:r>
+      <w:r>
+        <w:rPr>
+          <w:rFonts w:ascii="Times New Roman" w:hAnsi="Times New Roman"/>
+          <w:sz w:val="28"/>
+        </w:rPr>
+        <w:t xml:space="preserve">   </w:t>
+      </w:r>
+      <w:r>
+        <w:rPr>
+          <w:rFonts w:ascii="Times New Roman" w:hAnsi="Times New Roman"/>
+          <w:sz w:val="28"/>
+        </w:rPr>
+        <w:t xml:space="preserve">     </w:t>
+      </w:r>
+      <w:r>
+        <w:rPr>
+          <w:rFonts w:ascii="Times New Roman" w:hAnsi="Times New Roman"/>
+          <w:sz w:val="28"/>
+        </w:rPr>
+        <w:t>đồng</w:t>
+      </w:r>
+    </w:p>
+    <w:p>
+      <w:pPr>
+        <w:pStyle w:val="ListParagraph"/>
+        <w:numPr>
+          <w:ilvl w:val="0"/>
+          <w:numId w:val="5"/>
+        </w:numPr>
+        <w:rPr>
+          <w:rFonts w:ascii="Times New Roman" w:hAnsi="Times New Roman"/>
+          <w:sz w:val="28"/>
+        </w:rPr>
+      </w:pPr>
+      <w:r>
+        <w:rPr>
+          <w:rFonts w:ascii="Times New Roman" w:hAnsi="Times New Roman"/>
+          <w:sz w:val="28"/>
+        </w:rPr>
+        <w:t>Chênh lệ</w:t>
+      </w:r>
+      <w:r>
+        <w:rPr>
+          <w:rFonts w:ascii="Times New Roman" w:hAnsi="Times New Roman"/>
+          <w:sz w:val="28"/>
+        </w:rPr>
+        <w:t>ch thu – chi         {{loiNhuan}}</w:t>
+      </w:r>
+      <w:r>
+        <w:rPr>
+          <w:rFonts w:ascii="Times New Roman" w:hAnsi="Times New Roman"/>
+          <w:sz w:val="28"/>
+        </w:rPr>
+        <w:t xml:space="preserve">     </w:t>
+      </w:r>
+      <w:r>
+        <w:rPr>
+          <w:rFonts w:ascii="Times New Roman" w:hAnsi="Times New Roman"/>
+          <w:sz w:val="28"/>
+        </w:rPr>
+        <w:t xml:space="preserve">               </w:t>
+      </w:r>
+      <w:r>
+        <w:rPr>
+          <w:rFonts w:ascii="Times New Roman" w:hAnsi="Times New Roman"/>
+          <w:sz w:val="28"/>
+        </w:rPr>
+        <w:t xml:space="preserve">   </w:t>
+      </w:r>
+      <w:r>
+        <w:rPr>
+          <w:rFonts w:ascii="Times New Roman" w:hAnsi="Times New Roman"/>
+          <w:sz w:val="28"/>
+        </w:rPr>
+        <w:t xml:space="preserve">     </w:t>
+      </w:r>
+      <w:r>
+        <w:rPr>
+          <w:rFonts w:ascii="Times New Roman" w:hAnsi="Times New Roman"/>
+          <w:sz w:val="28"/>
+        </w:rPr>
+        <w:t>đồng</w:t>
       </w:r>
     </w:p>
     <w:p>
@@ -755,24 +1085,117 @@
           <w:rFonts w:ascii="Times New Roman" w:hAnsi="Times New Roman"/>
           <w:sz w:val="28"/>
         </w:rPr>
-        <w:t>Đánh giá khả năng trả nợ:</w:t>
-      </w:r>
-    </w:p>
-    <w:p>
-      <w:pPr>
-        <w:pStyle w:val="ListParagraph"/>
-        <w:ind w:left="1140"/>
-        <w:rPr>
-          <w:rFonts w:ascii="Times New Roman" w:hAnsi="Times New Roman"/>
-          <w:sz w:val="28"/>
-        </w:rPr>
-      </w:pPr>
-      <w:r>
-        <w:rPr>
-          <w:rFonts w:ascii="Times New Roman" w:hAnsi="Times New Roman"/>
-          <w:sz w:val="28"/>
-        </w:rPr>
-        <w:t>Khách hàng có nguồn thu nhập cao, ổn định, đảm bảo khả năng trả nợ theo đúng thỏa thuận.</w:t>
+        <w:t>Nguồn trả nợ</w:t>
+      </w:r>
+    </w:p>
+    <w:p>
+      <w:pPr>
+        <w:pStyle w:val="ListParagraph"/>
+        <w:numPr>
+          <w:ilvl w:val="0"/>
+          <w:numId w:val="5"/>
+        </w:numPr>
+        <w:rPr>
+          <w:rFonts w:ascii="Times New Roman" w:hAnsi="Times New Roman"/>
+          <w:sz w:val="28"/>
+        </w:rPr>
+      </w:pPr>
+      <w:r>
+        <w:rPr>
+          <w:rFonts w:ascii="Times New Roman" w:hAnsi="Times New Roman"/>
+          <w:sz w:val="28"/>
+        </w:rPr>
+        <w:t xml:space="preserve">Từ thu nhập hoạt động của phương án:         </w:t>
+      </w:r>
+      <w:r>
+        <w:rPr>
+          <w:rFonts w:ascii="Times New Roman" w:hAnsi="Times New Roman"/>
+          <w:sz w:val="28"/>
+        </w:rPr>
+        <w:t>{{loiNhuan}}       đồng</w:t>
+      </w:r>
+      <w:r>
+        <w:rPr>
+          <w:rFonts w:ascii="Times New Roman" w:hAnsi="Times New Roman"/>
+          <w:sz w:val="28"/>
+        </w:rPr>
+        <w:t xml:space="preserve">   </w:t>
+      </w:r>
+    </w:p>
+    <w:p>
+      <w:pPr>
+        <w:pStyle w:val="ListParagraph"/>
+        <w:numPr>
+          <w:ilvl w:val="0"/>
+          <w:numId w:val="5"/>
+        </w:numPr>
+        <w:rPr>
+          <w:rFonts w:ascii="Times New Roman" w:hAnsi="Times New Roman"/>
+          <w:sz w:val="28"/>
+        </w:rPr>
+      </w:pPr>
+      <w:r>
+        <w:rPr>
+          <w:rFonts w:ascii="Times New Roman" w:hAnsi="Times New Roman"/>
+          <w:sz w:val="28"/>
+        </w:rPr>
+        <w:t>Thu nhậ</w:t>
+      </w:r>
+      <w:r>
+        <w:rPr>
+          <w:rFonts w:ascii="Times New Roman" w:hAnsi="Times New Roman"/>
+          <w:sz w:val="28"/>
+        </w:rPr>
+        <w:t>p khác</w:t>
+      </w:r>
+      <w:r>
+        <w:rPr>
+          <w:rFonts w:ascii="Times New Roman" w:hAnsi="Times New Roman"/>
+          <w:sz w:val="28"/>
+        </w:rPr>
+        <w:t>:</w:t>
+      </w:r>
+    </w:p>
+    <w:p>
+      <w:pPr>
+        <w:pStyle w:val="ListParagraph"/>
+        <w:numPr>
+          <w:ilvl w:val="0"/>
+          <w:numId w:val="5"/>
+        </w:numPr>
+        <w:rPr>
+          <w:rFonts w:ascii="Times New Roman" w:hAnsi="Times New Roman"/>
+          <w:sz w:val="28"/>
+        </w:rPr>
+      </w:pPr>
+      <w:r>
+        <w:rPr>
+          <w:rFonts w:ascii="Times New Roman" w:hAnsi="Times New Roman"/>
+          <w:sz w:val="28"/>
+        </w:rPr>
+        <w:lastRenderedPageBreak/>
+        <w:t xml:space="preserve">Thu hồi vốn đầu tư phương án:                     {{thuHoiVon}}   </w:t>
+      </w:r>
+      <w:r>
+        <w:rPr>
+          <w:rFonts w:ascii="Times New Roman" w:hAnsi="Times New Roman"/>
+          <w:sz w:val="28"/>
+        </w:rPr>
+        <w:t xml:space="preserve"> </w:t>
+      </w:r>
+      <w:r>
+        <w:rPr>
+          <w:rFonts w:ascii="Times New Roman" w:hAnsi="Times New Roman"/>
+          <w:sz w:val="28"/>
+        </w:rPr>
+        <w:t xml:space="preserve">   </w:t>
+      </w:r>
+      <w:r>
+        <w:rPr>
+          <w:rFonts w:ascii="Times New Roman" w:hAnsi="Times New Roman"/>
+          <w:sz w:val="28"/>
+        </w:rPr>
+        <w:t>đồng</w:t>
       </w:r>
     </w:p>
     <w:p>
@@ -792,6 +1215,50 @@
           <w:rFonts w:ascii="Times New Roman" w:hAnsi="Times New Roman"/>
           <w:sz w:val="28"/>
         </w:rPr>
+        <w:t>Đánh giá khả năng trả nợ:</w:t>
+      </w:r>
+    </w:p>
+    <w:p>
+      <w:pPr>
+        <w:pStyle w:val="ListParagraph"/>
+        <w:ind w:left="1140"/>
+        <w:rPr>
+          <w:rFonts w:ascii="Times New Roman" w:hAnsi="Times New Roman"/>
+          <w:sz w:val="28"/>
+        </w:rPr>
+      </w:pPr>
+      <w:r>
+        <w:rPr>
+          <w:rFonts w:ascii="Times New Roman" w:hAnsi="Times New Roman"/>
+          <w:sz w:val="28"/>
+        </w:rPr>
+        <w:t>Khách hàng có hoạt động sản xuất kinh doanh tốt, ổn định, đảm bảo khả năng trả nợ theo đúng thỏa thuận</w:t>
+      </w:r>
+      <w:r>
+        <w:rPr>
+          <w:rFonts w:ascii="Times New Roman" w:hAnsi="Times New Roman"/>
+          <w:sz w:val="28"/>
+        </w:rPr>
+        <w:t>.</w:t>
+      </w:r>
+    </w:p>
+    <w:p>
+      <w:pPr>
+        <w:pStyle w:val="ListParagraph"/>
+        <w:numPr>
+          <w:ilvl w:val="1"/>
+          <w:numId w:val="1"/>
+        </w:numPr>
+        <w:rPr>
+          <w:rFonts w:ascii="Times New Roman" w:hAnsi="Times New Roman"/>
+          <w:sz w:val="28"/>
+        </w:rPr>
+      </w:pPr>
+      <w:r>
+        <w:rPr>
+          <w:rFonts w:ascii="Times New Roman" w:hAnsi="Times New Roman"/>
+          <w:sz w:val="28"/>
+        </w:rPr>
         <w:t>Đề nghị giải ngân.</w:t>
       </w:r>
     </w:p>
@@ -902,7 +1369,6 @@
           <w:rFonts w:ascii="Times New Roman" w:hAnsi="Times New Roman"/>
           <w:sz w:val="28"/>
         </w:rPr>
-        <w:lastRenderedPageBreak/>
         <w:t>Bằng chữ: {{tc}}.</w:t>
       </w:r>
     </w:p>
@@ -923,7 +1389,21 @@
           <w:rFonts w:ascii="Times New Roman" w:hAnsi="Times New Roman"/>
           <w:sz w:val="28"/>
         </w:rPr>
-        <w:t>Dư nợ trước nhận nợ  0 đồng.</w:t>
+        <w:t xml:space="preserve">Dư nợ trước nhận nợ  </w:t>
+      </w:r>
+      <w:r>
+        <w:rPr>
+          <w:rFonts w:ascii="Times New Roman" w:hAnsi="Times New Roman"/>
+          <w:sz w:val="28"/>
+        </w:rPr>
+        <w:t xml:space="preserve">                     </w:t>
+      </w:r>
+      <w:r>
+        <w:rPr>
+          <w:rFonts w:ascii="Times New Roman" w:hAnsi="Times New Roman"/>
+          <w:sz w:val="28"/>
+        </w:rPr>
+        <w:t>0 đồng.</w:t>
       </w:r>
     </w:p>
     <w:p>
@@ -1084,7 +1564,14 @@
           <w:rFonts w:ascii="Times New Roman" w:hAnsi="Times New Roman"/>
           <w:sz w:val="28"/>
         </w:rPr>
-        <w:t>Phương thức giải ngân: Chuyển khoản cho {{nck}}.</w:t>
+        <w:t>Phương thức giải ngân: Chuyển khoả</w:t>
+      </w:r>
+      <w:r>
+        <w:rPr>
+          <w:rFonts w:ascii="Times New Roman" w:hAnsi="Times New Roman"/>
+          <w:sz w:val="28"/>
+        </w:rPr>
+        <w:t>n:</w:t>
       </w:r>
     </w:p>
     <w:p>
@@ -1105,7 +1592,6 @@
     </w:p>
     <w:p>
       <w:pPr>
-        <w:ind w:left="720"/>
         <w:rPr>
           <w:rFonts w:ascii="Times New Roman" w:hAnsi="Times New Roman"/>
           <w:b/>
@@ -1166,7 +1652,7 @@
           <w:b/>
           <w:sz w:val="26"/>
         </w:rPr>
-        <w:t>Kế toán trưởng</w:t>
+        <w:t xml:space="preserve">   </w:t>
       </w:r>
       <w:r>
         <w:rPr>
@@ -1174,7 +1660,7 @@
           <w:b/>
           <w:sz w:val="26"/>
         </w:rPr>
-        <w:tab/>
+        <w:t>Kế</w:t>
       </w:r>
       <w:r>
         <w:rPr>
@@ -1182,7 +1668,7 @@
           <w:b/>
           <w:sz w:val="26"/>
         </w:rPr>
-        <w:t xml:space="preserve">          </w:t>
+        <w:t xml:space="preserve"> </w:t>
       </w:r>
       <w:r>
         <w:rPr>
@@ -1190,15 +1676,39 @@
           <w:b/>
           <w:sz w:val="26"/>
         </w:rPr>
-        <w:t>Giám đốc</w:t>
-      </w:r>
-    </w:p>
-    <w:p>
-      <w:pPr>
-        <w:rPr>
-          <w:rFonts w:ascii="Times New Roman" w:hAnsi="Times New Roman"/>
-          <w:i/>
-          <w:sz w:val="28"/>
+        <w:t>toán</w:t>
+      </w:r>
+      <w:r>
+        <w:rPr>
+          <w:rFonts w:ascii="Times New Roman" w:hAnsi="Times New Roman"/>
+          <w:b/>
+          <w:sz w:val="26"/>
+        </w:rPr>
+        <w:tab/>
+      </w:r>
+      <w:r>
+        <w:rPr>
+          <w:rFonts w:ascii="Times New Roman" w:hAnsi="Times New Roman"/>
+          <w:b/>
+          <w:sz w:val="26"/>
+        </w:rPr>
+        <w:t xml:space="preserve">          </w:t>
+      </w:r>
+      <w:r>
+        <w:rPr>
+          <w:rFonts w:ascii="Times New Roman" w:hAnsi="Times New Roman"/>
+          <w:b/>
+          <w:sz w:val="26"/>
+        </w:rPr>
+        <w:t xml:space="preserve">    {{nddpl}}                   </w:t>
+      </w:r>
+    </w:p>
+    <w:p>
+      <w:pPr>
+        <w:rPr>
+          <w:rFonts w:ascii="Times New Roman" w:hAnsi="Times New Roman"/>
+          <w:b/>
+          <w:sz w:val="26"/>
         </w:rPr>
       </w:pPr>
       <w:r>
@@ -1207,7 +1717,7 @@
           <w:i/>
           <w:sz w:val="26"/>
         </w:rPr>
-        <w:t xml:space="preserve">        (Ký, ghi rõ họ tên)</w:t>
+        <w:t>(Ký, ghi rõ họ tên)</w:t>
       </w:r>
       <w:r>
         <w:rPr>
@@ -1215,8 +1725,7 @@
           <w:i/>
           <w:sz w:val="26"/>
         </w:rPr>
-        <w:tab/>
-        <w:t xml:space="preserve">   </w:t>
+        <w:t xml:space="preserve">     </w:t>
       </w:r>
       <w:r>
         <w:rPr>
@@ -1240,7 +1749,7 @@
           <w:i/>
           <w:sz w:val="28"/>
         </w:rPr>
-        <w:t xml:space="preserve">   </w:t>
+        <w:t xml:space="preserve">  </w:t>
       </w:r>
       <w:r>
         <w:rPr>
@@ -1262,17 +1771,27 @@
         <w:rPr>
           <w:rFonts w:ascii="Times New Roman" w:hAnsi="Times New Roman"/>
           <w:i/>
-          <w:sz w:val="26"/>
-        </w:rPr>
-        <w:t xml:space="preserve"> </w:t>
-      </w:r>
+          <w:sz w:val="28"/>
+        </w:rPr>
+        <w:t xml:space="preserve">     </w:t>
+      </w:r>
+      <w:r>
+        <w:rPr>
+          <w:rFonts w:ascii="Times New Roman" w:hAnsi="Times New Roman"/>
+          <w:i/>
+          <w:sz w:val="28"/>
+        </w:rPr>
+        <w:t xml:space="preserve">    </w:t>
+      </w:r>
+      <w:bookmarkStart w:id="0" w:name="_GoBack"/>
+      <w:bookmarkEnd w:id="0"/>
       <w:r>
         <w:rPr>
           <w:rFonts w:ascii="Times New Roman" w:hAnsi="Times New Roman"/>
           <w:i/>
           <w:sz w:val="26"/>
         </w:rPr>
-        <w:t xml:space="preserve">  </w:t>
+        <w:t>(Ký tên, và đóng dấu</w:t>
       </w:r>
       <w:r>
         <w:rPr>
@@ -1280,7 +1799,7 @@
           <w:i/>
           <w:sz w:val="26"/>
         </w:rPr>
-        <w:t>(Ký, ghi rõ họ tên)</w:t>
+        <w:t>)</w:t>
       </w:r>
       <w:r>
         <w:rPr>
@@ -1324,7 +1843,15 @@
           <w:i/>
           <w:sz w:val="28"/>
         </w:rPr>
-        <w:t xml:space="preserve">                                           </w:t>
+        <w:t xml:space="preserve">           </w:t>
+      </w:r>
+      <w:r>
+        <w:rPr>
+          <w:rFonts w:ascii="Times New Roman" w:hAnsi="Times New Roman"/>
+          <w:i/>
+          <w:sz w:val="28"/>
+        </w:rPr>
+        <w:t xml:space="preserve">                    </w:t>
       </w:r>
       <w:r>
         <w:rPr>
@@ -1354,26 +1881,9 @@
         </w:rPr>
       </w:pPr>
     </w:p>
-    <w:p>
-      <w:pPr>
-        <w:rPr>
-          <w:rFonts w:ascii="Times New Roman" w:hAnsi="Times New Roman"/>
-          <w:i/>
-          <w:sz w:val="28"/>
-        </w:rPr>
-      </w:pPr>
-      <w:r>
-        <w:rPr>
-          <w:rFonts w:ascii="Times New Roman" w:hAnsi="Times New Roman"/>
-          <w:i/>
-          <w:sz w:val="28"/>
-        </w:rPr>
-        <w:tab/>
-      </w:r>
-    </w:p>
     <w:sectPr>
       <w:pgSz w:w="12240" w:h="15840"/>
-      <w:pgMar w:top="1134" w:right="1134" w:bottom="1134" w:left="1701" w:header="720" w:footer="720" w:gutter="0"/>
+      <w:pgMar w:top="567" w:right="1134" w:bottom="1134" w:left="1134" w:header="720" w:footer="720" w:gutter="0"/>
       <w:cols w:space="720"/>
       <w:docGrid w:linePitch="360"/>
     </w:sectPr>
@@ -1591,6 +2101,119 @@
     </w:lvl>
   </w:abstractNum>
   <w:abstractNum w:abstractNumId="2" w15:restartNumberingAfterBreak="0">
+    <w:nsid w:val="41342CAB"/>
+    <w:multiLevelType w:val="hybridMultilevel"/>
+    <w:tmpl w:val="BEDA3F9A"/>
+    <w:lvl w:ilvl="0" w:tplc="0390103A">
+      <w:start w:val="1"/>
+      <w:numFmt w:val="bullet"/>
+      <w:lvlText w:val="-"/>
+      <w:lvlJc w:val="left"/>
+      <w:pPr>
+        <w:ind w:left="1500" w:hanging="360"/>
+      </w:pPr>
+      <w:rPr>
+        <w:rFonts w:ascii="Times New Roman" w:eastAsiaTheme="minorHAnsi" w:hAnsi="Times New Roman" w:cs="Times New Roman" w:hint="default"/>
+      </w:rPr>
+    </w:lvl>
+    <w:lvl w:ilvl="1" w:tplc="04090003" w:tentative="1">
+      <w:start w:val="1"/>
+      <w:numFmt w:val="bullet"/>
+      <w:lvlText w:val="o"/>
+      <w:lvlJc w:val="left"/>
+      <w:pPr>
+        <w:ind w:left="2220" w:hanging="360"/>
+      </w:pPr>
+      <w:rPr>
+        <w:rFonts w:ascii="Courier New" w:hAnsi="Courier New" w:cs="Courier New" w:hint="default"/>
+      </w:rPr>
+    </w:lvl>
+    <w:lvl w:ilvl="2" w:tplc="04090005" w:tentative="1">
+      <w:start w:val="1"/>
+      <w:numFmt w:val="bullet"/>
+      <w:lvlText w:val=""/>
+      <w:lvlJc w:val="left"/>
+      <w:pPr>
+        <w:ind w:left="2940" w:hanging="360"/>
+      </w:pPr>
+      <w:rPr>
+        <w:rFonts w:ascii="Wingdings" w:hAnsi="Wingdings" w:hint="default"/>
+      </w:rPr>
+    </w:lvl>
+    <w:lvl w:ilvl="3" w:tplc="04090001" w:tentative="1">
+      <w:start w:val="1"/>
+      <w:numFmt w:val="bullet"/>
+      <w:lvlText w:val=""/>
+      <w:lvlJc w:val="left"/>
+      <w:pPr>
+        <w:ind w:left="3660" w:hanging="360"/>
+      </w:pPr>
+      <w:rPr>
+        <w:rFonts w:ascii="Symbol" w:hAnsi="Symbol" w:hint="default"/>
+      </w:rPr>
+    </w:lvl>
+    <w:lvl w:ilvl="4" w:tplc="04090003" w:tentative="1">
+      <w:start w:val="1"/>
+      <w:numFmt w:val="bullet"/>
+      <w:lvlText w:val="o"/>
+      <w:lvlJc w:val="left"/>
+      <w:pPr>
+        <w:ind w:left="4380" w:hanging="360"/>
+      </w:pPr>
+      <w:rPr>
+        <w:rFonts w:ascii="Courier New" w:hAnsi="Courier New" w:cs="Courier New" w:hint="default"/>
+      </w:rPr>
+    </w:lvl>
+    <w:lvl w:ilvl="5" w:tplc="04090005" w:tentative="1">
+      <w:start w:val="1"/>
+      <w:numFmt w:val="bullet"/>
+      <w:lvlText w:val=""/>
+      <w:lvlJc w:val="left"/>
+      <w:pPr>
+        <w:ind w:left="5100" w:hanging="360"/>
+      </w:pPr>
+      <w:rPr>
+        <w:rFonts w:ascii="Wingdings" w:hAnsi="Wingdings" w:hint="default"/>
+      </w:rPr>
+    </w:lvl>
+    <w:lvl w:ilvl="6" w:tplc="04090001" w:tentative="1">
+      <w:start w:val="1"/>
+      <w:numFmt w:val="bullet"/>
+      <w:lvlText w:val=""/>
+      <w:lvlJc w:val="left"/>
+      <w:pPr>
+        <w:ind w:left="5820" w:hanging="360"/>
+      </w:pPr>
+      <w:rPr>
+        <w:rFonts w:ascii="Symbol" w:hAnsi="Symbol" w:hint="default"/>
+      </w:rPr>
+    </w:lvl>
+    <w:lvl w:ilvl="7" w:tplc="04090003" w:tentative="1">
+      <w:start w:val="1"/>
+      <w:numFmt w:val="bullet"/>
+      <w:lvlText w:val="o"/>
+      <w:lvlJc w:val="left"/>
+      <w:pPr>
+        <w:ind w:left="6540" w:hanging="360"/>
+      </w:pPr>
+      <w:rPr>
+        <w:rFonts w:ascii="Courier New" w:hAnsi="Courier New" w:cs="Courier New" w:hint="default"/>
+      </w:rPr>
+    </w:lvl>
+    <w:lvl w:ilvl="8" w:tplc="04090005" w:tentative="1">
+      <w:start w:val="1"/>
+      <w:numFmt w:val="bullet"/>
+      <w:lvlText w:val=""/>
+      <w:lvlJc w:val="left"/>
+      <w:pPr>
+        <w:ind w:left="7260" w:hanging="360"/>
+      </w:pPr>
+      <w:rPr>
+        <w:rFonts w:ascii="Wingdings" w:hAnsi="Wingdings" w:hint="default"/>
+      </w:rPr>
+    </w:lvl>
+  </w:abstractNum>
+  <w:abstractNum w:abstractNumId="3" w15:restartNumberingAfterBreak="0">
     <w:nsid w:val="59432ACA"/>
     <w:multiLevelType w:val="hybridMultilevel"/>
     <w:tmpl w:val="611490C2"/>
@@ -1673,6 +2296,95 @@
       <w:lvlJc w:val="right"/>
       <w:pPr>
         <w:ind w:left="6480" w:hanging="180"/>
+      </w:pPr>
+    </w:lvl>
+  </w:abstractNum>
+  <w:abstractNum w:abstractNumId="4" w15:restartNumberingAfterBreak="0">
+    <w:nsid w:val="61EE231E"/>
+    <w:multiLevelType w:val="hybridMultilevel"/>
+    <w:tmpl w:val="C30073FE"/>
+    <w:lvl w:ilvl="0" w:tplc="E4228604">
+      <w:start w:val="1"/>
+      <w:numFmt w:val="lowerLetter"/>
+      <w:lvlText w:val="%1)"/>
+      <w:lvlJc w:val="left"/>
+      <w:pPr>
+        <w:ind w:left="1500" w:hanging="360"/>
+      </w:pPr>
+      <w:rPr>
+        <w:rFonts w:hint="default"/>
+      </w:rPr>
+    </w:lvl>
+    <w:lvl w:ilvl="1" w:tplc="04090019" w:tentative="1">
+      <w:start w:val="1"/>
+      <w:numFmt w:val="lowerLetter"/>
+      <w:lvlText w:val="%2."/>
+      <w:lvlJc w:val="left"/>
+      <w:pPr>
+        <w:ind w:left="2220" w:hanging="360"/>
+      </w:pPr>
+    </w:lvl>
+    <w:lvl w:ilvl="2" w:tplc="0409001B" w:tentative="1">
+      <w:start w:val="1"/>
+      <w:numFmt w:val="lowerRoman"/>
+      <w:lvlText w:val="%3."/>
+      <w:lvlJc w:val="right"/>
+      <w:pPr>
+        <w:ind w:left="2940" w:hanging="180"/>
+      </w:pPr>
+    </w:lvl>
+    <w:lvl w:ilvl="3" w:tplc="0409000F" w:tentative="1">
+      <w:start w:val="1"/>
+      <w:numFmt w:val="decimal"/>
+      <w:lvlText w:val="%4."/>
+      <w:lvlJc w:val="left"/>
+      <w:pPr>
+        <w:ind w:left="3660" w:hanging="360"/>
+      </w:pPr>
+    </w:lvl>
+    <w:lvl w:ilvl="4" w:tplc="04090019" w:tentative="1">
+      <w:start w:val="1"/>
+      <w:numFmt w:val="lowerLetter"/>
+      <w:lvlText w:val="%5."/>
+      <w:lvlJc w:val="left"/>
+      <w:pPr>
+        <w:ind w:left="4380" w:hanging="360"/>
+      </w:pPr>
+    </w:lvl>
+    <w:lvl w:ilvl="5" w:tplc="0409001B" w:tentative="1">
+      <w:start w:val="1"/>
+      <w:numFmt w:val="lowerRoman"/>
+      <w:lvlText w:val="%6."/>
+      <w:lvlJc w:val="right"/>
+      <w:pPr>
+        <w:ind w:left="5100" w:hanging="180"/>
+      </w:pPr>
+    </w:lvl>
+    <w:lvl w:ilvl="6" w:tplc="0409000F" w:tentative="1">
+      <w:start w:val="1"/>
+      <w:numFmt w:val="decimal"/>
+      <w:lvlText w:val="%7."/>
+      <w:lvlJc w:val="left"/>
+      <w:pPr>
+        <w:ind w:left="5820" w:hanging="360"/>
+      </w:pPr>
+    </w:lvl>
+    <w:lvl w:ilvl="7" w:tplc="04090019" w:tentative="1">
+      <w:start w:val="1"/>
+      <w:numFmt w:val="lowerLetter"/>
+      <w:lvlText w:val="%8."/>
+      <w:lvlJc w:val="left"/>
+      <w:pPr>
+        <w:ind w:left="6540" w:hanging="360"/>
+      </w:pPr>
+    </w:lvl>
+    <w:lvl w:ilvl="8" w:tplc="0409001B" w:tentative="1">
+      <w:start w:val="1"/>
+      <w:numFmt w:val="lowerRoman"/>
+      <w:lvlText w:val="%9."/>
+      <w:lvlJc w:val="right"/>
+      <w:pPr>
+        <w:ind w:left="7260" w:hanging="180"/>
       </w:pPr>
     </w:lvl>
   </w:abstractNum>
@@ -1683,6 +2395,12 @@
     <w:abstractNumId w:val="1"/>
   </w:num>
   <w:num w:numId="3">
+    <w:abstractNumId w:val="3"/>
+  </w:num>
+  <w:num w:numId="4">
+    <w:abstractNumId w:val="4"/>
+  </w:num>
+  <w:num w:numId="5">
     <w:abstractNumId w:val="2"/>
   </w:num>
 </w:numbering>

</xml_diff>

<commit_message>
hoan thanh hd ngan han chua can le bang
</commit_message>
<xml_diff>
--- a/src/main/resources/templates/BaoCaoDeNghiGiaiNganKiemGiayNhanNo.docx
+++ b/src/main/resources/templates/BaoCaoDeNghiGiaiNganKiemGiayNhanNo.docx
@@ -424,7 +424,14 @@
           <w:rFonts w:ascii="Times New Roman" w:hAnsi="Times New Roman"/>
           <w:sz w:val="28"/>
         </w:rPr>
-        <w:t>ng chú: {{ttkh}}</w:t>
+        <w:t>ng tr</w:t>
+      </w:r>
+      <w:r>
+        <w:rPr>
+          <w:rFonts w:ascii="Times New Roman" w:hAnsi="Times New Roman"/>
+          <w:sz w:val="28"/>
+        </w:rPr>
+        <w:t>ú: {{ttkh}}</w:t>
       </w:r>
     </w:p>
     <w:p>
@@ -563,7 +570,21 @@
           <w:rFonts w:ascii="Times New Roman" w:hAnsi="Times New Roman"/>
           <w:sz w:val="28"/>
         </w:rPr>
-        <w:t>Địa chỉ thường chú: {{ttnt}}.</w:t>
+        <w:t>Địa chỉ thườ</w:t>
+      </w:r>
+      <w:r>
+        <w:rPr>
+          <w:rFonts w:ascii="Times New Roman" w:hAnsi="Times New Roman"/>
+          <w:sz w:val="28"/>
+        </w:rPr>
+        <w:t>ng tr</w:t>
+      </w:r>
+      <w:r>
+        <w:rPr>
+          <w:rFonts w:ascii="Times New Roman" w:hAnsi="Times New Roman"/>
+          <w:sz w:val="28"/>
+        </w:rPr>
+        <w:t>ú: {{ttnt}}.</w:t>
       </w:r>
     </w:p>
     <w:p>
@@ -587,7 +608,21 @@
           <w:rFonts w:ascii="Times New Roman" w:hAnsi="Times New Roman"/>
           <w:sz w:val="28"/>
         </w:rPr>
-        <w:t>: {{shdtd}} ký ngày {{day}}/{{month}}/{{year}}.</w:t>
+        <w:t>: {{shdtd}}</w:t>
+      </w:r>
+      <w:r>
+        <w:rPr>
+          <w:rFonts w:ascii="Times New Roman" w:hAnsi="Times New Roman"/>
+          <w:sz w:val="28"/>
+        </w:rPr>
+        <w:t>/HĐTD</w:t>
+      </w:r>
+      <w:r>
+        <w:rPr>
+          <w:rFonts w:ascii="Times New Roman" w:hAnsi="Times New Roman"/>
+          <w:sz w:val="28"/>
+        </w:rPr>
+        <w:t xml:space="preserve"> ký ngày {{day}}/{{month}}/{{year}}.</w:t>
       </w:r>
     </w:p>
     <w:p>
@@ -839,6 +874,13 @@
           <w:rFonts w:ascii="Times New Roman" w:hAnsi="Times New Roman"/>
           <w:sz w:val="28"/>
         </w:rPr>
+        <w:t xml:space="preserve">   </w:t>
+      </w:r>
+      <w:r>
+        <w:rPr>
+          <w:rFonts w:ascii="Times New Roman" w:hAnsi="Times New Roman"/>
+          <w:sz w:val="28"/>
+        </w:rPr>
         <w:t>đồng</w:t>
       </w:r>
     </w:p>
@@ -880,7 +922,23 @@
           <w:rFonts w:ascii="Times New Roman" w:hAnsi="Times New Roman"/>
           <w:sz w:val="28"/>
         </w:rPr>
-        <w:t xml:space="preserve">    </w:t>
+        <w:t xml:space="preserve">   </w:t>
+      </w:r>
+      <w:r>
+        <w:rPr>
+          <w:rFonts w:ascii="Times New Roman" w:hAnsi="Times New Roman"/>
+          <w:sz w:val="28"/>
+        </w:rPr>
+        <w:t xml:space="preserve">   </w:t>
+      </w:r>
+      <w:bookmarkStart w:id="0" w:name="_GoBack"/>
+      <w:bookmarkEnd w:id="0"/>
+      <w:r>
+        <w:rPr>
+          <w:rFonts w:ascii="Times New Roman" w:hAnsi="Times New Roman"/>
+          <w:sz w:val="28"/>
+        </w:rPr>
+        <w:t xml:space="preserve"> </w:t>
       </w:r>
       <w:r>
         <w:rPr>
@@ -1139,6 +1197,7 @@
           <w:rFonts w:ascii="Times New Roman" w:hAnsi="Times New Roman"/>
           <w:sz w:val="28"/>
         </w:rPr>
+        <w:lastRenderedPageBreak/>
         <w:t>Thu nhậ</w:t>
       </w:r>
       <w:r>
@@ -1173,7 +1232,6 @@
           <w:rFonts w:ascii="Times New Roman" w:hAnsi="Times New Roman"/>
           <w:sz w:val="28"/>
         </w:rPr>
-        <w:lastRenderedPageBreak/>
         <w:t xml:space="preserve">Thu hồi vốn đầu tư phương án:                     {{thuHoiVon}}   </w:t>
       </w:r>
       <w:r>
@@ -1783,8 +1841,6 @@
         </w:rPr>
         <w:t xml:space="preserve">    </w:t>
       </w:r>
-      <w:bookmarkStart w:id="0" w:name="_GoBack"/>
-      <w:bookmarkEnd w:id="0"/>
       <w:r>
         <w:rPr>
           <w:rFonts w:ascii="Times New Roman" w:hAnsi="Times New Roman"/>

</xml_diff>

<commit_message>
hoan thien export file
</commit_message>
<xml_diff>
--- a/src/main/resources/templates/BaoCaoDeNghiGiaiNganKiemGiayNhanNo.docx
+++ b/src/main/resources/templates/BaoCaoDeNghiGiaiNganKiemGiayNhanNo.docx
@@ -470,8 +470,10 @@
           <w:rFonts w:ascii="Times New Roman" w:hAnsi="Times New Roman"/>
           <w:sz w:val="28"/>
         </w:rPr>
-        <w:t>Sinh năm</w:t>
-      </w:r>
+        <w:t>Sinh ngày</w:t>
+      </w:r>
+      <w:bookmarkStart w:id="0" w:name="_GoBack"/>
+      <w:bookmarkEnd w:id="0"/>
       <w:r>
         <w:rPr>
           <w:rFonts w:ascii="Times New Roman" w:hAnsi="Times New Roman"/>
@@ -931,8 +933,6 @@
         </w:rPr>
         <w:t xml:space="preserve">   </w:t>
       </w:r>
-      <w:bookmarkStart w:id="0" w:name="_GoBack"/>
-      <w:bookmarkEnd w:id="0"/>
       <w:r>
         <w:rPr>
           <w:rFonts w:ascii="Times New Roman" w:hAnsi="Times New Roman"/>

</xml_diff>

<commit_message>
hoan thanh HD Ngan Han TSC
</commit_message>
<xml_diff>
--- a/src/main/resources/templates/BaoCaoDeNghiGiaiNganKiemGiayNhanNo.docx
+++ b/src/main/resources/templates/BaoCaoDeNghiGiaiNganKiemGiayNhanNo.docx
@@ -317,6 +317,13 @@
           <w:rFonts w:ascii="Times New Roman" w:hAnsi="Times New Roman"/>
           <w:sz w:val="28"/>
         </w:rPr>
+        <w:t xml:space="preserve">     </w:t>
+      </w:r>
+      <w:r>
+        <w:rPr>
+          <w:rFonts w:ascii="Times New Roman" w:hAnsi="Times New Roman"/>
+          <w:sz w:val="28"/>
+        </w:rPr>
         <w:t>Số điện thoại: {{sdtkh}}.</w:t>
       </w:r>
     </w:p>
@@ -355,7 +362,28 @@
           <w:rFonts w:ascii="Times New Roman" w:hAnsi="Times New Roman"/>
           <w:sz w:val="28"/>
         </w:rPr>
-        <w:t xml:space="preserve">            </w:t>
+        <w:t xml:space="preserve">           </w:t>
+      </w:r>
+      <w:r>
+        <w:rPr>
+          <w:rFonts w:ascii="Times New Roman" w:hAnsi="Times New Roman"/>
+          <w:sz w:val="28"/>
+        </w:rPr>
+        <w:t xml:space="preserve"> </w:t>
+      </w:r>
+      <w:r>
+        <w:rPr>
+          <w:rFonts w:ascii="Times New Roman" w:hAnsi="Times New Roman"/>
+          <w:sz w:val="28"/>
+        </w:rPr>
+        <w:t xml:space="preserve"> </w:t>
+      </w:r>
+      <w:r>
+        <w:rPr>
+          <w:rFonts w:ascii="Times New Roman" w:hAnsi="Times New Roman"/>
+          <w:sz w:val="28"/>
+        </w:rPr>
+        <w:t xml:space="preserve">         </w:t>
       </w:r>
       <w:r>
         <w:rPr>
@@ -463,7 +491,7 @@
           <w:rFonts w:ascii="Times New Roman" w:hAnsi="Times New Roman"/>
           <w:sz w:val="28"/>
         </w:rPr>
-        <w:t xml:space="preserve">                           </w:t>
+        <w:t xml:space="preserve">                </w:t>
       </w:r>
       <w:r>
         <w:rPr>
@@ -472,8 +500,6 @@
         </w:rPr>
         <w:t>Sinh ngày</w:t>
       </w:r>
-      <w:bookmarkStart w:id="0" w:name="_GoBack"/>
-      <w:bookmarkEnd w:id="0"/>
       <w:r>
         <w:rPr>
           <w:rFonts w:ascii="Times New Roman" w:hAnsi="Times New Roman"/>
@@ -517,7 +543,7 @@
           <w:rFonts w:ascii="Times New Roman" w:hAnsi="Times New Roman"/>
           <w:sz w:val="28"/>
         </w:rPr>
-        <w:t xml:space="preserve">                          </w:t>
+        <w:t xml:space="preserve">                      </w:t>
       </w:r>
       <w:r>
         <w:rPr>
@@ -835,6 +861,13 @@
           <w:rFonts w:ascii="Times New Roman" w:hAnsi="Times New Roman"/>
           <w:sz w:val="28"/>
         </w:rPr>
+        <w:t xml:space="preserve">   </w:t>
+      </w:r>
+      <w:r>
+        <w:rPr>
+          <w:rFonts w:ascii="Times New Roman" w:hAnsi="Times New Roman"/>
+          <w:sz w:val="28"/>
+        </w:rPr>
         <w:t>đồng</w:t>
       </w:r>
     </w:p>
@@ -903,6 +936,40 @@
           <w:rFonts w:ascii="Times New Roman" w:hAnsi="Times New Roman"/>
           <w:sz w:val="28"/>
         </w:rPr>
+        <w:t xml:space="preserve">Vốn khác:                         </w:t>
+      </w:r>
+      <w:r>
+        <w:rPr>
+          <w:rFonts w:ascii="Times New Roman" w:hAnsi="Times New Roman"/>
+          <w:sz w:val="28"/>
+        </w:rPr>
+        <w:t xml:space="preserve">  </w:t>
+      </w:r>
+      <w:r>
+        <w:rPr>
+          <w:rFonts w:ascii="Times New Roman" w:hAnsi="Times New Roman"/>
+          <w:sz w:val="28"/>
+        </w:rPr>
+        <w:t>{{vonKhac}}                             đồng</w:t>
+      </w:r>
+    </w:p>
+    <w:p>
+      <w:pPr>
+        <w:pStyle w:val="ListParagraph"/>
+        <w:numPr>
+          <w:ilvl w:val="0"/>
+          <w:numId w:val="5"/>
+        </w:numPr>
+        <w:rPr>
+          <w:rFonts w:ascii="Times New Roman" w:hAnsi="Times New Roman"/>
+          <w:sz w:val="28"/>
+        </w:rPr>
+      </w:pPr>
+      <w:r>
+        <w:rPr>
+          <w:rFonts w:ascii="Times New Roman" w:hAnsi="Times New Roman"/>
+          <w:sz w:val="28"/>
+        </w:rPr>
         <w:t xml:space="preserve">Vốn xin vay của Quỹ:      {{tienso}}                </w:t>
       </w:r>
       <w:r>
@@ -1088,7 +1155,21 @@
           <w:rFonts w:ascii="Times New Roman" w:hAnsi="Times New Roman"/>
           <w:sz w:val="28"/>
         </w:rPr>
-        <w:t>ch thu – chi         {{loiNhuan}}</w:t>
+        <w:t xml:space="preserve">ch thu – chi         </w:t>
+      </w:r>
+      <w:r>
+        <w:rPr>
+          <w:rFonts w:ascii="Times New Roman" w:hAnsi="Times New Roman"/>
+          <w:sz w:val="28"/>
+        </w:rPr>
+        <w:t xml:space="preserve">  </w:t>
+      </w:r>
+      <w:r>
+        <w:rPr>
+          <w:rFonts w:ascii="Times New Roman" w:hAnsi="Times New Roman"/>
+          <w:sz w:val="28"/>
+        </w:rPr>
+        <w:t>{{loiNhuan}}</w:t>
       </w:r>
       <w:r>
         <w:rPr>
@@ -1116,7 +1197,7 @@
           <w:rFonts w:ascii="Times New Roman" w:hAnsi="Times New Roman"/>
           <w:sz w:val="28"/>
         </w:rPr>
-        <w:t xml:space="preserve">     </w:t>
+        <w:t xml:space="preserve">  </w:t>
       </w:r>
       <w:r>
         <w:rPr>
@@ -1163,6 +1244,7 @@
           <w:rFonts w:ascii="Times New Roman" w:hAnsi="Times New Roman"/>
           <w:sz w:val="28"/>
         </w:rPr>
+        <w:lastRenderedPageBreak/>
         <w:t xml:space="preserve">Từ thu nhập hoạt động của phương án:         </w:t>
       </w:r>
       <w:r>
@@ -1197,7 +1279,6 @@
           <w:rFonts w:ascii="Times New Roman" w:hAnsi="Times New Roman"/>
           <w:sz w:val="28"/>
         </w:rPr>
-        <w:lastRenderedPageBreak/>
         <w:t>Thu nhậ</w:t>
       </w:r>
       <w:r>
@@ -1390,7 +1471,23 @@
           <w:rFonts w:ascii="Times New Roman" w:hAnsi="Times New Roman"/>
           <w:sz w:val="28"/>
         </w:rPr>
-        <w:t>Hợp đồng cho vay số: {{shdtd}} ký ngày {{day}}/{{month}}/{{year}}.</w:t>
+        <w:t>Hợp đồng cho vay số: {{shdtd}}</w:t>
+      </w:r>
+      <w:r>
+        <w:rPr>
+          <w:rFonts w:ascii="Times New Roman" w:hAnsi="Times New Roman"/>
+          <w:sz w:val="28"/>
+        </w:rPr>
+        <w:t>/HĐTD</w:t>
+      </w:r>
+      <w:bookmarkStart w:id="0" w:name="_GoBack"/>
+      <w:bookmarkEnd w:id="0"/>
+      <w:r>
+        <w:rPr>
+          <w:rFonts w:ascii="Times New Roman" w:hAnsi="Times New Roman"/>
+          <w:sz w:val="28"/>
+        </w:rPr>
+        <w:t xml:space="preserve"> ký ngày {{day}}/{{month}}/{{year}}.</w:t>
       </w:r>
     </w:p>
     <w:p>
@@ -1622,14 +1719,14 @@
           <w:rFonts w:ascii="Times New Roman" w:hAnsi="Times New Roman"/>
           <w:sz w:val="28"/>
         </w:rPr>
-        <w:t>Phương thức giải ngân: Chuyển khoả</w:t>
-      </w:r>
-      <w:r>
-        <w:rPr>
-          <w:rFonts w:ascii="Times New Roman" w:hAnsi="Times New Roman"/>
-          <w:sz w:val="28"/>
-        </w:rPr>
-        <w:t>n:</w:t>
+        <w:t>Phương thức giả</w:t>
+      </w:r>
+      <w:r>
+        <w:rPr>
+          <w:rFonts w:ascii="Times New Roman" w:hAnsi="Times New Roman"/>
+          <w:sz w:val="28"/>
+        </w:rPr>
+        <w:t>i ngân: {{nguoiChuyenKhoan}}</w:t>
       </w:r>
     </w:p>
     <w:p>

</xml_diff>

<commit_message>
hoan thien vay lai han muc
</commit_message>
<xml_diff>
--- a/src/main/resources/templates/BaoCaoDeNghiGiaiNganKiemGiayNhanNo.docx
+++ b/src/main/resources/templates/BaoCaoDeNghiGiaiNganKiemGiayNhanNo.docx
@@ -8,14 +8,16 @@
         <w:rPr>
           <w:rFonts w:ascii="Times New Roman" w:hAnsi="Times New Roman"/>
           <w:b/>
-          <w:sz w:val="28"/>
+          <w:sz w:val="26"/>
+          <w:szCs w:val="26"/>
         </w:rPr>
       </w:pPr>
       <w:r>
         <w:rPr>
           <w:rFonts w:ascii="Times New Roman" w:hAnsi="Times New Roman"/>
           <w:b/>
-          <w:sz w:val="28"/>
+          <w:sz w:val="26"/>
+          <w:szCs w:val="26"/>
         </w:rPr>
         <w:t>CỘNG HÒA XÃ HỘI CHỦ NGHĨA VIỆT NAM</w:t>
       </w:r>
@@ -26,7 +28,8 @@
         <w:rPr>
           <w:rFonts w:ascii="Times New Roman" w:hAnsi="Times New Roman"/>
           <w:b/>
-          <w:sz w:val="28"/>
+          <w:sz w:val="26"/>
+          <w:szCs w:val="26"/>
         </w:rPr>
       </w:pPr>
       <w:r>
@@ -34,7 +37,8 @@
           <w:rFonts w:ascii="Times New Roman" w:hAnsi="Times New Roman"/>
           <w:b/>
           <w:noProof/>
-          <w:sz w:val="28"/>
+          <w:sz w:val="26"/>
+          <w:szCs w:val="26"/>
         </w:rPr>
         <mc:AlternateContent>
           <mc:Choice Requires="wps">
@@ -113,7 +117,8 @@
         <w:rPr>
           <w:rFonts w:ascii="Times New Roman" w:hAnsi="Times New Roman"/>
           <w:b/>
-          <w:sz w:val="28"/>
+          <w:sz w:val="26"/>
+          <w:szCs w:val="26"/>
         </w:rPr>
         <w:t>Độc lập – Tự do – Hạnh phúc</w:t>
       </w:r>
@@ -124,14 +129,16 @@
         <w:rPr>
           <w:rFonts w:ascii="Times New Roman" w:hAnsi="Times New Roman"/>
           <w:i/>
-          <w:sz w:val="28"/>
-        </w:rPr>
-      </w:pPr>
-      <w:r>
-        <w:rPr>
-          <w:rFonts w:ascii="Times New Roman" w:hAnsi="Times New Roman"/>
-          <w:i/>
-          <w:sz w:val="28"/>
+          <w:sz w:val="26"/>
+          <w:szCs w:val="26"/>
+        </w:rPr>
+      </w:pPr>
+      <w:r>
+        <w:rPr>
+          <w:rFonts w:ascii="Times New Roman" w:hAnsi="Times New Roman"/>
+          <w:i/>
+          <w:sz w:val="26"/>
+          <w:szCs w:val="26"/>
         </w:rPr>
         <w:t>{{phuong}}</w:t>
       </w:r>
@@ -139,7 +146,8 @@
         <w:rPr>
           <w:rFonts w:ascii="Times New Roman" w:hAnsi="Times New Roman"/>
           <w:i/>
-          <w:sz w:val="28"/>
+          <w:sz w:val="26"/>
+          <w:szCs w:val="26"/>
         </w:rPr>
         <w:t>, ngày…. t</w:t>
       </w:r>
@@ -147,7 +155,8 @@
         <w:rPr>
           <w:rFonts w:ascii="Times New Roman" w:hAnsi="Times New Roman"/>
           <w:i/>
-          <w:sz w:val="28"/>
+          <w:sz w:val="26"/>
+          <w:szCs w:val="26"/>
         </w:rPr>
         <w:t>háng….</w:t>
       </w:r>
@@ -155,7 +164,8 @@
         <w:rPr>
           <w:rFonts w:ascii="Times New Roman" w:hAnsi="Times New Roman"/>
           <w:i/>
-          <w:sz w:val="28"/>
+          <w:sz w:val="26"/>
+          <w:szCs w:val="26"/>
         </w:rPr>
         <w:t xml:space="preserve"> năm 2026</w:t>
       </w:r>
@@ -166,14 +176,16 @@
         <w:rPr>
           <w:rFonts w:ascii="Times New Roman" w:hAnsi="Times New Roman"/>
           <w:b/>
-          <w:sz w:val="28"/>
+          <w:sz w:val="26"/>
+          <w:szCs w:val="26"/>
         </w:rPr>
       </w:pPr>
       <w:r>
         <w:rPr>
           <w:rFonts w:ascii="Times New Roman" w:hAnsi="Times New Roman"/>
           <w:b/>
-          <w:sz w:val="28"/>
+          <w:sz w:val="26"/>
+          <w:szCs w:val="26"/>
         </w:rPr>
         <w:t>BÁO CÁO ĐỀ NGHỊ GIẢI NGÂN KIÊM GIẤY NHẬN NỢ</w:t>
       </w:r>
@@ -183,20 +195,23 @@
         <w:jc w:val="center"/>
         <w:rPr>
           <w:rFonts w:ascii="Times New Roman" w:hAnsi="Times New Roman"/>
-          <w:sz w:val="28"/>
-        </w:rPr>
-      </w:pPr>
-      <w:r>
-        <w:rPr>
-          <w:rFonts w:ascii="Times New Roman" w:hAnsi="Times New Roman"/>
-          <w:sz w:val="28"/>
+          <w:sz w:val="26"/>
+          <w:szCs w:val="26"/>
+        </w:rPr>
+      </w:pPr>
+      <w:r>
+        <w:rPr>
+          <w:rFonts w:ascii="Times New Roman" w:hAnsi="Times New Roman"/>
+          <w:sz w:val="26"/>
+          <w:szCs w:val="26"/>
         </w:rPr>
         <w:t xml:space="preserve">Số giải ngân: </w:t>
       </w:r>
       <w:r>
         <w:rPr>
           <w:rFonts w:ascii="Times New Roman" w:hAnsi="Times New Roman"/>
-          <w:sz w:val="28"/>
+          <w:sz w:val="26"/>
+          <w:szCs w:val="26"/>
         </w:rPr>
         <w:t>{{shdtd}}</w:t>
       </w:r>
@@ -211,14 +226,16 @@
         <w:rPr>
           <w:rFonts w:ascii="Times New Roman" w:hAnsi="Times New Roman"/>
           <w:b/>
-          <w:sz w:val="28"/>
+          <w:sz w:val="26"/>
+          <w:szCs w:val="26"/>
         </w:rPr>
       </w:pPr>
       <w:r>
         <w:rPr>
           <w:rFonts w:ascii="Times New Roman" w:hAnsi="Times New Roman"/>
           <w:b/>
-          <w:sz w:val="28"/>
+          <w:sz w:val="26"/>
+          <w:szCs w:val="26"/>
         </w:rPr>
         <w:t>ĐỀ NGHỊ GIẢI NGÂN</w:t>
       </w:r>
@@ -232,13 +249,15 @@
         </w:numPr>
         <w:rPr>
           <w:rFonts w:ascii="Times New Roman" w:hAnsi="Times New Roman"/>
-          <w:sz w:val="28"/>
-        </w:rPr>
-      </w:pPr>
-      <w:r>
-        <w:rPr>
-          <w:rFonts w:ascii="Times New Roman" w:hAnsi="Times New Roman"/>
-          <w:sz w:val="28"/>
+          <w:sz w:val="26"/>
+          <w:szCs w:val="26"/>
+        </w:rPr>
+      </w:pPr>
+      <w:r>
+        <w:rPr>
+          <w:rFonts w:ascii="Times New Roman" w:hAnsi="Times New Roman"/>
+          <w:sz w:val="26"/>
+          <w:szCs w:val="26"/>
         </w:rPr>
         <w:t>Thông tin về tín dụng:</w:t>
       </w:r>
@@ -249,20 +268,23 @@
         <w:ind w:left="1140"/>
         <w:rPr>
           <w:rFonts w:ascii="Times New Roman" w:hAnsi="Times New Roman"/>
-          <w:sz w:val="28"/>
-        </w:rPr>
-      </w:pPr>
-      <w:r>
-        <w:rPr>
-          <w:rFonts w:ascii="Times New Roman" w:hAnsi="Times New Roman"/>
-          <w:sz w:val="28"/>
+          <w:sz w:val="26"/>
+          <w:szCs w:val="26"/>
+        </w:rPr>
+      </w:pPr>
+      <w:r>
+        <w:rPr>
+          <w:rFonts w:ascii="Times New Roman" w:hAnsi="Times New Roman"/>
+          <w:sz w:val="26"/>
+          <w:szCs w:val="26"/>
         </w:rPr>
         <w:t>Họ và tên người nhận nợ</w:t>
       </w:r>
       <w:r>
         <w:rPr>
           <w:rFonts w:ascii="Times New Roman" w:hAnsi="Times New Roman"/>
-          <w:sz w:val="28"/>
+          <w:sz w:val="26"/>
+          <w:szCs w:val="26"/>
         </w:rPr>
         <w:t xml:space="preserve">: </w:t>
       </w:r>
@@ -270,14 +292,16 @@
         <w:rPr>
           <w:rFonts w:ascii="Times New Roman" w:hAnsi="Times New Roman"/>
           <w:b/>
-          <w:sz w:val="28"/>
+          <w:sz w:val="26"/>
+          <w:szCs w:val="26"/>
         </w:rPr>
         <w:t>{{kh}}</w:t>
       </w:r>
       <w:r>
         <w:rPr>
           <w:rFonts w:ascii="Times New Roman" w:hAnsi="Times New Roman"/>
-          <w:sz w:val="28"/>
+          <w:sz w:val="26"/>
+          <w:szCs w:val="26"/>
         </w:rPr>
         <w:t>.</w:t>
       </w:r>
@@ -288,41 +312,47 @@
         <w:ind w:left="1140"/>
         <w:rPr>
           <w:rFonts w:ascii="Times New Roman" w:hAnsi="Times New Roman"/>
-          <w:sz w:val="28"/>
-        </w:rPr>
-      </w:pPr>
-      <w:r>
-        <w:rPr>
-          <w:rFonts w:ascii="Times New Roman" w:hAnsi="Times New Roman"/>
-          <w:sz w:val="28"/>
+          <w:sz w:val="26"/>
+          <w:szCs w:val="26"/>
+        </w:rPr>
+      </w:pPr>
+      <w:r>
+        <w:rPr>
+          <w:rFonts w:ascii="Times New Roman" w:hAnsi="Times New Roman"/>
+          <w:sz w:val="26"/>
+          <w:szCs w:val="26"/>
         </w:rPr>
         <w:t>Số thẻ thành</w:t>
       </w:r>
       <w:r>
         <w:rPr>
           <w:rFonts w:ascii="Times New Roman" w:hAnsi="Times New Roman"/>
-          <w:sz w:val="28"/>
+          <w:sz w:val="26"/>
+          <w:szCs w:val="26"/>
         </w:rPr>
         <w:t xml:space="preserve"> viên: {{sttv}}</w:t>
       </w:r>
       <w:r>
         <w:rPr>
           <w:rFonts w:ascii="Times New Roman" w:hAnsi="Times New Roman"/>
-          <w:sz w:val="28"/>
+          <w:sz w:val="26"/>
+          <w:szCs w:val="26"/>
         </w:rPr>
         <w:t xml:space="preserve">                    </w:t>
       </w:r>
       <w:r>
         <w:rPr>
           <w:rFonts w:ascii="Times New Roman" w:hAnsi="Times New Roman"/>
-          <w:sz w:val="28"/>
+          <w:sz w:val="26"/>
+          <w:szCs w:val="26"/>
         </w:rPr>
         <w:t xml:space="preserve">     </w:t>
       </w:r>
       <w:r>
         <w:rPr>
           <w:rFonts w:ascii="Times New Roman" w:hAnsi="Times New Roman"/>
-          <w:sz w:val="28"/>
+          <w:sz w:val="26"/>
+          <w:szCs w:val="26"/>
         </w:rPr>
         <w:t>Số điện thoại: {{sdtkh}}.</w:t>
       </w:r>
@@ -333,83 +363,95 @@
         <w:ind w:left="1140"/>
         <w:rPr>
           <w:rFonts w:ascii="Times New Roman" w:hAnsi="Times New Roman"/>
-          <w:sz w:val="28"/>
-        </w:rPr>
-      </w:pPr>
-      <w:r>
-        <w:rPr>
-          <w:rFonts w:ascii="Times New Roman" w:hAnsi="Times New Roman"/>
-          <w:sz w:val="28"/>
+          <w:sz w:val="26"/>
+          <w:szCs w:val="26"/>
+        </w:rPr>
+      </w:pPr>
+      <w:r>
+        <w:rPr>
+          <w:rFonts w:ascii="Times New Roman" w:hAnsi="Times New Roman"/>
+          <w:sz w:val="26"/>
+          <w:szCs w:val="26"/>
         </w:rPr>
         <w:t>Số</w:t>
       </w:r>
       <w:r>
         <w:rPr>
           <w:rFonts w:ascii="Times New Roman" w:hAnsi="Times New Roman"/>
-          <w:sz w:val="28"/>
+          <w:sz w:val="26"/>
+          <w:szCs w:val="26"/>
         </w:rPr>
         <w:t xml:space="preserve"> CC/C</w:t>
       </w:r>
       <w:r>
         <w:rPr>
           <w:rFonts w:ascii="Times New Roman" w:hAnsi="Times New Roman"/>
-          <w:sz w:val="28"/>
+          <w:sz w:val="26"/>
+          <w:szCs w:val="26"/>
         </w:rPr>
         <w:t>CCD: {{cccdkh}}</w:t>
       </w:r>
       <w:r>
         <w:rPr>
           <w:rFonts w:ascii="Times New Roman" w:hAnsi="Times New Roman"/>
-          <w:sz w:val="28"/>
+          <w:sz w:val="26"/>
+          <w:szCs w:val="26"/>
         </w:rPr>
         <w:t xml:space="preserve">           </w:t>
       </w:r>
       <w:r>
         <w:rPr>
           <w:rFonts w:ascii="Times New Roman" w:hAnsi="Times New Roman"/>
-          <w:sz w:val="28"/>
+          <w:sz w:val="26"/>
+          <w:szCs w:val="26"/>
         </w:rPr>
         <w:t xml:space="preserve"> </w:t>
       </w:r>
       <w:r>
         <w:rPr>
           <w:rFonts w:ascii="Times New Roman" w:hAnsi="Times New Roman"/>
-          <w:sz w:val="28"/>
+          <w:sz w:val="26"/>
+          <w:szCs w:val="26"/>
         </w:rPr>
         <w:t xml:space="preserve"> </w:t>
       </w:r>
       <w:r>
         <w:rPr>
           <w:rFonts w:ascii="Times New Roman" w:hAnsi="Times New Roman"/>
-          <w:sz w:val="28"/>
+          <w:sz w:val="26"/>
+          <w:szCs w:val="26"/>
         </w:rPr>
         <w:t xml:space="preserve">         </w:t>
       </w:r>
       <w:r>
         <w:rPr>
           <w:rFonts w:ascii="Times New Roman" w:hAnsi="Times New Roman"/>
-          <w:sz w:val="28"/>
+          <w:sz w:val="26"/>
+          <w:szCs w:val="26"/>
         </w:rPr>
         <w:t>Ngày cấ</w:t>
       </w:r>
       <w:r>
         <w:rPr>
           <w:rFonts w:ascii="Times New Roman" w:hAnsi="Times New Roman"/>
-          <w:sz w:val="28"/>
+          <w:sz w:val="26"/>
+          <w:szCs w:val="26"/>
         </w:rPr>
         <w:t>p: {{nckh}}</w:t>
       </w:r>
       <w:r>
         <w:rPr>
           <w:rFonts w:ascii="Times New Roman" w:hAnsi="Times New Roman"/>
-          <w:sz w:val="28"/>
+          <w:sz w:val="26"/>
+          <w:szCs w:val="26"/>
         </w:rPr>
         <w:t>.</w:t>
       </w:r>
       <w:r>
         <w:rPr>
           <w:rFonts w:ascii="Times New Roman" w:hAnsi="Times New Roman"/>
-          <w:sz w:val="28"/>
+          <w:sz w:val="26"/>
+          <w:szCs w:val="26"/>
         </w:rPr>
         <w:tab/>
       </w:r>
@@ -420,13 +462,15 @@
         <w:ind w:left="1140"/>
         <w:rPr>
           <w:rFonts w:ascii="Times New Roman" w:hAnsi="Times New Roman"/>
-          <w:sz w:val="28"/>
-        </w:rPr>
-      </w:pPr>
-      <w:r>
-        <w:rPr>
-          <w:rFonts w:ascii="Times New Roman" w:hAnsi="Times New Roman"/>
-          <w:sz w:val="28"/>
+          <w:sz w:val="26"/>
+          <w:szCs w:val="26"/>
+        </w:rPr>
+      </w:pPr>
+      <w:r>
+        <w:rPr>
+          <w:rFonts w:ascii="Times New Roman" w:hAnsi="Times New Roman"/>
+          <w:sz w:val="26"/>
+          <w:szCs w:val="26"/>
         </w:rPr>
         <w:t>Nơi cấp: {{nccccdkh}}.</w:t>
       </w:r>
@@ -437,27 +481,31 @@
         <w:ind w:left="1140"/>
         <w:rPr>
           <w:rFonts w:ascii="Times New Roman" w:hAnsi="Times New Roman"/>
-          <w:sz w:val="28"/>
-        </w:rPr>
-      </w:pPr>
-      <w:r>
-        <w:rPr>
-          <w:rFonts w:ascii="Times New Roman" w:hAnsi="Times New Roman"/>
-          <w:sz w:val="28"/>
+          <w:sz w:val="26"/>
+          <w:szCs w:val="26"/>
+        </w:rPr>
+      </w:pPr>
+      <w:r>
+        <w:rPr>
+          <w:rFonts w:ascii="Times New Roman" w:hAnsi="Times New Roman"/>
+          <w:sz w:val="26"/>
+          <w:szCs w:val="26"/>
         </w:rPr>
         <w:t>Địa chỉ thườ</w:t>
       </w:r>
       <w:r>
         <w:rPr>
           <w:rFonts w:ascii="Times New Roman" w:hAnsi="Times New Roman"/>
-          <w:sz w:val="28"/>
+          <w:sz w:val="26"/>
+          <w:szCs w:val="26"/>
         </w:rPr>
         <w:t>ng tr</w:t>
       </w:r>
       <w:r>
         <w:rPr>
           <w:rFonts w:ascii="Times New Roman" w:hAnsi="Times New Roman"/>
-          <w:sz w:val="28"/>
+          <w:sz w:val="26"/>
+          <w:szCs w:val="26"/>
         </w:rPr>
         <w:t>ú: {{ttkh}}</w:t>
       </w:r>
@@ -468,13 +516,15 @@
         <w:ind w:left="1140"/>
         <w:rPr>
           <w:rFonts w:ascii="Times New Roman" w:hAnsi="Times New Roman"/>
-          <w:sz w:val="28"/>
-        </w:rPr>
-      </w:pPr>
-      <w:r>
-        <w:rPr>
-          <w:rFonts w:ascii="Times New Roman" w:hAnsi="Times New Roman"/>
-          <w:sz w:val="28"/>
+          <w:sz w:val="26"/>
+          <w:szCs w:val="26"/>
+        </w:rPr>
+      </w:pPr>
+      <w:r>
+        <w:rPr>
+          <w:rFonts w:ascii="Times New Roman" w:hAnsi="Times New Roman"/>
+          <w:sz w:val="26"/>
+          <w:szCs w:val="26"/>
         </w:rPr>
         <w:t xml:space="preserve">Và ông/bà: </w:t>
       </w:r>
@@ -482,35 +532,48 @@
         <w:rPr>
           <w:rFonts w:ascii="Times New Roman" w:hAnsi="Times New Roman"/>
           <w:b/>
-          <w:sz w:val="28"/>
+          <w:sz w:val="26"/>
+          <w:szCs w:val="26"/>
         </w:rPr>
         <w:t>{{ntkh}}</w:t>
       </w:r>
       <w:r>
         <w:rPr>
           <w:rFonts w:ascii="Times New Roman" w:hAnsi="Times New Roman"/>
-          <w:sz w:val="28"/>
-        </w:rPr>
-        <w:t xml:space="preserve">                </w:t>
-      </w:r>
-      <w:r>
-        <w:rPr>
-          <w:rFonts w:ascii="Times New Roman" w:hAnsi="Times New Roman"/>
-          <w:sz w:val="28"/>
+          <w:sz w:val="26"/>
+          <w:szCs w:val="26"/>
+        </w:rPr>
+        <w:t xml:space="preserve">           </w:t>
+      </w:r>
+      <w:r>
+        <w:rPr>
+          <w:rFonts w:ascii="Times New Roman" w:hAnsi="Times New Roman"/>
+          <w:sz w:val="26"/>
+          <w:szCs w:val="26"/>
+        </w:rPr>
+        <w:t xml:space="preserve">             </w:t>
+      </w:r>
+      <w:r>
+        <w:rPr>
+          <w:rFonts w:ascii="Times New Roman" w:hAnsi="Times New Roman"/>
+          <w:sz w:val="26"/>
+          <w:szCs w:val="26"/>
         </w:rPr>
         <w:t>Sinh ngày</w:t>
       </w:r>
       <w:r>
         <w:rPr>
           <w:rFonts w:ascii="Times New Roman" w:hAnsi="Times New Roman"/>
-          <w:sz w:val="28"/>
+          <w:sz w:val="26"/>
+          <w:szCs w:val="26"/>
         </w:rPr>
         <w:t>: {{nsnt}}</w:t>
       </w:r>
       <w:r>
         <w:rPr>
           <w:rFonts w:ascii="Times New Roman" w:hAnsi="Times New Roman"/>
-          <w:sz w:val="28"/>
+          <w:sz w:val="26"/>
+          <w:szCs w:val="26"/>
         </w:rPr>
         <w:t>.</w:t>
       </w:r>
@@ -521,48 +584,55 @@
         <w:ind w:left="1140"/>
         <w:rPr>
           <w:rFonts w:ascii="Times New Roman" w:hAnsi="Times New Roman"/>
-          <w:sz w:val="28"/>
-        </w:rPr>
-      </w:pPr>
-      <w:r>
-        <w:rPr>
-          <w:rFonts w:ascii="Times New Roman" w:hAnsi="Times New Roman"/>
-          <w:sz w:val="28"/>
+          <w:sz w:val="26"/>
+          <w:szCs w:val="26"/>
+        </w:rPr>
+      </w:pPr>
+      <w:r>
+        <w:rPr>
+          <w:rFonts w:ascii="Times New Roman" w:hAnsi="Times New Roman"/>
+          <w:sz w:val="26"/>
+          <w:szCs w:val="26"/>
         </w:rPr>
         <w:t>Số</w:t>
       </w:r>
       <w:r>
         <w:rPr>
           <w:rFonts w:ascii="Times New Roman" w:hAnsi="Times New Roman"/>
-          <w:sz w:val="28"/>
+          <w:sz w:val="26"/>
+          <w:szCs w:val="26"/>
         </w:rPr>
         <w:t xml:space="preserve"> CC/CCCD: {{cccdnt}}</w:t>
       </w:r>
       <w:r>
         <w:rPr>
           <w:rFonts w:ascii="Times New Roman" w:hAnsi="Times New Roman"/>
-          <w:sz w:val="28"/>
+          <w:sz w:val="26"/>
+          <w:szCs w:val="26"/>
         </w:rPr>
         <w:t xml:space="preserve">                      </w:t>
       </w:r>
       <w:r>
         <w:rPr>
           <w:rFonts w:ascii="Times New Roman" w:hAnsi="Times New Roman"/>
-          <w:sz w:val="28"/>
+          <w:sz w:val="26"/>
+          <w:szCs w:val="26"/>
         </w:rPr>
         <w:t>Ngày cấ</w:t>
       </w:r>
       <w:r>
         <w:rPr>
           <w:rFonts w:ascii="Times New Roman" w:hAnsi="Times New Roman"/>
-          <w:sz w:val="28"/>
+          <w:sz w:val="26"/>
+          <w:szCs w:val="26"/>
         </w:rPr>
         <w:t>p: {{ncnt}}</w:t>
       </w:r>
       <w:r>
         <w:rPr>
           <w:rFonts w:ascii="Times New Roman" w:hAnsi="Times New Roman"/>
-          <w:sz w:val="28"/>
+          <w:sz w:val="26"/>
+          <w:szCs w:val="26"/>
         </w:rPr>
         <w:t>.</w:t>
       </w:r>
@@ -573,13 +643,15 @@
         <w:ind w:left="1140"/>
         <w:rPr>
           <w:rFonts w:ascii="Times New Roman" w:hAnsi="Times New Roman"/>
-          <w:sz w:val="28"/>
-        </w:rPr>
-      </w:pPr>
-      <w:r>
-        <w:rPr>
-          <w:rFonts w:ascii="Times New Roman" w:hAnsi="Times New Roman"/>
-          <w:sz w:val="28"/>
+          <w:sz w:val="26"/>
+          <w:szCs w:val="26"/>
+        </w:rPr>
+      </w:pPr>
+      <w:r>
+        <w:rPr>
+          <w:rFonts w:ascii="Times New Roman" w:hAnsi="Times New Roman"/>
+          <w:sz w:val="26"/>
+          <w:szCs w:val="26"/>
         </w:rPr>
         <w:t>Nơi cấp: {{nccccdnt}}.</w:t>
       </w:r>
@@ -590,27 +662,31 @@
         <w:ind w:left="1140"/>
         <w:rPr>
           <w:rFonts w:ascii="Times New Roman" w:hAnsi="Times New Roman"/>
-          <w:sz w:val="28"/>
-        </w:rPr>
-      </w:pPr>
-      <w:r>
-        <w:rPr>
-          <w:rFonts w:ascii="Times New Roman" w:hAnsi="Times New Roman"/>
-          <w:sz w:val="28"/>
+          <w:sz w:val="26"/>
+          <w:szCs w:val="26"/>
+        </w:rPr>
+      </w:pPr>
+      <w:r>
+        <w:rPr>
+          <w:rFonts w:ascii="Times New Roman" w:hAnsi="Times New Roman"/>
+          <w:sz w:val="26"/>
+          <w:szCs w:val="26"/>
         </w:rPr>
         <w:t>Địa chỉ thườ</w:t>
       </w:r>
       <w:r>
         <w:rPr>
           <w:rFonts w:ascii="Times New Roman" w:hAnsi="Times New Roman"/>
-          <w:sz w:val="28"/>
+          <w:sz w:val="26"/>
+          <w:szCs w:val="26"/>
         </w:rPr>
         <w:t>ng tr</w:t>
       </w:r>
       <w:r>
         <w:rPr>
           <w:rFonts w:ascii="Times New Roman" w:hAnsi="Times New Roman"/>
-          <w:sz w:val="28"/>
+          <w:sz w:val="26"/>
+          <w:szCs w:val="26"/>
         </w:rPr>
         <w:t>ú: {{ttnt}}.</w:t>
       </w:r>
@@ -621,34 +697,55 @@
         <w:ind w:left="1140"/>
         <w:rPr>
           <w:rFonts w:ascii="Times New Roman" w:hAnsi="Times New Roman"/>
-          <w:sz w:val="28"/>
-        </w:rPr>
-      </w:pPr>
-      <w:r>
-        <w:rPr>
-          <w:rFonts w:ascii="Times New Roman" w:hAnsi="Times New Roman"/>
-          <w:sz w:val="28"/>
-        </w:rPr>
-        <w:t>Hợp đồng cho vay số</w:t>
-      </w:r>
-      <w:r>
-        <w:rPr>
-          <w:rFonts w:ascii="Times New Roman" w:hAnsi="Times New Roman"/>
-          <w:sz w:val="28"/>
+          <w:sz w:val="26"/>
+          <w:szCs w:val="26"/>
+        </w:rPr>
+      </w:pPr>
+      <w:r>
+        <w:rPr>
+          <w:rFonts w:ascii="Times New Roman" w:hAnsi="Times New Roman"/>
+          <w:sz w:val="26"/>
+          <w:szCs w:val="26"/>
+        </w:rPr>
+        <w:t>Hợp đồ</w:t>
+      </w:r>
+      <w:r>
+        <w:rPr>
+          <w:rFonts w:ascii="Times New Roman" w:hAnsi="Times New Roman"/>
+          <w:sz w:val="26"/>
+          <w:szCs w:val="26"/>
+        </w:rPr>
+        <w:t>ng tín dụng</w:t>
+      </w:r>
+      <w:r>
+        <w:rPr>
+          <w:rFonts w:ascii="Times New Roman" w:hAnsi="Times New Roman"/>
+          <w:sz w:val="26"/>
+          <w:szCs w:val="26"/>
+        </w:rPr>
+        <w:t xml:space="preserve"> số</w:t>
+      </w:r>
+      <w:r>
+        <w:rPr>
+          <w:rFonts w:ascii="Times New Roman" w:hAnsi="Times New Roman"/>
+          <w:sz w:val="26"/>
+          <w:szCs w:val="26"/>
         </w:rPr>
         <w:t>: {{shdtd}}</w:t>
       </w:r>
       <w:r>
         <w:rPr>
           <w:rFonts w:ascii="Times New Roman" w:hAnsi="Times New Roman"/>
-          <w:sz w:val="28"/>
+          <w:sz w:val="26"/>
+          <w:szCs w:val="26"/>
         </w:rPr>
         <w:t>/HĐTD</w:t>
       </w:r>
       <w:r>
         <w:rPr>
           <w:rFonts w:ascii="Times New Roman" w:hAnsi="Times New Roman"/>
-          <w:sz w:val="28"/>
+          <w:sz w:val="26"/>
+          <w:szCs w:val="26"/>
         </w:rPr>
         <w:t xml:space="preserve"> ký ngày {{day}}/{{month}}/{{year}}.</w:t>
       </w:r>
@@ -659,22 +756,17 @@
         <w:ind w:left="1140"/>
         <w:rPr>
           <w:rFonts w:ascii="Times New Roman" w:hAnsi="Times New Roman"/>
-          <w:sz w:val="28"/>
-        </w:rPr>
-      </w:pPr>
-      <w:r>
-        <w:rPr>
-          <w:rFonts w:ascii="Times New Roman" w:hAnsi="Times New Roman"/>
-          <w:sz w:val="28"/>
-        </w:rPr>
-        <w:t>Thờ</w:t>
-      </w:r>
-      <w:r>
-        <w:rPr>
-          <w:rFonts w:ascii="Times New Roman" w:hAnsi="Times New Roman"/>
-          <w:sz w:val="28"/>
-        </w:rPr>
-        <w:t>i gian vay {{thv}} năm.</w:t>
+          <w:sz w:val="26"/>
+          <w:szCs w:val="26"/>
+        </w:rPr>
+      </w:pPr>
+      <w:r>
+        <w:rPr>
+          <w:rFonts w:ascii="Times New Roman" w:hAnsi="Times New Roman"/>
+          <w:sz w:val="26"/>
+          <w:szCs w:val="26"/>
+        </w:rPr>
+        <w:t>{{thvGNN}}</w:t>
       </w:r>
     </w:p>
     <w:p>
@@ -683,22 +775,17 @@
         <w:ind w:left="1140"/>
         <w:rPr>
           <w:rFonts w:ascii="Times New Roman" w:hAnsi="Times New Roman"/>
-          <w:sz w:val="28"/>
-        </w:rPr>
-      </w:pPr>
-      <w:r>
-        <w:rPr>
-          <w:rFonts w:ascii="Times New Roman" w:hAnsi="Times New Roman"/>
-          <w:sz w:val="28"/>
-        </w:rPr>
-        <w:t>Tổng tiền vay: {{tienso}}</w:t>
-      </w:r>
-      <w:r>
-        <w:rPr>
-          <w:rFonts w:ascii="Times New Roman" w:hAnsi="Times New Roman"/>
-          <w:sz w:val="28"/>
-        </w:rPr>
-        <w:t xml:space="preserve"> đồng.</w:t>
+          <w:sz w:val="26"/>
+          <w:szCs w:val="26"/>
+        </w:rPr>
+      </w:pPr>
+      <w:r>
+        <w:rPr>
+          <w:rFonts w:ascii="Times New Roman" w:hAnsi="Times New Roman"/>
+          <w:sz w:val="26"/>
+          <w:szCs w:val="26"/>
+        </w:rPr>
+        <w:t>{{tienGNN}}</w:t>
       </w:r>
     </w:p>
     <w:p>
@@ -707,13 +794,15 @@
         <w:ind w:left="1140"/>
         <w:rPr>
           <w:rFonts w:ascii="Times New Roman" w:hAnsi="Times New Roman"/>
-          <w:sz w:val="28"/>
-        </w:rPr>
-      </w:pPr>
-      <w:r>
-        <w:rPr>
-          <w:rFonts w:ascii="Times New Roman" w:hAnsi="Times New Roman"/>
-          <w:sz w:val="28"/>
+          <w:sz w:val="26"/>
+          <w:szCs w:val="26"/>
+        </w:rPr>
+      </w:pPr>
+      <w:r>
+        <w:rPr>
+          <w:rFonts w:ascii="Times New Roman" w:hAnsi="Times New Roman"/>
+          <w:sz w:val="26"/>
+          <w:szCs w:val="26"/>
         </w:rPr>
         <w:t>Bằng chữ: {{tc}}.</w:t>
       </w:r>
@@ -727,15 +816,33 @@
         </w:numPr>
         <w:rPr>
           <w:rFonts w:ascii="Times New Roman" w:hAnsi="Times New Roman"/>
-          <w:sz w:val="28"/>
-        </w:rPr>
-      </w:pPr>
-      <w:r>
-        <w:rPr>
-          <w:rFonts w:ascii="Times New Roman" w:hAnsi="Times New Roman"/>
-          <w:sz w:val="28"/>
-        </w:rPr>
-        <w:t>Việc chấp hành cam kết của khách hàng theo Hợp đồng cho vay:</w:t>
+          <w:sz w:val="26"/>
+          <w:szCs w:val="26"/>
+        </w:rPr>
+      </w:pPr>
+      <w:r>
+        <w:rPr>
+          <w:rFonts w:ascii="Times New Roman" w:hAnsi="Times New Roman"/>
+          <w:sz w:val="26"/>
+          <w:szCs w:val="26"/>
+        </w:rPr>
+        <w:t>Việc chấp hành cam kết của khách hàng theo Hợp đồ</w:t>
+      </w:r>
+      <w:r>
+        <w:rPr>
+          <w:rFonts w:ascii="Times New Roman" w:hAnsi="Times New Roman"/>
+          <w:sz w:val="26"/>
+          <w:szCs w:val="26"/>
+        </w:rPr>
+        <w:t>ng tín dụng</w:t>
+      </w:r>
+      <w:r>
+        <w:rPr>
+          <w:rFonts w:ascii="Times New Roman" w:hAnsi="Times New Roman"/>
+          <w:sz w:val="26"/>
+          <w:szCs w:val="26"/>
+        </w:rPr>
+        <w:t>:</w:t>
       </w:r>
     </w:p>
     <w:p>
@@ -744,15 +851,33 @@
         <w:ind w:left="1140"/>
         <w:rPr>
           <w:rFonts w:ascii="Times New Roman" w:hAnsi="Times New Roman"/>
-          <w:sz w:val="28"/>
-        </w:rPr>
-      </w:pPr>
-      <w:r>
-        <w:rPr>
-          <w:rFonts w:ascii="Times New Roman" w:hAnsi="Times New Roman"/>
-          <w:sz w:val="28"/>
-        </w:rPr>
-        <w:t>Chấp hành đúng các thỏa thuận, cam kết của Hợp đồng cho vay.</w:t>
+          <w:sz w:val="26"/>
+          <w:szCs w:val="26"/>
+        </w:rPr>
+      </w:pPr>
+      <w:r>
+        <w:rPr>
+          <w:rFonts w:ascii="Times New Roman" w:hAnsi="Times New Roman"/>
+          <w:sz w:val="26"/>
+          <w:szCs w:val="26"/>
+        </w:rPr>
+        <w:t>Chấp hành đúng các thỏa thuận, cam kết của Hợp đồ</w:t>
+      </w:r>
+      <w:r>
+        <w:rPr>
+          <w:rFonts w:ascii="Times New Roman" w:hAnsi="Times New Roman"/>
+          <w:sz w:val="26"/>
+          <w:szCs w:val="26"/>
+        </w:rPr>
+        <w:t>ng tín dụng</w:t>
+      </w:r>
+      <w:r>
+        <w:rPr>
+          <w:rFonts w:ascii="Times New Roman" w:hAnsi="Times New Roman"/>
+          <w:sz w:val="26"/>
+          <w:szCs w:val="26"/>
+        </w:rPr>
+        <w:t>.</w:t>
       </w:r>
     </w:p>
     <w:p>
@@ -764,27 +889,31 @@
         </w:numPr>
         <w:rPr>
           <w:rFonts w:ascii="Times New Roman" w:hAnsi="Times New Roman"/>
-          <w:sz w:val="28"/>
-        </w:rPr>
-      </w:pPr>
-      <w:r>
-        <w:rPr>
-          <w:rFonts w:ascii="Times New Roman" w:hAnsi="Times New Roman"/>
-          <w:sz w:val="28"/>
+          <w:sz w:val="26"/>
+          <w:szCs w:val="26"/>
+        </w:rPr>
+      </w:pPr>
+      <w:r>
+        <w:rPr>
+          <w:rFonts w:ascii="Times New Roman" w:hAnsi="Times New Roman"/>
+          <w:sz w:val="26"/>
+          <w:szCs w:val="26"/>
         </w:rPr>
         <w:t>Mục đích sử dụ</w:t>
       </w:r>
       <w:r>
         <w:rPr>
           <w:rFonts w:ascii="Times New Roman" w:hAnsi="Times New Roman"/>
-          <w:sz w:val="28"/>
+          <w:sz w:val="26"/>
+          <w:szCs w:val="26"/>
         </w:rPr>
         <w:t>ng: {{mdvay}}</w:t>
       </w:r>
       <w:r>
         <w:rPr>
           <w:rFonts w:ascii="Times New Roman" w:hAnsi="Times New Roman"/>
-          <w:sz w:val="28"/>
+          <w:sz w:val="26"/>
+          <w:szCs w:val="26"/>
         </w:rPr>
         <w:t>.</w:t>
       </w:r>
@@ -798,13 +927,15 @@
         </w:numPr>
         <w:rPr>
           <w:rFonts w:ascii="Times New Roman" w:hAnsi="Times New Roman"/>
-          <w:sz w:val="28"/>
-        </w:rPr>
-      </w:pPr>
-      <w:r>
-        <w:rPr>
-          <w:rFonts w:ascii="Times New Roman" w:hAnsi="Times New Roman"/>
-          <w:sz w:val="28"/>
+          <w:sz w:val="26"/>
+          <w:szCs w:val="26"/>
+        </w:rPr>
+      </w:pPr>
+      <w:r>
+        <w:rPr>
+          <w:rFonts w:ascii="Times New Roman" w:hAnsi="Times New Roman"/>
+          <w:sz w:val="26"/>
+          <w:szCs w:val="26"/>
         </w:rPr>
         <w:t>Đánh giá phương án sử dụng vốn.</w:t>
       </w:r>
@@ -818,57 +949,310 @@
         </w:numPr>
         <w:rPr>
           <w:rFonts w:ascii="Times New Roman" w:hAnsi="Times New Roman"/>
-          <w:sz w:val="28"/>
-        </w:rPr>
-      </w:pPr>
-      <w:r>
-        <w:rPr>
-          <w:rFonts w:ascii="Times New Roman" w:hAnsi="Times New Roman"/>
-          <w:sz w:val="28"/>
+          <w:sz w:val="26"/>
+          <w:szCs w:val="26"/>
+        </w:rPr>
+      </w:pPr>
+      <w:r>
+        <w:rPr>
+          <w:rFonts w:ascii="Times New Roman" w:hAnsi="Times New Roman"/>
+          <w:sz w:val="26"/>
+          <w:szCs w:val="26"/>
         </w:rPr>
         <w:t xml:space="preserve">Tổng nhu cầu vốn của phương án = tổng chi phí của phương án – tổng chi phí gián tiếp:              </w:t>
       </w:r>
       <w:r>
         <w:rPr>
           <w:rFonts w:ascii="Times New Roman" w:hAnsi="Times New Roman"/>
-          <w:sz w:val="28"/>
+          <w:sz w:val="26"/>
+          <w:szCs w:val="26"/>
         </w:rPr>
         <w:t xml:space="preserve">      </w:t>
       </w:r>
       <w:r>
         <w:rPr>
           <w:rFonts w:ascii="Times New Roman" w:hAnsi="Times New Roman"/>
-          <w:sz w:val="28"/>
+          <w:sz w:val="26"/>
+          <w:szCs w:val="26"/>
         </w:rPr>
         <w:t xml:space="preserve">{{tongNCV}}           </w:t>
       </w:r>
       <w:r>
         <w:rPr>
           <w:rFonts w:ascii="Times New Roman" w:hAnsi="Times New Roman"/>
-          <w:sz w:val="28"/>
+          <w:sz w:val="26"/>
+          <w:szCs w:val="26"/>
         </w:rPr>
         <w:t xml:space="preserve">          </w:t>
       </w:r>
       <w:r>
         <w:rPr>
           <w:rFonts w:ascii="Times New Roman" w:hAnsi="Times New Roman"/>
-          <w:sz w:val="28"/>
+          <w:sz w:val="26"/>
+          <w:szCs w:val="26"/>
         </w:rPr>
         <w:t xml:space="preserve">     </w:t>
       </w:r>
       <w:r>
         <w:rPr>
           <w:rFonts w:ascii="Times New Roman" w:hAnsi="Times New Roman"/>
-          <w:sz w:val="28"/>
+          <w:sz w:val="26"/>
+          <w:szCs w:val="26"/>
         </w:rPr>
         <w:t xml:space="preserve">   </w:t>
       </w:r>
       <w:r>
         <w:rPr>
           <w:rFonts w:ascii="Times New Roman" w:hAnsi="Times New Roman"/>
-          <w:sz w:val="28"/>
+          <w:sz w:val="26"/>
+          <w:szCs w:val="26"/>
         </w:rPr>
         <w:t>đồng</w:t>
+      </w:r>
+    </w:p>
+    <w:p>
+      <w:pPr>
+        <w:ind w:left="1140"/>
+        <w:rPr>
+          <w:rFonts w:ascii="Times New Roman" w:hAnsi="Times New Roman"/>
+          <w:sz w:val="26"/>
+          <w:szCs w:val="26"/>
+        </w:rPr>
+      </w:pPr>
+      <w:r>
+        <w:rPr>
+          <w:rFonts w:ascii="Times New Roman" w:hAnsi="Times New Roman"/>
+          <w:sz w:val="26"/>
+          <w:szCs w:val="26"/>
+        </w:rPr>
+        <w:t>{{vongQuayGNN}}</w:t>
+      </w:r>
+    </w:p>
+    <w:p>
+      <w:pPr>
+        <w:ind w:left="1140"/>
+        <w:rPr>
+          <w:rFonts w:ascii="Times New Roman" w:hAnsi="Times New Roman"/>
+          <w:sz w:val="26"/>
+          <w:szCs w:val="26"/>
+        </w:rPr>
+      </w:pPr>
+      <w:r>
+        <w:rPr>
+          <w:rFonts w:ascii="Times New Roman" w:hAnsi="Times New Roman"/>
+          <w:sz w:val="26"/>
+          <w:szCs w:val="26"/>
+        </w:rPr>
+        <w:t>{{vld}}</w:t>
+      </w:r>
+    </w:p>
+    <w:p>
+      <w:pPr>
+        <w:rPr>
+          <w:rFonts w:ascii="Times New Roman" w:hAnsi="Times New Roman"/>
+          <w:sz w:val="26"/>
+          <w:szCs w:val="26"/>
+        </w:rPr>
+      </w:pPr>
+      <w:r>
+        <w:rPr>
+          <w:rFonts w:ascii="Times New Roman" w:hAnsi="Times New Roman"/>
+          <w:sz w:val="26"/>
+          <w:szCs w:val="26"/>
+        </w:rPr>
+        <w:t xml:space="preserve">                - </w:t>
+      </w:r>
+      <w:r>
+        <w:rPr>
+          <w:rFonts w:ascii="Times New Roman" w:hAnsi="Times New Roman"/>
+          <w:sz w:val="26"/>
+          <w:szCs w:val="26"/>
+        </w:rPr>
+        <w:t xml:space="preserve">Vốn tự có:                        {{vonTuCo}}           </w:t>
+      </w:r>
+      <w:r>
+        <w:rPr>
+          <w:rFonts w:ascii="Times New Roman" w:hAnsi="Times New Roman"/>
+          <w:sz w:val="26"/>
+          <w:szCs w:val="26"/>
+        </w:rPr>
+        <w:t xml:space="preserve">          </w:t>
+      </w:r>
+      <w:r>
+        <w:rPr>
+          <w:rFonts w:ascii="Times New Roman" w:hAnsi="Times New Roman"/>
+          <w:sz w:val="26"/>
+          <w:szCs w:val="26"/>
+        </w:rPr>
+        <w:t xml:space="preserve">     </w:t>
+      </w:r>
+      <w:r>
+        <w:rPr>
+          <w:rFonts w:ascii="Times New Roman" w:hAnsi="Times New Roman"/>
+          <w:sz w:val="26"/>
+          <w:szCs w:val="26"/>
+        </w:rPr>
+        <w:t xml:space="preserve">   </w:t>
+      </w:r>
+      <w:r>
+        <w:rPr>
+          <w:rFonts w:ascii="Times New Roman" w:hAnsi="Times New Roman"/>
+          <w:sz w:val="26"/>
+          <w:szCs w:val="26"/>
+        </w:rPr>
+        <w:t>đồng</w:t>
+      </w:r>
+    </w:p>
+    <w:p>
+      <w:pPr>
+        <w:rPr>
+          <w:rFonts w:ascii="Times New Roman" w:hAnsi="Times New Roman"/>
+          <w:sz w:val="26"/>
+          <w:szCs w:val="26"/>
+        </w:rPr>
+      </w:pPr>
+      <w:r>
+        <w:rPr>
+          <w:rFonts w:ascii="Times New Roman" w:hAnsi="Times New Roman"/>
+          <w:sz w:val="26"/>
+          <w:szCs w:val="26"/>
+        </w:rPr>
+        <w:t xml:space="preserve">                - </w:t>
+      </w:r>
+      <w:r>
+        <w:rPr>
+          <w:rFonts w:ascii="Times New Roman" w:hAnsi="Times New Roman"/>
+          <w:sz w:val="26"/>
+          <w:szCs w:val="26"/>
+        </w:rPr>
+        <w:t xml:space="preserve">Vốn khác:                         </w:t>
+      </w:r>
+      <w:r>
+        <w:rPr>
+          <w:rFonts w:ascii="Times New Roman" w:hAnsi="Times New Roman"/>
+          <w:sz w:val="26"/>
+          <w:szCs w:val="26"/>
+        </w:rPr>
+        <w:t xml:space="preserve">  </w:t>
+      </w:r>
+      <w:r>
+        <w:rPr>
+          <w:rFonts w:ascii="Times New Roman" w:hAnsi="Times New Roman"/>
+          <w:sz w:val="26"/>
+          <w:szCs w:val="26"/>
+        </w:rPr>
+        <w:t xml:space="preserve">{{vonKhac}}                             </w:t>
+      </w:r>
+      <w:r>
+        <w:rPr>
+          <w:rFonts w:ascii="Times New Roman" w:hAnsi="Times New Roman"/>
+          <w:sz w:val="26"/>
+          <w:szCs w:val="26"/>
+        </w:rPr>
+        <w:t xml:space="preserve">  </w:t>
+      </w:r>
+      <w:r>
+        <w:rPr>
+          <w:rFonts w:ascii="Times New Roman" w:hAnsi="Times New Roman"/>
+          <w:sz w:val="26"/>
+          <w:szCs w:val="26"/>
+        </w:rPr>
+        <w:t>đồng</w:t>
+      </w:r>
+    </w:p>
+    <w:p>
+      <w:pPr>
+        <w:rPr>
+          <w:rFonts w:ascii="Times New Roman" w:hAnsi="Times New Roman"/>
+          <w:sz w:val="26"/>
+          <w:szCs w:val="26"/>
+        </w:rPr>
+      </w:pPr>
+      <w:r>
+        <w:rPr>
+          <w:rFonts w:ascii="Times New Roman" w:hAnsi="Times New Roman"/>
+          <w:sz w:val="26"/>
+          <w:szCs w:val="26"/>
+        </w:rPr>
+        <w:t xml:space="preserve">                - </w:t>
+      </w:r>
+      <w:r>
+        <w:rPr>
+          <w:rFonts w:ascii="Times New Roman" w:hAnsi="Times New Roman"/>
+          <w:sz w:val="26"/>
+          <w:szCs w:val="26"/>
+        </w:rPr>
+        <w:t xml:space="preserve">Vốn xin vay của Quỹ:      {{tienso}}                </w:t>
+      </w:r>
+      <w:r>
+        <w:rPr>
+          <w:rFonts w:ascii="Times New Roman" w:hAnsi="Times New Roman"/>
+          <w:sz w:val="26"/>
+          <w:szCs w:val="26"/>
+        </w:rPr>
+        <w:t xml:space="preserve">     </w:t>
+      </w:r>
+      <w:r>
+        <w:rPr>
+          <w:rFonts w:ascii="Times New Roman" w:hAnsi="Times New Roman"/>
+          <w:sz w:val="26"/>
+          <w:szCs w:val="26"/>
+        </w:rPr>
+        <w:t xml:space="preserve"> </w:t>
+      </w:r>
+      <w:r>
+        <w:rPr>
+          <w:rFonts w:ascii="Times New Roman" w:hAnsi="Times New Roman"/>
+          <w:sz w:val="26"/>
+          <w:szCs w:val="26"/>
+        </w:rPr>
+        <w:t xml:space="preserve">   </w:t>
+      </w:r>
+      <w:r>
+        <w:rPr>
+          <w:rFonts w:ascii="Times New Roman" w:hAnsi="Times New Roman"/>
+          <w:sz w:val="26"/>
+          <w:szCs w:val="26"/>
+        </w:rPr>
+        <w:t xml:space="preserve">   </w:t>
+      </w:r>
+      <w:r>
+        <w:rPr>
+          <w:rFonts w:ascii="Times New Roman" w:hAnsi="Times New Roman"/>
+          <w:sz w:val="26"/>
+          <w:szCs w:val="26"/>
+        </w:rPr>
+        <w:t xml:space="preserve"> </w:t>
+      </w:r>
+      <w:r>
+        <w:rPr>
+          <w:rFonts w:ascii="Times New Roman" w:hAnsi="Times New Roman"/>
+          <w:sz w:val="26"/>
+          <w:szCs w:val="26"/>
+        </w:rPr>
+        <w:t>đồng</w:t>
+      </w:r>
+    </w:p>
+    <w:p>
+      <w:pPr>
+        <w:pStyle w:val="ListParagraph"/>
+        <w:numPr>
+          <w:ilvl w:val="0"/>
+          <w:numId w:val="4"/>
+        </w:numPr>
+        <w:rPr>
+          <w:rFonts w:ascii="Times New Roman" w:hAnsi="Times New Roman"/>
+          <w:sz w:val="26"/>
+          <w:szCs w:val="26"/>
+        </w:rPr>
+      </w:pPr>
+      <w:r>
+        <w:rPr>
+          <w:rFonts w:ascii="Times New Roman" w:hAnsi="Times New Roman"/>
+          <w:sz w:val="26"/>
+          <w:szCs w:val="26"/>
+        </w:rPr>
+        <w:t>Hiệu quả của phương án:</w:t>
       </w:r>
     </w:p>
     <w:p>
@@ -880,41 +1264,55 @@
         </w:numPr>
         <w:rPr>
           <w:rFonts w:ascii="Times New Roman" w:hAnsi="Times New Roman"/>
-          <w:sz w:val="28"/>
-        </w:rPr>
-      </w:pPr>
-      <w:r>
-        <w:rPr>
-          <w:rFonts w:ascii="Times New Roman" w:hAnsi="Times New Roman"/>
-          <w:sz w:val="28"/>
-        </w:rPr>
-        <w:t xml:space="preserve">Vốn tự có:                        {{vonTuCo}}           </w:t>
-      </w:r>
-      <w:r>
-        <w:rPr>
-          <w:rFonts w:ascii="Times New Roman" w:hAnsi="Times New Roman"/>
-          <w:sz w:val="28"/>
-        </w:rPr>
-        <w:t xml:space="preserve">          </w:t>
-      </w:r>
-      <w:r>
-        <w:rPr>
-          <w:rFonts w:ascii="Times New Roman" w:hAnsi="Times New Roman"/>
-          <w:sz w:val="28"/>
-        </w:rPr>
-        <w:t xml:space="preserve">     </w:t>
-      </w:r>
-      <w:r>
-        <w:rPr>
-          <w:rFonts w:ascii="Times New Roman" w:hAnsi="Times New Roman"/>
-          <w:sz w:val="28"/>
-        </w:rPr>
-        <w:t xml:space="preserve">   </w:t>
-      </w:r>
-      <w:r>
-        <w:rPr>
-          <w:rFonts w:ascii="Times New Roman" w:hAnsi="Times New Roman"/>
-          <w:sz w:val="28"/>
+          <w:sz w:val="26"/>
+          <w:szCs w:val="26"/>
+        </w:rPr>
+      </w:pPr>
+      <w:r>
+        <w:rPr>
+          <w:rFonts w:ascii="Times New Roman" w:hAnsi="Times New Roman"/>
+          <w:sz w:val="26"/>
+          <w:szCs w:val="26"/>
+        </w:rPr>
+        <w:t xml:space="preserve">Dự kiến thu nhập: </w:t>
+      </w:r>
+      <w:r>
+        <w:rPr>
+          <w:rFonts w:ascii="Times New Roman" w:hAnsi="Times New Roman"/>
+          <w:sz w:val="26"/>
+          <w:szCs w:val="26"/>
+        </w:rPr>
+        <w:t xml:space="preserve">            {{tongDoanhThu}}</w:t>
+      </w:r>
+      <w:r>
+        <w:rPr>
+          <w:rFonts w:ascii="Times New Roman" w:hAnsi="Times New Roman"/>
+          <w:sz w:val="26"/>
+          <w:szCs w:val="26"/>
+        </w:rPr>
+        <w:t xml:space="preserve">        </w:t>
+      </w:r>
+      <w:r>
+        <w:rPr>
+          <w:rFonts w:ascii="Times New Roman" w:hAnsi="Times New Roman"/>
+          <w:sz w:val="26"/>
+          <w:szCs w:val="26"/>
+        </w:rPr>
+        <w:t xml:space="preserve">               </w:t>
+      </w:r>
+      <w:r>
+        <w:rPr>
+          <w:rFonts w:ascii="Times New Roman" w:hAnsi="Times New Roman"/>
+          <w:sz w:val="26"/>
+          <w:szCs w:val="26"/>
+        </w:rPr>
+        <w:t xml:space="preserve">  </w:t>
+      </w:r>
+      <w:r>
+        <w:rPr>
+          <w:rFonts w:ascii="Times New Roman" w:hAnsi="Times New Roman"/>
+          <w:sz w:val="26"/>
+          <w:szCs w:val="26"/>
         </w:rPr>
         <w:t>đồng</w:t>
       </w:r>
@@ -928,29 +1326,41 @@
         </w:numPr>
         <w:rPr>
           <w:rFonts w:ascii="Times New Roman" w:hAnsi="Times New Roman"/>
-          <w:sz w:val="28"/>
-        </w:rPr>
-      </w:pPr>
-      <w:r>
-        <w:rPr>
-          <w:rFonts w:ascii="Times New Roman" w:hAnsi="Times New Roman"/>
-          <w:sz w:val="28"/>
-        </w:rPr>
-        <w:t xml:space="preserve">Vốn khác:                         </w:t>
-      </w:r>
-      <w:r>
-        <w:rPr>
-          <w:rFonts w:ascii="Times New Roman" w:hAnsi="Times New Roman"/>
-          <w:sz w:val="28"/>
-        </w:rPr>
-        <w:t xml:space="preserve">  </w:t>
-      </w:r>
-      <w:r>
-        <w:rPr>
-          <w:rFonts w:ascii="Times New Roman" w:hAnsi="Times New Roman"/>
-          <w:sz w:val="28"/>
-        </w:rPr>
-        <w:t>{{vonKhac}}                             đồng</w:t>
+          <w:sz w:val="26"/>
+          <w:szCs w:val="26"/>
+        </w:rPr>
+      </w:pPr>
+      <w:r>
+        <w:rPr>
+          <w:rFonts w:ascii="Times New Roman" w:hAnsi="Times New Roman"/>
+          <w:sz w:val="26"/>
+          <w:szCs w:val="26"/>
+        </w:rPr>
+        <w:t xml:space="preserve">Dự kiến chi phí:                {{tongChiPhi}}                 </w:t>
+      </w:r>
+      <w:r>
+        <w:rPr>
+          <w:rFonts w:ascii="Times New Roman" w:hAnsi="Times New Roman"/>
+          <w:sz w:val="26"/>
+          <w:szCs w:val="26"/>
+        </w:rPr>
+        <w:t xml:space="preserve">   </w:t>
+      </w:r>
+      <w:r>
+        <w:rPr>
+          <w:rFonts w:ascii="Times New Roman" w:hAnsi="Times New Roman"/>
+          <w:sz w:val="26"/>
+          <w:szCs w:val="26"/>
+        </w:rPr>
+        <w:t xml:space="preserve">     </w:t>
+      </w:r>
+      <w:r>
+        <w:rPr>
+          <w:rFonts w:ascii="Times New Roman" w:hAnsi="Times New Roman"/>
+          <w:sz w:val="26"/>
+          <w:szCs w:val="26"/>
+        </w:rPr>
+        <w:t>đồng</w:t>
       </w:r>
     </w:p>
     <w:p>
@@ -962,55 +1372,88 @@
         </w:numPr>
         <w:rPr>
           <w:rFonts w:ascii="Times New Roman" w:hAnsi="Times New Roman"/>
-          <w:sz w:val="28"/>
-        </w:rPr>
-      </w:pPr>
-      <w:r>
-        <w:rPr>
-          <w:rFonts w:ascii="Times New Roman" w:hAnsi="Times New Roman"/>
-          <w:sz w:val="28"/>
-        </w:rPr>
-        <w:t xml:space="preserve">Vốn xin vay của Quỹ:      {{tienso}}                </w:t>
-      </w:r>
-      <w:r>
-        <w:rPr>
-          <w:rFonts w:ascii="Times New Roman" w:hAnsi="Times New Roman"/>
-          <w:sz w:val="28"/>
+          <w:sz w:val="26"/>
+          <w:szCs w:val="26"/>
+        </w:rPr>
+      </w:pPr>
+      <w:r>
+        <w:rPr>
+          <w:rFonts w:ascii="Times New Roman" w:hAnsi="Times New Roman"/>
+          <w:sz w:val="26"/>
+          <w:szCs w:val="26"/>
+        </w:rPr>
+        <w:lastRenderedPageBreak/>
+        <w:t>Chênh lệ</w:t>
+      </w:r>
+      <w:r>
+        <w:rPr>
+          <w:rFonts w:ascii="Times New Roman" w:hAnsi="Times New Roman"/>
+          <w:sz w:val="26"/>
+          <w:szCs w:val="26"/>
+        </w:rPr>
+        <w:t xml:space="preserve">ch thu – chi         </w:t>
+      </w:r>
+      <w:r>
+        <w:rPr>
+          <w:rFonts w:ascii="Times New Roman" w:hAnsi="Times New Roman"/>
+          <w:sz w:val="26"/>
+          <w:szCs w:val="26"/>
+        </w:rPr>
+        <w:t xml:space="preserve">  </w:t>
+      </w:r>
+      <w:r>
+        <w:rPr>
+          <w:rFonts w:ascii="Times New Roman" w:hAnsi="Times New Roman"/>
+          <w:sz w:val="26"/>
+          <w:szCs w:val="26"/>
+        </w:rPr>
+        <w:t>{{loiNhuan}}</w:t>
+      </w:r>
+      <w:r>
+        <w:rPr>
+          <w:rFonts w:ascii="Times New Roman" w:hAnsi="Times New Roman"/>
+          <w:sz w:val="26"/>
+          <w:szCs w:val="26"/>
         </w:rPr>
         <w:t xml:space="preserve">     </w:t>
       </w:r>
       <w:r>
         <w:rPr>
           <w:rFonts w:ascii="Times New Roman" w:hAnsi="Times New Roman"/>
-          <w:sz w:val="28"/>
-        </w:rPr>
-        <w:t xml:space="preserve"> </w:t>
-      </w:r>
-      <w:r>
-        <w:rPr>
-          <w:rFonts w:ascii="Times New Roman" w:hAnsi="Times New Roman"/>
-          <w:sz w:val="28"/>
+          <w:sz w:val="26"/>
+          <w:szCs w:val="26"/>
+        </w:rPr>
+        <w:t xml:space="preserve">               </w:t>
+      </w:r>
+      <w:r>
+        <w:rPr>
+          <w:rFonts w:ascii="Times New Roman" w:hAnsi="Times New Roman"/>
+          <w:sz w:val="26"/>
+          <w:szCs w:val="26"/>
         </w:rPr>
         <w:t xml:space="preserve">   </w:t>
       </w:r>
       <w:r>
         <w:rPr>
           <w:rFonts w:ascii="Times New Roman" w:hAnsi="Times New Roman"/>
-          <w:sz w:val="28"/>
-        </w:rPr>
-        <w:t xml:space="preserve">   </w:t>
-      </w:r>
-      <w:r>
-        <w:rPr>
-          <w:rFonts w:ascii="Times New Roman" w:hAnsi="Times New Roman"/>
-          <w:sz w:val="28"/>
-        </w:rPr>
-        <w:t xml:space="preserve"> </w:t>
-      </w:r>
-      <w:r>
-        <w:rPr>
-          <w:rFonts w:ascii="Times New Roman" w:hAnsi="Times New Roman"/>
-          <w:sz w:val="28"/>
+          <w:sz w:val="26"/>
+          <w:szCs w:val="26"/>
+        </w:rPr>
+        <w:t xml:space="preserve">  </w:t>
+      </w:r>
+      <w:r>
+        <w:rPr>
+          <w:rFonts w:ascii="Times New Roman" w:hAnsi="Times New Roman"/>
+          <w:sz w:val="26"/>
+          <w:szCs w:val="26"/>
+        </w:rPr>
+        <w:t xml:space="preserve">  </w:t>
+      </w:r>
+      <w:r>
+        <w:rPr>
+          <w:rFonts w:ascii="Times New Roman" w:hAnsi="Times New Roman"/>
+          <w:sz w:val="26"/>
+          <w:szCs w:val="26"/>
         </w:rPr>
         <w:t>đồng</w:t>
       </w:r>
@@ -1019,20 +1462,22 @@
       <w:pPr>
         <w:pStyle w:val="ListParagraph"/>
         <w:numPr>
-          <w:ilvl w:val="0"/>
-          <w:numId w:val="4"/>
+          <w:ilvl w:val="1"/>
+          <w:numId w:val="1"/>
         </w:numPr>
         <w:rPr>
           <w:rFonts w:ascii="Times New Roman" w:hAnsi="Times New Roman"/>
-          <w:sz w:val="28"/>
-        </w:rPr>
-      </w:pPr>
-      <w:r>
-        <w:rPr>
-          <w:rFonts w:ascii="Times New Roman" w:hAnsi="Times New Roman"/>
-          <w:sz w:val="28"/>
-        </w:rPr>
-        <w:t>Hiệu quả của phương án:</w:t>
+          <w:sz w:val="26"/>
+          <w:szCs w:val="26"/>
+        </w:rPr>
+      </w:pPr>
+      <w:r>
+        <w:rPr>
+          <w:rFonts w:ascii="Times New Roman" w:hAnsi="Times New Roman"/>
+          <w:sz w:val="26"/>
+          <w:szCs w:val="26"/>
+        </w:rPr>
+        <w:t>Nguồn trả nợ</w:t>
       </w:r>
     </w:p>
     <w:p>
@@ -1044,50 +1489,49 @@
         </w:numPr>
         <w:rPr>
           <w:rFonts w:ascii="Times New Roman" w:hAnsi="Times New Roman"/>
-          <w:sz w:val="28"/>
-        </w:rPr>
-      </w:pPr>
-      <w:r>
-        <w:rPr>
-          <w:rFonts w:ascii="Times New Roman" w:hAnsi="Times New Roman"/>
-          <w:sz w:val="28"/>
-        </w:rPr>
-        <w:t xml:space="preserve">Dự kiến thu nhập: </w:t>
-      </w:r>
-      <w:r>
-        <w:rPr>
-          <w:rFonts w:ascii="Times New Roman" w:hAnsi="Times New Roman"/>
-          <w:sz w:val="28"/>
-        </w:rPr>
-        <w:t xml:space="preserve">            {{tongDoanhThu}}</w:t>
-      </w:r>
-      <w:r>
-        <w:rPr>
-          <w:rFonts w:ascii="Times New Roman" w:hAnsi="Times New Roman"/>
-          <w:sz w:val="28"/>
-        </w:rPr>
-        <w:t xml:space="preserve">        </w:t>
-      </w:r>
-      <w:r>
-        <w:rPr>
-          <w:rFonts w:ascii="Times New Roman" w:hAnsi="Times New Roman"/>
-          <w:sz w:val="28"/>
-        </w:rPr>
-        <w:t xml:space="preserve">               </w:t>
-      </w:r>
-      <w:r>
-        <w:rPr>
-          <w:rFonts w:ascii="Times New Roman" w:hAnsi="Times New Roman"/>
-          <w:sz w:val="28"/>
-        </w:rPr>
-        <w:t xml:space="preserve">  </w:t>
-      </w:r>
-      <w:r>
-        <w:rPr>
-          <w:rFonts w:ascii="Times New Roman" w:hAnsi="Times New Roman"/>
-          <w:sz w:val="28"/>
+          <w:sz w:val="26"/>
+          <w:szCs w:val="26"/>
+        </w:rPr>
+      </w:pPr>
+      <w:r>
+        <w:rPr>
+          <w:rFonts w:ascii="Times New Roman" w:hAnsi="Times New Roman"/>
+          <w:sz w:val="26"/>
+          <w:szCs w:val="26"/>
+        </w:rPr>
+        <w:t xml:space="preserve">Từ thu nhập hoạt động của phương án:         </w:t>
+      </w:r>
+      <w:r>
+        <w:rPr>
+          <w:rFonts w:ascii="Times New Roman" w:hAnsi="Times New Roman"/>
+          <w:sz w:val="26"/>
+          <w:szCs w:val="26"/>
+        </w:rPr>
+        <w:t xml:space="preserve">{{loiNhuan}}       </w:t>
+      </w:r>
+      <w:r>
+        <w:rPr>
+          <w:rFonts w:ascii="Times New Roman" w:hAnsi="Times New Roman"/>
+          <w:sz w:val="26"/>
+          <w:szCs w:val="26"/>
+        </w:rPr>
+        <w:t xml:space="preserve">   </w:t>
+      </w:r>
+      <w:r>
+        <w:rPr>
+          <w:rFonts w:ascii="Times New Roman" w:hAnsi="Times New Roman"/>
+          <w:sz w:val="26"/>
+          <w:szCs w:val="26"/>
         </w:rPr>
         <w:t>đồng</w:t>
+      </w:r>
+      <w:r>
+        <w:rPr>
+          <w:rFonts w:ascii="Times New Roman" w:hAnsi="Times New Roman"/>
+          <w:sz w:val="26"/>
+          <w:szCs w:val="26"/>
+        </w:rPr>
+        <w:t xml:space="preserve">   </w:t>
       </w:r>
     </w:p>
     <w:p>
@@ -1099,36 +1543,33 @@
         </w:numPr>
         <w:rPr>
           <w:rFonts w:ascii="Times New Roman" w:hAnsi="Times New Roman"/>
-          <w:sz w:val="28"/>
-        </w:rPr>
-      </w:pPr>
-      <w:r>
-        <w:rPr>
-          <w:rFonts w:ascii="Times New Roman" w:hAnsi="Times New Roman"/>
-          <w:sz w:val="28"/>
-        </w:rPr>
-        <w:t xml:space="preserve">Dự kiến chi phí:                {{tongChiPhi}}                 </w:t>
-      </w:r>
-      <w:r>
-        <w:rPr>
-          <w:rFonts w:ascii="Times New Roman" w:hAnsi="Times New Roman"/>
-          <w:sz w:val="28"/>
-        </w:rPr>
-        <w:t xml:space="preserve">   </w:t>
-      </w:r>
-      <w:r>
-        <w:rPr>
-          <w:rFonts w:ascii="Times New Roman" w:hAnsi="Times New Roman"/>
-          <w:sz w:val="28"/>
-        </w:rPr>
-        <w:t xml:space="preserve">     </w:t>
-      </w:r>
-      <w:r>
-        <w:rPr>
-          <w:rFonts w:ascii="Times New Roman" w:hAnsi="Times New Roman"/>
-          <w:sz w:val="28"/>
-        </w:rPr>
-        <w:t>đồng</w:t>
+          <w:sz w:val="26"/>
+          <w:szCs w:val="26"/>
+        </w:rPr>
+      </w:pPr>
+      <w:r>
+        <w:rPr>
+          <w:rFonts w:ascii="Times New Roman" w:hAnsi="Times New Roman"/>
+          <w:sz w:val="26"/>
+          <w:szCs w:val="26"/>
+        </w:rPr>
+        <w:t>Thu nhậ</w:t>
+      </w:r>
+      <w:r>
+        <w:rPr>
+          <w:rFonts w:ascii="Times New Roman" w:hAnsi="Times New Roman"/>
+          <w:sz w:val="26"/>
+          <w:szCs w:val="26"/>
+        </w:rPr>
+        <w:t>p khác</w:t>
+      </w:r>
+      <w:r>
+        <w:rPr>
+          <w:rFonts w:ascii="Times New Roman" w:hAnsi="Times New Roman"/>
+          <w:sz w:val="26"/>
+          <w:szCs w:val="26"/>
+        </w:rPr>
+        <w:t>:</w:t>
       </w:r>
     </w:p>
     <w:p>
@@ -1140,69 +1581,39 @@
         </w:numPr>
         <w:rPr>
           <w:rFonts w:ascii="Times New Roman" w:hAnsi="Times New Roman"/>
-          <w:sz w:val="28"/>
-        </w:rPr>
-      </w:pPr>
-      <w:r>
-        <w:rPr>
-          <w:rFonts w:ascii="Times New Roman" w:hAnsi="Times New Roman"/>
-          <w:sz w:val="28"/>
-        </w:rPr>
-        <w:t>Chênh lệ</w:t>
-      </w:r>
-      <w:r>
-        <w:rPr>
-          <w:rFonts w:ascii="Times New Roman" w:hAnsi="Times New Roman"/>
-          <w:sz w:val="28"/>
-        </w:rPr>
-        <w:t xml:space="preserve">ch thu – chi         </w:t>
-      </w:r>
-      <w:r>
-        <w:rPr>
-          <w:rFonts w:ascii="Times New Roman" w:hAnsi="Times New Roman"/>
-          <w:sz w:val="28"/>
-        </w:rPr>
-        <w:t xml:space="preserve">  </w:t>
-      </w:r>
-      <w:r>
-        <w:rPr>
-          <w:rFonts w:ascii="Times New Roman" w:hAnsi="Times New Roman"/>
-          <w:sz w:val="28"/>
-        </w:rPr>
-        <w:t>{{loiNhuan}}</w:t>
-      </w:r>
-      <w:r>
-        <w:rPr>
-          <w:rFonts w:ascii="Times New Roman" w:hAnsi="Times New Roman"/>
-          <w:sz w:val="28"/>
-        </w:rPr>
-        <w:t xml:space="preserve">     </w:t>
-      </w:r>
-      <w:r>
-        <w:rPr>
-          <w:rFonts w:ascii="Times New Roman" w:hAnsi="Times New Roman"/>
-          <w:sz w:val="28"/>
-        </w:rPr>
-        <w:t xml:space="preserve">               </w:t>
-      </w:r>
-      <w:r>
-        <w:rPr>
-          <w:rFonts w:ascii="Times New Roman" w:hAnsi="Times New Roman"/>
-          <w:sz w:val="28"/>
+          <w:sz w:val="26"/>
+          <w:szCs w:val="26"/>
+        </w:rPr>
+      </w:pPr>
+      <w:r>
+        <w:rPr>
+          <w:rFonts w:ascii="Times New Roman" w:hAnsi="Times New Roman"/>
+          <w:sz w:val="26"/>
+          <w:szCs w:val="26"/>
+        </w:rPr>
+        <w:t xml:space="preserve">Thu hồi vốn đầu tư phương án:                     {{thuHoiVon}}   </w:t>
+      </w:r>
+      <w:r>
+        <w:rPr>
+          <w:rFonts w:ascii="Times New Roman" w:hAnsi="Times New Roman"/>
+          <w:sz w:val="26"/>
+          <w:szCs w:val="26"/>
+        </w:rPr>
+        <w:t xml:space="preserve"> </w:t>
+      </w:r>
+      <w:r>
+        <w:rPr>
+          <w:rFonts w:ascii="Times New Roman" w:hAnsi="Times New Roman"/>
+          <w:sz w:val="26"/>
+          <w:szCs w:val="26"/>
         </w:rPr>
         <w:t xml:space="preserve">   </w:t>
       </w:r>
       <w:r>
         <w:rPr>
           <w:rFonts w:ascii="Times New Roman" w:hAnsi="Times New Roman"/>
-          <w:sz w:val="28"/>
-        </w:rPr>
-        <w:t xml:space="preserve">  </w:t>
-      </w:r>
-      <w:r>
-        <w:rPr>
-          <w:rFonts w:ascii="Times New Roman" w:hAnsi="Times New Roman"/>
-          <w:sz w:val="28"/>
+          <w:sz w:val="26"/>
+          <w:szCs w:val="26"/>
         </w:rPr>
         <w:t>đồng</w:t>
       </w:r>
@@ -1216,125 +1627,44 @@
         </w:numPr>
         <w:rPr>
           <w:rFonts w:ascii="Times New Roman" w:hAnsi="Times New Roman"/>
-          <w:sz w:val="28"/>
-        </w:rPr>
-      </w:pPr>
-      <w:r>
-        <w:rPr>
-          <w:rFonts w:ascii="Times New Roman" w:hAnsi="Times New Roman"/>
-          <w:sz w:val="28"/>
-        </w:rPr>
-        <w:t>Nguồn trả nợ</w:t>
-      </w:r>
-    </w:p>
-    <w:p>
-      <w:pPr>
-        <w:pStyle w:val="ListParagraph"/>
-        <w:numPr>
-          <w:ilvl w:val="0"/>
-          <w:numId w:val="5"/>
-        </w:numPr>
-        <w:rPr>
-          <w:rFonts w:ascii="Times New Roman" w:hAnsi="Times New Roman"/>
-          <w:sz w:val="28"/>
-        </w:rPr>
-      </w:pPr>
-      <w:r>
-        <w:rPr>
-          <w:rFonts w:ascii="Times New Roman" w:hAnsi="Times New Roman"/>
-          <w:sz w:val="28"/>
-        </w:rPr>
-        <w:lastRenderedPageBreak/>
-        <w:t xml:space="preserve">Từ thu nhập hoạt động của phương án:         </w:t>
-      </w:r>
-      <w:r>
-        <w:rPr>
-          <w:rFonts w:ascii="Times New Roman" w:hAnsi="Times New Roman"/>
-          <w:sz w:val="28"/>
-        </w:rPr>
-        <w:t>{{loiNhuan}}       đồng</w:t>
-      </w:r>
-      <w:r>
-        <w:rPr>
-          <w:rFonts w:ascii="Times New Roman" w:hAnsi="Times New Roman"/>
-          <w:sz w:val="28"/>
-        </w:rPr>
-        <w:t xml:space="preserve">   </w:t>
-      </w:r>
-    </w:p>
-    <w:p>
-      <w:pPr>
-        <w:pStyle w:val="ListParagraph"/>
-        <w:numPr>
-          <w:ilvl w:val="0"/>
-          <w:numId w:val="5"/>
-        </w:numPr>
-        <w:rPr>
-          <w:rFonts w:ascii="Times New Roman" w:hAnsi="Times New Roman"/>
-          <w:sz w:val="28"/>
-        </w:rPr>
-      </w:pPr>
-      <w:r>
-        <w:rPr>
-          <w:rFonts w:ascii="Times New Roman" w:hAnsi="Times New Roman"/>
-          <w:sz w:val="28"/>
-        </w:rPr>
-        <w:t>Thu nhậ</w:t>
-      </w:r>
-      <w:r>
-        <w:rPr>
-          <w:rFonts w:ascii="Times New Roman" w:hAnsi="Times New Roman"/>
-          <w:sz w:val="28"/>
-        </w:rPr>
-        <w:t>p khác</w:t>
-      </w:r>
-      <w:r>
-        <w:rPr>
-          <w:rFonts w:ascii="Times New Roman" w:hAnsi="Times New Roman"/>
-          <w:sz w:val="28"/>
-        </w:rPr>
-        <w:t>:</w:t>
-      </w:r>
-    </w:p>
-    <w:p>
-      <w:pPr>
-        <w:pStyle w:val="ListParagraph"/>
-        <w:numPr>
-          <w:ilvl w:val="0"/>
-          <w:numId w:val="5"/>
-        </w:numPr>
-        <w:rPr>
-          <w:rFonts w:ascii="Times New Roman" w:hAnsi="Times New Roman"/>
-          <w:sz w:val="28"/>
-        </w:rPr>
-      </w:pPr>
-      <w:r>
-        <w:rPr>
-          <w:rFonts w:ascii="Times New Roman" w:hAnsi="Times New Roman"/>
-          <w:sz w:val="28"/>
-        </w:rPr>
-        <w:t xml:space="preserve">Thu hồi vốn đầu tư phương án:                     {{thuHoiVon}}   </w:t>
-      </w:r>
-      <w:r>
-        <w:rPr>
-          <w:rFonts w:ascii="Times New Roman" w:hAnsi="Times New Roman"/>
-          <w:sz w:val="28"/>
-        </w:rPr>
-        <w:t xml:space="preserve"> </w:t>
-      </w:r>
-      <w:r>
-        <w:rPr>
-          <w:rFonts w:ascii="Times New Roman" w:hAnsi="Times New Roman"/>
-          <w:sz w:val="28"/>
-        </w:rPr>
-        <w:t xml:space="preserve">   </w:t>
-      </w:r>
-      <w:r>
-        <w:rPr>
-          <w:rFonts w:ascii="Times New Roman" w:hAnsi="Times New Roman"/>
-          <w:sz w:val="28"/>
-        </w:rPr>
-        <w:t>đồng</w:t>
+          <w:sz w:val="26"/>
+          <w:szCs w:val="26"/>
+        </w:rPr>
+      </w:pPr>
+      <w:r>
+        <w:rPr>
+          <w:rFonts w:ascii="Times New Roman" w:hAnsi="Times New Roman"/>
+          <w:sz w:val="26"/>
+          <w:szCs w:val="26"/>
+        </w:rPr>
+        <w:t>Đánh giá khả năng trả nợ:</w:t>
+      </w:r>
+    </w:p>
+    <w:p>
+      <w:pPr>
+        <w:pStyle w:val="ListParagraph"/>
+        <w:ind w:left="1140"/>
+        <w:rPr>
+          <w:rFonts w:ascii="Times New Roman" w:hAnsi="Times New Roman"/>
+          <w:sz w:val="26"/>
+          <w:szCs w:val="26"/>
+        </w:rPr>
+      </w:pPr>
+      <w:r>
+        <w:rPr>
+          <w:rFonts w:ascii="Times New Roman" w:hAnsi="Times New Roman"/>
+          <w:sz w:val="26"/>
+          <w:szCs w:val="26"/>
+        </w:rPr>
+        <w:t>Khách hàng có hoạt động sản xuất kinh doanh tốt, ổn định, đảm bảo khả năng trả nợ theo đúng thỏa thuận</w:t>
+      </w:r>
+      <w:r>
+        <w:rPr>
+          <w:rFonts w:ascii="Times New Roman" w:hAnsi="Times New Roman"/>
+          <w:sz w:val="26"/>
+          <w:szCs w:val="26"/>
+        </w:rPr>
+        <w:t>.</w:t>
       </w:r>
     </w:p>
     <w:p>
@@ -1346,15 +1676,17 @@
         </w:numPr>
         <w:rPr>
           <w:rFonts w:ascii="Times New Roman" w:hAnsi="Times New Roman"/>
-          <w:sz w:val="28"/>
-        </w:rPr>
-      </w:pPr>
-      <w:r>
-        <w:rPr>
-          <w:rFonts w:ascii="Times New Roman" w:hAnsi="Times New Roman"/>
-          <w:sz w:val="28"/>
-        </w:rPr>
-        <w:t>Đánh giá khả năng trả nợ:</w:t>
+          <w:sz w:val="26"/>
+          <w:szCs w:val="26"/>
+        </w:rPr>
+      </w:pPr>
+      <w:r>
+        <w:rPr>
+          <w:rFonts w:ascii="Times New Roman" w:hAnsi="Times New Roman"/>
+          <w:sz w:val="26"/>
+          <w:szCs w:val="26"/>
+        </w:rPr>
+        <w:t>Đề nghị giải ngân.</w:t>
       </w:r>
     </w:p>
     <w:p>
@@ -1363,22 +1695,57 @@
         <w:ind w:left="1140"/>
         <w:rPr>
           <w:rFonts w:ascii="Times New Roman" w:hAnsi="Times New Roman"/>
-          <w:sz w:val="28"/>
-        </w:rPr>
-      </w:pPr>
-      <w:r>
-        <w:rPr>
-          <w:rFonts w:ascii="Times New Roman" w:hAnsi="Times New Roman"/>
-          <w:sz w:val="28"/>
-        </w:rPr>
-        <w:t>Khách hàng có hoạt động sản xuất kinh doanh tốt, ổn định, đảm bảo khả năng trả nợ theo đúng thỏa thuận</w:t>
-      </w:r>
-      <w:r>
-        <w:rPr>
-          <w:rFonts w:ascii="Times New Roman" w:hAnsi="Times New Roman"/>
-          <w:sz w:val="28"/>
-        </w:rPr>
-        <w:t>.</w:t>
+          <w:sz w:val="26"/>
+          <w:szCs w:val="26"/>
+        </w:rPr>
+      </w:pPr>
+      <w:r>
+        <w:rPr>
+          <w:rFonts w:ascii="Times New Roman" w:hAnsi="Times New Roman"/>
+          <w:sz w:val="26"/>
+          <w:szCs w:val="26"/>
+        </w:rPr>
+        <w:t>Tôi: {{canBoTDVT}}</w:t>
+      </w:r>
+      <w:r>
+        <w:rPr>
+          <w:rFonts w:ascii="Times New Roman" w:hAnsi="Times New Roman"/>
+          <w:sz w:val="26"/>
+          <w:szCs w:val="26"/>
+        </w:rPr>
+        <w:t xml:space="preserve"> </w:t>
+      </w:r>
+      <w:r>
+        <w:rPr>
+          <w:rFonts w:ascii="Times New Roman" w:hAnsi="Times New Roman"/>
+          <w:sz w:val="26"/>
+          <w:szCs w:val="26"/>
+        </w:rPr>
+        <w:t>– Cán bộ tín dụng, đề nghị giải ngân tiền vay theo mục 2, phần nhận nợ Giấy đề nghị này.</w:t>
+      </w:r>
+    </w:p>
+    <w:p>
+      <w:pPr>
+        <w:pStyle w:val="ListParagraph"/>
+        <w:numPr>
+          <w:ilvl w:val="0"/>
+          <w:numId w:val="1"/>
+        </w:numPr>
+        <w:rPr>
+          <w:rFonts w:ascii="Times New Roman" w:hAnsi="Times New Roman"/>
+          <w:b/>
+          <w:sz w:val="26"/>
+          <w:szCs w:val="26"/>
+        </w:rPr>
+      </w:pPr>
+      <w:r>
+        <w:rPr>
+          <w:rFonts w:ascii="Times New Roman" w:hAnsi="Times New Roman"/>
+          <w:b/>
+          <w:sz w:val="26"/>
+          <w:szCs w:val="26"/>
+        </w:rPr>
+        <w:t>NHẬN NỢ</w:t>
       </w:r>
     </w:p>
     <w:p>
@@ -1390,68 +1757,49 @@
         </w:numPr>
         <w:rPr>
           <w:rFonts w:ascii="Times New Roman" w:hAnsi="Times New Roman"/>
-          <w:sz w:val="28"/>
-        </w:rPr>
-      </w:pPr>
-      <w:r>
-        <w:rPr>
-          <w:rFonts w:ascii="Times New Roman" w:hAnsi="Times New Roman"/>
-          <w:sz w:val="28"/>
-        </w:rPr>
-        <w:t>Đề nghị giải ngân.</w:t>
-      </w:r>
-    </w:p>
-    <w:p>
-      <w:pPr>
-        <w:pStyle w:val="ListParagraph"/>
-        <w:ind w:left="1140"/>
-        <w:rPr>
-          <w:rFonts w:ascii="Times New Roman" w:hAnsi="Times New Roman"/>
-          <w:sz w:val="28"/>
-        </w:rPr>
-      </w:pPr>
-      <w:r>
-        <w:rPr>
-          <w:rFonts w:ascii="Times New Roman" w:hAnsi="Times New Roman"/>
-          <w:sz w:val="28"/>
-        </w:rPr>
-        <w:t>Tôi: {{canBoTDVT}}</w:t>
-      </w:r>
-      <w:r>
-        <w:rPr>
-          <w:rFonts w:ascii="Times New Roman" w:hAnsi="Times New Roman"/>
-          <w:sz w:val="28"/>
-        </w:rPr>
-        <w:t xml:space="preserve"> </w:t>
-      </w:r>
-      <w:r>
-        <w:rPr>
-          <w:rFonts w:ascii="Times New Roman" w:hAnsi="Times New Roman"/>
-          <w:sz w:val="28"/>
-        </w:rPr>
-        <w:t>– Cán bộ tín dụng, đề nghị giải ngân tiền vay theo mục 2, phần nhận nợ Giấy đề nghị này.</w:t>
-      </w:r>
-    </w:p>
-    <w:p>
-      <w:pPr>
-        <w:pStyle w:val="ListParagraph"/>
-        <w:numPr>
-          <w:ilvl w:val="0"/>
-          <w:numId w:val="1"/>
-        </w:numPr>
-        <w:rPr>
-          <w:rFonts w:ascii="Times New Roman" w:hAnsi="Times New Roman"/>
-          <w:b/>
-          <w:sz w:val="28"/>
-        </w:rPr>
-      </w:pPr>
-      <w:r>
-        <w:rPr>
-          <w:rFonts w:ascii="Times New Roman" w:hAnsi="Times New Roman"/>
-          <w:b/>
-          <w:sz w:val="28"/>
-        </w:rPr>
-        <w:t>NHẬN NỢ</w:t>
+          <w:sz w:val="26"/>
+          <w:szCs w:val="26"/>
+        </w:rPr>
+      </w:pPr>
+      <w:r>
+        <w:rPr>
+          <w:rFonts w:ascii="Times New Roman" w:hAnsi="Times New Roman"/>
+          <w:sz w:val="26"/>
+          <w:szCs w:val="26"/>
+        </w:rPr>
+        <w:t xml:space="preserve">Hợp đồng </w:t>
+      </w:r>
+      <w:r>
+        <w:rPr>
+          <w:rFonts w:ascii="Times New Roman" w:hAnsi="Times New Roman"/>
+          <w:sz w:val="26"/>
+          <w:szCs w:val="26"/>
+        </w:rPr>
+        <w:t>tín dụng</w:t>
+      </w:r>
+      <w:r>
+        <w:rPr>
+          <w:rFonts w:ascii="Times New Roman" w:hAnsi="Times New Roman"/>
+          <w:sz w:val="26"/>
+          <w:szCs w:val="26"/>
+        </w:rPr>
+        <w:t xml:space="preserve"> số: {{shdtd}}</w:t>
+      </w:r>
+      <w:r>
+        <w:rPr>
+          <w:rFonts w:ascii="Times New Roman" w:hAnsi="Times New Roman"/>
+          <w:sz w:val="26"/>
+          <w:szCs w:val="26"/>
+        </w:rPr>
+        <w:t>/HĐTD</w:t>
+      </w:r>
+      <w:r>
+        <w:rPr>
+          <w:rFonts w:ascii="Times New Roman" w:hAnsi="Times New Roman"/>
+          <w:sz w:val="26"/>
+          <w:szCs w:val="26"/>
+        </w:rPr>
+        <w:t xml:space="preserve"> ký ngày {{day}}/{{month}}/{{year}}.</w:t>
       </w:r>
     </w:p>
     <w:p>
@@ -1463,31 +1811,73 @@
         </w:numPr>
         <w:rPr>
           <w:rFonts w:ascii="Times New Roman" w:hAnsi="Times New Roman"/>
-          <w:sz w:val="28"/>
-        </w:rPr>
-      </w:pPr>
-      <w:r>
-        <w:rPr>
-          <w:rFonts w:ascii="Times New Roman" w:hAnsi="Times New Roman"/>
-          <w:sz w:val="28"/>
-        </w:rPr>
-        <w:t>Hợp đồng cho vay số: {{shdtd}}</w:t>
-      </w:r>
-      <w:r>
-        <w:rPr>
-          <w:rFonts w:ascii="Times New Roman" w:hAnsi="Times New Roman"/>
-          <w:sz w:val="28"/>
-        </w:rPr>
-        <w:t>/HĐTD</w:t>
-      </w:r>
-      <w:bookmarkStart w:id="0" w:name="_GoBack"/>
-      <w:bookmarkEnd w:id="0"/>
-      <w:r>
-        <w:rPr>
-          <w:rFonts w:ascii="Times New Roman" w:hAnsi="Times New Roman"/>
-          <w:sz w:val="28"/>
-        </w:rPr>
-        <w:t xml:space="preserve"> ký ngày {{day}}/{{month}}/{{year}}.</w:t>
+          <w:sz w:val="26"/>
+          <w:szCs w:val="26"/>
+        </w:rPr>
+      </w:pPr>
+      <w:r>
+        <w:rPr>
+          <w:rFonts w:ascii="Times New Roman" w:hAnsi="Times New Roman"/>
+          <w:sz w:val="26"/>
+          <w:szCs w:val="26"/>
+        </w:rPr>
+        <w:t>{{tienGNN}}</w:t>
+      </w:r>
+      <w:r>
+        <w:rPr>
+          <w:rFonts w:ascii="Times New Roman" w:hAnsi="Times New Roman"/>
+          <w:sz w:val="26"/>
+          <w:szCs w:val="26"/>
+        </w:rPr>
+        <w:t>.</w:t>
+      </w:r>
+    </w:p>
+    <w:p>
+      <w:pPr>
+        <w:pStyle w:val="ListParagraph"/>
+        <w:ind w:left="1140"/>
+        <w:rPr>
+          <w:rFonts w:ascii="Times New Roman" w:hAnsi="Times New Roman"/>
+          <w:i/>
+          <w:sz w:val="26"/>
+          <w:szCs w:val="26"/>
+        </w:rPr>
+      </w:pPr>
+      <w:r>
+        <w:rPr>
+          <w:rFonts w:ascii="Times New Roman" w:hAnsi="Times New Roman"/>
+          <w:i/>
+          <w:sz w:val="26"/>
+          <w:szCs w:val="26"/>
+        </w:rPr>
+        <w:t>(</w:t>
+      </w:r>
+      <w:r>
+        <w:rPr>
+          <w:rFonts w:ascii="Times New Roman" w:hAnsi="Times New Roman"/>
+          <w:i/>
+          <w:sz w:val="26"/>
+          <w:szCs w:val="26"/>
+        </w:rPr>
+        <w:t>Bằng chữ</w:t>
+      </w:r>
+      <w:r>
+        <w:rPr>
+          <w:rFonts w:ascii="Times New Roman" w:hAnsi="Times New Roman"/>
+          <w:i/>
+          <w:sz w:val="26"/>
+          <w:szCs w:val="26"/>
+        </w:rPr>
+        <w:t>: {{tc}})</w:t>
+      </w:r>
+      <w:r>
+        <w:rPr>
+          <w:rFonts w:ascii="Times New Roman" w:hAnsi="Times New Roman"/>
+          <w:i/>
+          <w:sz w:val="26"/>
+          <w:szCs w:val="26"/>
+        </w:rPr>
+        <w:t>.</w:t>
       </w:r>
     </w:p>
     <w:p>
@@ -1499,15 +1889,41 @@
         </w:numPr>
         <w:rPr>
           <w:rFonts w:ascii="Times New Roman" w:hAnsi="Times New Roman"/>
-          <w:sz w:val="28"/>
-        </w:rPr>
-      </w:pPr>
-      <w:r>
-        <w:rPr>
-          <w:rFonts w:ascii="Times New Roman" w:hAnsi="Times New Roman"/>
-          <w:sz w:val="28"/>
-        </w:rPr>
-        <w:t>Tổng tiền vay: {{tienso}} đồng.</w:t>
+          <w:sz w:val="26"/>
+          <w:szCs w:val="26"/>
+        </w:rPr>
+      </w:pPr>
+      <w:r>
+        <w:rPr>
+          <w:rFonts w:ascii="Times New Roman" w:hAnsi="Times New Roman"/>
+          <w:sz w:val="26"/>
+          <w:szCs w:val="26"/>
+        </w:rPr>
+        <w:t xml:space="preserve">Dư nợ trước nhận nợ  </w:t>
+      </w:r>
+      <w:r>
+        <w:rPr>
+          <w:rFonts w:ascii="Times New Roman" w:hAnsi="Times New Roman"/>
+          <w:sz w:val="26"/>
+          <w:szCs w:val="26"/>
+        </w:rPr>
+        <w:t xml:space="preserve">                     </w:t>
+      </w:r>
+      <w:r>
+        <w:rPr>
+          <w:rFonts w:ascii="Times New Roman" w:hAnsi="Times New Roman"/>
+          <w:sz w:val="26"/>
+          <w:szCs w:val="26"/>
+        </w:rPr>
+        <w:t>{{duNoTruoc}}</w:t>
+      </w:r>
+      <w:r>
+        <w:rPr>
+          <w:rFonts w:ascii="Times New Roman" w:hAnsi="Times New Roman"/>
+          <w:sz w:val="26"/>
+          <w:szCs w:val="26"/>
+        </w:rPr>
+        <w:t xml:space="preserve"> đồng.</w:t>
       </w:r>
     </w:p>
     <w:p>
@@ -1516,15 +1932,37 @@
         <w:ind w:left="1140"/>
         <w:rPr>
           <w:rFonts w:ascii="Times New Roman" w:hAnsi="Times New Roman"/>
-          <w:sz w:val="28"/>
-        </w:rPr>
-      </w:pPr>
-      <w:r>
-        <w:rPr>
-          <w:rFonts w:ascii="Times New Roman" w:hAnsi="Times New Roman"/>
-          <w:sz w:val="28"/>
-        </w:rPr>
-        <w:t>Bằng chữ: {{tc}}.</w:t>
+          <w:i/>
+          <w:sz w:val="26"/>
+          <w:szCs w:val="26"/>
+        </w:rPr>
+      </w:pPr>
+      <w:r>
+        <w:rPr>
+          <w:rFonts w:ascii="Times New Roman" w:hAnsi="Times New Roman"/>
+          <w:i/>
+          <w:sz w:val="26"/>
+          <w:szCs w:val="26"/>
+        </w:rPr>
+        <w:t>(</w:t>
+      </w:r>
+      <w:r>
+        <w:rPr>
+          <w:rFonts w:ascii="Times New Roman" w:hAnsi="Times New Roman"/>
+          <w:i/>
+          <w:sz w:val="26"/>
+          <w:szCs w:val="26"/>
+        </w:rPr>
+        <w:t>Bằng chữ</w:t>
+      </w:r>
+      <w:r>
+        <w:rPr>
+          <w:rFonts w:ascii="Times New Roman" w:hAnsi="Times New Roman"/>
+          <w:i/>
+          <w:sz w:val="26"/>
+          <w:szCs w:val="26"/>
+        </w:rPr>
+        <w:t>: {{duNoTruocChu}})</w:t>
       </w:r>
     </w:p>
     <w:p>
@@ -1536,29 +1974,33 @@
         </w:numPr>
         <w:rPr>
           <w:rFonts w:ascii="Times New Roman" w:hAnsi="Times New Roman"/>
-          <w:sz w:val="28"/>
-        </w:rPr>
-      </w:pPr>
-      <w:r>
-        <w:rPr>
-          <w:rFonts w:ascii="Times New Roman" w:hAnsi="Times New Roman"/>
-          <w:sz w:val="28"/>
-        </w:rPr>
-        <w:t xml:space="preserve">Dư nợ trước nhận nợ  </w:t>
-      </w:r>
-      <w:r>
-        <w:rPr>
-          <w:rFonts w:ascii="Times New Roman" w:hAnsi="Times New Roman"/>
-          <w:sz w:val="28"/>
-        </w:rPr>
-        <w:t xml:space="preserve">                     </w:t>
-      </w:r>
-      <w:r>
-        <w:rPr>
-          <w:rFonts w:ascii="Times New Roman" w:hAnsi="Times New Roman"/>
-          <w:sz w:val="28"/>
-        </w:rPr>
-        <w:t>0 đồng.</w:t>
+          <w:sz w:val="26"/>
+          <w:szCs w:val="26"/>
+        </w:rPr>
+      </w:pPr>
+      <w:r>
+        <w:rPr>
+          <w:rFonts w:ascii="Times New Roman" w:hAnsi="Times New Roman"/>
+          <w:sz w:val="26"/>
+          <w:szCs w:val="26"/>
+        </w:rPr>
+        <w:t>Số tiền nhận nợ lầ</w:t>
+      </w:r>
+      <w:r>
+        <w:rPr>
+          <w:rFonts w:ascii="Times New Roman" w:hAnsi="Times New Roman"/>
+          <w:sz w:val="26"/>
+          <w:szCs w:val="26"/>
+        </w:rPr>
+        <w:t>n này:  {{tienVayLai}}</w:t>
+      </w:r>
+      <w:r>
+        <w:rPr>
+          <w:rFonts w:ascii="Times New Roman" w:hAnsi="Times New Roman"/>
+          <w:sz w:val="26"/>
+          <w:szCs w:val="26"/>
+        </w:rPr>
+        <w:t xml:space="preserve"> đồng</w:t>
       </w:r>
     </w:p>
     <w:p>
@@ -1567,15 +2009,35 @@
         <w:ind w:left="1140"/>
         <w:rPr>
           <w:rFonts w:ascii="Times New Roman" w:hAnsi="Times New Roman"/>
-          <w:sz w:val="28"/>
-        </w:rPr>
-      </w:pPr>
-      <w:r>
-        <w:rPr>
-          <w:rFonts w:ascii="Times New Roman" w:hAnsi="Times New Roman"/>
-          <w:sz w:val="28"/>
-        </w:rPr>
-        <w:t>Bằng chữ: không</w:t>
+          <w:sz w:val="26"/>
+          <w:szCs w:val="26"/>
+        </w:rPr>
+      </w:pPr>
+      <w:r>
+        <w:rPr>
+          <w:rFonts w:ascii="Times New Roman" w:hAnsi="Times New Roman"/>
+          <w:sz w:val="26"/>
+          <w:szCs w:val="26"/>
+        </w:rPr>
+        <w:t>(</w:t>
+      </w:r>
+      <w:r>
+        <w:rPr>
+          <w:rFonts w:ascii="Times New Roman" w:hAnsi="Times New Roman"/>
+          <w:i/>
+          <w:sz w:val="26"/>
+          <w:szCs w:val="26"/>
+        </w:rPr>
+        <w:t>Bằng chữ</w:t>
+      </w:r>
+      <w:r>
+        <w:rPr>
+          <w:rFonts w:ascii="Times New Roman" w:hAnsi="Times New Roman"/>
+          <w:i/>
+          <w:sz w:val="26"/>
+          <w:szCs w:val="26"/>
+        </w:rPr>
+        <w:t>: {{tienVayLaiChu}})</w:t>
       </w:r>
     </w:p>
     <w:p>
@@ -1587,15 +2049,33 @@
         </w:numPr>
         <w:rPr>
           <w:rFonts w:ascii="Times New Roman" w:hAnsi="Times New Roman"/>
-          <w:sz w:val="28"/>
-        </w:rPr>
-      </w:pPr>
-      <w:r>
-        <w:rPr>
-          <w:rFonts w:ascii="Times New Roman" w:hAnsi="Times New Roman"/>
-          <w:sz w:val="28"/>
-        </w:rPr>
-        <w:t>Số tiền nhận nợ lần này: {{tienso}} đồng</w:t>
+          <w:sz w:val="26"/>
+          <w:szCs w:val="26"/>
+        </w:rPr>
+      </w:pPr>
+      <w:r>
+        <w:rPr>
+          <w:rFonts w:ascii="Times New Roman" w:hAnsi="Times New Roman"/>
+          <w:sz w:val="26"/>
+          <w:szCs w:val="26"/>
+        </w:rPr>
+        <w:t>Dư nợ sau nhận nợ</w:t>
+      </w:r>
+      <w:r>
+        <w:rPr>
+          <w:rFonts w:ascii="Times New Roman" w:hAnsi="Times New Roman"/>
+          <w:sz w:val="26"/>
+          <w:szCs w:val="26"/>
+        </w:rPr>
+        <w:t>: {{duNoSau}}</w:t>
+      </w:r>
+      <w:r>
+        <w:rPr>
+          <w:rFonts w:ascii="Times New Roman" w:hAnsi="Times New Roman"/>
+          <w:sz w:val="26"/>
+          <w:szCs w:val="26"/>
+        </w:rPr>
+        <w:t xml:space="preserve"> đồng.</w:t>
       </w:r>
     </w:p>
     <w:p>
@@ -1604,15 +2084,19 @@
         <w:ind w:left="1140"/>
         <w:rPr>
           <w:rFonts w:ascii="Times New Roman" w:hAnsi="Times New Roman"/>
-          <w:sz w:val="28"/>
-        </w:rPr>
-      </w:pPr>
-      <w:r>
-        <w:rPr>
-          <w:rFonts w:ascii="Times New Roman" w:hAnsi="Times New Roman"/>
-          <w:sz w:val="28"/>
-        </w:rPr>
-        <w:t>Bằng chữ: {{tc}}.</w:t>
+          <w:i/>
+          <w:sz w:val="26"/>
+          <w:szCs w:val="26"/>
+        </w:rPr>
+      </w:pPr>
+      <w:r>
+        <w:rPr>
+          <w:rFonts w:ascii="Times New Roman" w:hAnsi="Times New Roman"/>
+          <w:i/>
+          <w:sz w:val="26"/>
+          <w:szCs w:val="26"/>
+        </w:rPr>
+        <w:t>(Bằng chữ: {{duNoSauChu}})</w:t>
       </w:r>
     </w:p>
     <w:p>
@@ -1624,15 +2108,25 @@
         </w:numPr>
         <w:rPr>
           <w:rFonts w:ascii="Times New Roman" w:hAnsi="Times New Roman"/>
-          <w:sz w:val="28"/>
-        </w:rPr>
-      </w:pPr>
-      <w:r>
-        <w:rPr>
-          <w:rFonts w:ascii="Times New Roman" w:hAnsi="Times New Roman"/>
-          <w:sz w:val="28"/>
-        </w:rPr>
-        <w:t>Dư nợ sau nhận nợ: {{tienso}} đồng.</w:t>
+          <w:sz w:val="26"/>
+          <w:szCs w:val="26"/>
+        </w:rPr>
+      </w:pPr>
+      <w:r>
+        <w:rPr>
+          <w:rFonts w:ascii="Times New Roman" w:hAnsi="Times New Roman"/>
+          <w:sz w:val="26"/>
+          <w:szCs w:val="26"/>
+        </w:rPr>
+        <w:t xml:space="preserve">Thời hạn vay: </w:t>
+      </w:r>
+      <w:r>
+        <w:rPr>
+          <w:rFonts w:ascii="Times New Roman" w:hAnsi="Times New Roman"/>
+          <w:sz w:val="26"/>
+          <w:szCs w:val="26"/>
+        </w:rPr>
+        <w:t>{{thv}} năm.</w:t>
       </w:r>
     </w:p>
     <w:p>
@@ -1644,22 +2138,17 @@
         </w:numPr>
         <w:rPr>
           <w:rFonts w:ascii="Times New Roman" w:hAnsi="Times New Roman"/>
-          <w:sz w:val="28"/>
-        </w:rPr>
-      </w:pPr>
-      <w:r>
-        <w:rPr>
-          <w:rFonts w:ascii="Times New Roman" w:hAnsi="Times New Roman"/>
-          <w:sz w:val="28"/>
-        </w:rPr>
-        <w:t xml:space="preserve">Thời hạn vay: </w:t>
-      </w:r>
-      <w:r>
-        <w:rPr>
-          <w:rFonts w:ascii="Times New Roman" w:hAnsi="Times New Roman"/>
-          <w:sz w:val="28"/>
-        </w:rPr>
-        <w:t>{{thv}} năm.</w:t>
+          <w:sz w:val="26"/>
+          <w:szCs w:val="26"/>
+        </w:rPr>
+      </w:pPr>
+      <w:r>
+        <w:rPr>
+          <w:rFonts w:ascii="Times New Roman" w:hAnsi="Times New Roman"/>
+          <w:sz w:val="26"/>
+          <w:szCs w:val="26"/>
+        </w:rPr>
+        <w:t>Lãi suất cho vay lần này là {{ls}}. Lãi suất quá hạn: 150%. Lãi suất chậm trả lãi : 9%/năm.</w:t>
       </w:r>
     </w:p>
     <w:p>
@@ -1671,15 +2160,17 @@
         </w:numPr>
         <w:rPr>
           <w:rFonts w:ascii="Times New Roman" w:hAnsi="Times New Roman"/>
-          <w:sz w:val="28"/>
-        </w:rPr>
-      </w:pPr>
-      <w:r>
-        <w:rPr>
-          <w:rFonts w:ascii="Times New Roman" w:hAnsi="Times New Roman"/>
-          <w:sz w:val="28"/>
-        </w:rPr>
-        <w:t>Lãi suất cho vay lần này là {{ls}}. Lãi suất quá hạn: 150%. Lãi suất chậm trả lãi : 9%/năm.</w:t>
+          <w:sz w:val="26"/>
+          <w:szCs w:val="26"/>
+        </w:rPr>
+      </w:pPr>
+      <w:r>
+        <w:rPr>
+          <w:rFonts w:ascii="Times New Roman" w:hAnsi="Times New Roman"/>
+          <w:sz w:val="26"/>
+          <w:szCs w:val="26"/>
+        </w:rPr>
+        <w:t>Định kỳ trả lãi tiền vay: Trả lãi tiền vay theo thỏa thuận tại hợp đồng cho vay.</w:t>
       </w:r>
     </w:p>
     <w:p>
@@ -1691,40 +2182,23 @@
         </w:numPr>
         <w:rPr>
           <w:rFonts w:ascii="Times New Roman" w:hAnsi="Times New Roman"/>
-          <w:sz w:val="28"/>
-        </w:rPr>
-      </w:pPr>
-      <w:r>
-        <w:rPr>
-          <w:rFonts w:ascii="Times New Roman" w:hAnsi="Times New Roman"/>
-          <w:sz w:val="28"/>
-        </w:rPr>
-        <w:t>Định kỳ trả lãi tiền vay: Trả lãi tiền vay theo thỏa thuận tại hợp đồng cho vay.</w:t>
-      </w:r>
-    </w:p>
-    <w:p>
-      <w:pPr>
-        <w:pStyle w:val="ListParagraph"/>
-        <w:numPr>
-          <w:ilvl w:val="1"/>
-          <w:numId w:val="1"/>
-        </w:numPr>
-        <w:rPr>
-          <w:rFonts w:ascii="Times New Roman" w:hAnsi="Times New Roman"/>
-          <w:sz w:val="28"/>
-        </w:rPr>
-      </w:pPr>
-      <w:r>
-        <w:rPr>
-          <w:rFonts w:ascii="Times New Roman" w:hAnsi="Times New Roman"/>
-          <w:sz w:val="28"/>
+          <w:sz w:val="26"/>
+          <w:szCs w:val="26"/>
+        </w:rPr>
+      </w:pPr>
+      <w:r>
+        <w:rPr>
+          <w:rFonts w:ascii="Times New Roman" w:hAnsi="Times New Roman"/>
+          <w:sz w:val="26"/>
+          <w:szCs w:val="26"/>
         </w:rPr>
         <w:t>Phương thức giả</w:t>
       </w:r>
       <w:r>
         <w:rPr>
           <w:rFonts w:ascii="Times New Roman" w:hAnsi="Times New Roman"/>
-          <w:sz w:val="28"/>
+          <w:sz w:val="26"/>
+          <w:szCs w:val="26"/>
         </w:rPr>
         <w:t>i ngân: {{nguoiChuyenKhoan}}</w:t>
       </w:r>
@@ -1734,13 +2208,15 @@
         <w:ind w:left="720"/>
         <w:rPr>
           <w:rFonts w:ascii="Times New Roman" w:hAnsi="Times New Roman"/>
-          <w:sz w:val="28"/>
-        </w:rPr>
-      </w:pPr>
-      <w:r>
-        <w:rPr>
-          <w:rFonts w:ascii="Times New Roman" w:hAnsi="Times New Roman"/>
-          <w:sz w:val="28"/>
+          <w:sz w:val="26"/>
+          <w:szCs w:val="26"/>
+        </w:rPr>
+      </w:pPr>
+      <w:r>
+        <w:rPr>
+          <w:rFonts w:ascii="Times New Roman" w:hAnsi="Times New Roman"/>
+          <w:sz w:val="26"/>
+          <w:szCs w:val="26"/>
         </w:rPr>
         <w:t>Báo cáo đề nghị giải ngân kiêm giấy nhận nợ được thành lập thành 02 bản có giá trị pháp lý như nhau, mỗi bên giữ 01 bản.</w:t>
       </w:r>
@@ -1751,6 +2227,7 @@
           <w:rFonts w:ascii="Times New Roman" w:hAnsi="Times New Roman"/>
           <w:b/>
           <w:sz w:val="26"/>
+          <w:szCs w:val="26"/>
         </w:rPr>
       </w:pPr>
       <w:r>
@@ -1758,6 +2235,7 @@
           <w:rFonts w:ascii="Times New Roman" w:hAnsi="Times New Roman"/>
           <w:b/>
           <w:sz w:val="26"/>
+          <w:szCs w:val="26"/>
         </w:rPr>
         <w:t>Người nhận nợ</w:t>
       </w:r>
@@ -1766,6 +2244,7 @@
           <w:rFonts w:ascii="Times New Roman" w:hAnsi="Times New Roman"/>
           <w:b/>
           <w:sz w:val="26"/>
+          <w:szCs w:val="26"/>
         </w:rPr>
         <w:tab/>
       </w:r>
@@ -1774,6 +2253,7 @@
           <w:rFonts w:ascii="Times New Roman" w:hAnsi="Times New Roman"/>
           <w:b/>
           <w:sz w:val="26"/>
+          <w:szCs w:val="26"/>
         </w:rPr>
         <w:t xml:space="preserve">   </w:t>
       </w:r>
@@ -1782,236 +2262,269 @@
           <w:rFonts w:ascii="Times New Roman" w:hAnsi="Times New Roman"/>
           <w:b/>
           <w:sz w:val="26"/>
-        </w:rPr>
-        <w:t>Cán bộ tín dụng</w:t>
+          <w:szCs w:val="26"/>
+        </w:rPr>
+        <w:t>Cán bộ</w:t>
       </w:r>
       <w:r>
         <w:rPr>
           <w:rFonts w:ascii="Times New Roman" w:hAnsi="Times New Roman"/>
           <w:b/>
           <w:sz w:val="26"/>
+          <w:szCs w:val="26"/>
+        </w:rPr>
+        <w:t xml:space="preserve"> thẩm định</w:t>
+      </w:r>
+      <w:bookmarkStart w:id="0" w:name="_GoBack"/>
+      <w:bookmarkEnd w:id="0"/>
+      <w:r>
+        <w:rPr>
+          <w:rFonts w:ascii="Times New Roman" w:hAnsi="Times New Roman"/>
+          <w:b/>
+          <w:sz w:val="26"/>
+          <w:szCs w:val="26"/>
         </w:rPr>
         <w:tab/>
+        <w:t xml:space="preserve">      </w:t>
       </w:r>
       <w:r>
         <w:rPr>
           <w:rFonts w:ascii="Times New Roman" w:hAnsi="Times New Roman"/>
           <w:b/>
           <w:sz w:val="26"/>
-        </w:rPr>
-        <w:t xml:space="preserve">      </w:t>
+          <w:szCs w:val="26"/>
+        </w:rPr>
+        <w:t xml:space="preserve">   </w:t>
       </w:r>
       <w:r>
         <w:rPr>
           <w:rFonts w:ascii="Times New Roman" w:hAnsi="Times New Roman"/>
           <w:b/>
           <w:sz w:val="26"/>
-        </w:rPr>
-        <w:t xml:space="preserve">   </w:t>
+          <w:szCs w:val="26"/>
+        </w:rPr>
+        <w:t>Kế</w:t>
       </w:r>
       <w:r>
         <w:rPr>
           <w:rFonts w:ascii="Times New Roman" w:hAnsi="Times New Roman"/>
           <w:b/>
           <w:sz w:val="26"/>
-        </w:rPr>
-        <w:t>Kế</w:t>
+          <w:szCs w:val="26"/>
+        </w:rPr>
+        <w:t xml:space="preserve"> </w:t>
       </w:r>
       <w:r>
         <w:rPr>
           <w:rFonts w:ascii="Times New Roman" w:hAnsi="Times New Roman"/>
           <w:b/>
           <w:sz w:val="26"/>
-        </w:rPr>
-        <w:t xml:space="preserve"> </w:t>
+          <w:szCs w:val="26"/>
+        </w:rPr>
+        <w:t>toán</w:t>
       </w:r>
       <w:r>
         <w:rPr>
           <w:rFonts w:ascii="Times New Roman" w:hAnsi="Times New Roman"/>
           <w:b/>
           <w:sz w:val="26"/>
-        </w:rPr>
-        <w:t>toán</w:t>
+          <w:szCs w:val="26"/>
+        </w:rPr>
+        <w:tab/>
+        <w:t xml:space="preserve">          </w:t>
       </w:r>
       <w:r>
         <w:rPr>
           <w:rFonts w:ascii="Times New Roman" w:hAnsi="Times New Roman"/>
           <w:b/>
           <w:sz w:val="26"/>
+          <w:szCs w:val="26"/>
+        </w:rPr>
+        <w:t xml:space="preserve">    {{nddpl}}                   </w:t>
+      </w:r>
+    </w:p>
+    <w:p>
+      <w:pPr>
+        <w:rPr>
+          <w:rFonts w:ascii="Times New Roman" w:hAnsi="Times New Roman"/>
+          <w:b/>
+          <w:sz w:val="26"/>
+          <w:szCs w:val="26"/>
+        </w:rPr>
+      </w:pPr>
+      <w:r>
+        <w:rPr>
+          <w:rFonts w:ascii="Times New Roman" w:hAnsi="Times New Roman"/>
+          <w:i/>
+          <w:sz w:val="26"/>
+          <w:szCs w:val="26"/>
+        </w:rPr>
+        <w:t>(Ký, ghi rõ họ tên)</w:t>
+      </w:r>
+      <w:r>
+        <w:rPr>
+          <w:rFonts w:ascii="Times New Roman" w:hAnsi="Times New Roman"/>
+          <w:i/>
+          <w:sz w:val="26"/>
+          <w:szCs w:val="26"/>
+        </w:rPr>
+        <w:t xml:space="preserve">     </w:t>
+      </w:r>
+      <w:r>
+        <w:rPr>
+          <w:rFonts w:ascii="Times New Roman" w:hAnsi="Times New Roman"/>
+          <w:i/>
+          <w:sz w:val="26"/>
+          <w:szCs w:val="26"/>
+        </w:rPr>
+        <w:t>(Ký, ghi rõ họ tên)</w:t>
+      </w:r>
+      <w:r>
+        <w:rPr>
+          <w:rFonts w:ascii="Times New Roman" w:hAnsi="Times New Roman"/>
+          <w:i/>
+          <w:sz w:val="26"/>
+          <w:szCs w:val="26"/>
         </w:rPr>
         <w:tab/>
       </w:r>
       <w:r>
         <w:rPr>
           <w:rFonts w:ascii="Times New Roman" w:hAnsi="Times New Roman"/>
+          <w:i/>
+          <w:sz w:val="26"/>
+          <w:szCs w:val="26"/>
+        </w:rPr>
+        <w:t xml:space="preserve">  </w:t>
+      </w:r>
+      <w:r>
+        <w:rPr>
+          <w:rFonts w:ascii="Times New Roman" w:hAnsi="Times New Roman"/>
+          <w:i/>
+          <w:sz w:val="26"/>
+          <w:szCs w:val="26"/>
+        </w:rPr>
+        <w:t>(Ký, ghi rõ họ tên)</w:t>
+      </w:r>
+      <w:r>
+        <w:rPr>
+          <w:rFonts w:ascii="Times New Roman" w:hAnsi="Times New Roman"/>
+          <w:i/>
+          <w:sz w:val="26"/>
+          <w:szCs w:val="26"/>
+        </w:rPr>
+        <w:tab/>
+      </w:r>
+      <w:r>
+        <w:rPr>
+          <w:rFonts w:ascii="Times New Roman" w:hAnsi="Times New Roman"/>
+          <w:i/>
+          <w:sz w:val="26"/>
+          <w:szCs w:val="26"/>
+        </w:rPr>
+        <w:t xml:space="preserve">     </w:t>
+      </w:r>
+      <w:r>
+        <w:rPr>
+          <w:rFonts w:ascii="Times New Roman" w:hAnsi="Times New Roman"/>
+          <w:i/>
+          <w:sz w:val="26"/>
+          <w:szCs w:val="26"/>
+        </w:rPr>
+        <w:t xml:space="preserve">    </w:t>
+      </w:r>
+      <w:r>
+        <w:rPr>
+          <w:rFonts w:ascii="Times New Roman" w:hAnsi="Times New Roman"/>
+          <w:i/>
+          <w:sz w:val="26"/>
+          <w:szCs w:val="26"/>
+        </w:rPr>
+        <w:t>(Ký tên, và đóng dấu</w:t>
+      </w:r>
+      <w:r>
+        <w:rPr>
+          <w:rFonts w:ascii="Times New Roman" w:hAnsi="Times New Roman"/>
+          <w:i/>
+          <w:sz w:val="26"/>
+          <w:szCs w:val="26"/>
+        </w:rPr>
+        <w:t>)</w:t>
+      </w:r>
+      <w:r>
+        <w:rPr>
+          <w:rFonts w:ascii="Times New Roman" w:hAnsi="Times New Roman"/>
+          <w:i/>
+          <w:sz w:val="26"/>
+          <w:szCs w:val="26"/>
+        </w:rPr>
+        <w:tab/>
+      </w:r>
+    </w:p>
+    <w:p>
+      <w:pPr>
+        <w:rPr>
+          <w:rFonts w:ascii="Times New Roman" w:hAnsi="Times New Roman"/>
+          <w:i/>
+          <w:sz w:val="26"/>
+          <w:szCs w:val="26"/>
+        </w:rPr>
+      </w:pPr>
+    </w:p>
+    <w:p>
+      <w:pPr>
+        <w:rPr>
+          <w:rFonts w:ascii="Times New Roman" w:hAnsi="Times New Roman"/>
+          <w:i/>
+          <w:sz w:val="26"/>
+          <w:szCs w:val="26"/>
+        </w:rPr>
+      </w:pPr>
+    </w:p>
+    <w:p>
+      <w:pPr>
+        <w:rPr>
+          <w:rFonts w:ascii="Times New Roman" w:hAnsi="Times New Roman"/>
           <w:b/>
-          <w:sz w:val="26"/>
-        </w:rPr>
-        <w:t xml:space="preserve">          </w:t>
+          <w:i/>
+          <w:sz w:val="26"/>
+          <w:szCs w:val="26"/>
+        </w:rPr>
+      </w:pPr>
+      <w:r>
+        <w:rPr>
+          <w:rFonts w:ascii="Times New Roman" w:hAnsi="Times New Roman"/>
+          <w:i/>
+          <w:sz w:val="26"/>
+          <w:szCs w:val="26"/>
+        </w:rPr>
+        <w:t xml:space="preserve">           </w:t>
+      </w:r>
+      <w:r>
+        <w:rPr>
+          <w:rFonts w:ascii="Times New Roman" w:hAnsi="Times New Roman"/>
+          <w:i/>
+          <w:sz w:val="26"/>
+          <w:szCs w:val="26"/>
+        </w:rPr>
+        <w:t xml:space="preserve">                    </w:t>
+      </w:r>
+      <w:r>
+        <w:rPr>
+          <w:rFonts w:ascii="Times New Roman" w:hAnsi="Times New Roman"/>
+          <w:i/>
+          <w:sz w:val="26"/>
+          <w:szCs w:val="26"/>
+        </w:rPr>
+        <w:t xml:space="preserve">    </w:t>
       </w:r>
       <w:r>
         <w:rPr>
           <w:rFonts w:ascii="Times New Roman" w:hAnsi="Times New Roman"/>
           <w:b/>
-          <w:sz w:val="26"/>
-        </w:rPr>
-        <w:t xml:space="preserve">    {{nddpl}}                   </w:t>
-      </w:r>
-    </w:p>
-    <w:p>
-      <w:pPr>
-        <w:rPr>
-          <w:rFonts w:ascii="Times New Roman" w:hAnsi="Times New Roman"/>
-          <w:b/>
-          <w:sz w:val="26"/>
-        </w:rPr>
-      </w:pPr>
-      <w:r>
-        <w:rPr>
-          <w:rFonts w:ascii="Times New Roman" w:hAnsi="Times New Roman"/>
-          <w:i/>
-          <w:sz w:val="26"/>
-        </w:rPr>
-        <w:t>(Ký, ghi rõ họ tên)</w:t>
-      </w:r>
-      <w:r>
-        <w:rPr>
-          <w:rFonts w:ascii="Times New Roman" w:hAnsi="Times New Roman"/>
-          <w:i/>
-          <w:sz w:val="26"/>
-        </w:rPr>
-        <w:t xml:space="preserve">     </w:t>
-      </w:r>
-      <w:r>
-        <w:rPr>
-          <w:rFonts w:ascii="Times New Roman" w:hAnsi="Times New Roman"/>
-          <w:i/>
-          <w:sz w:val="26"/>
-        </w:rPr>
-        <w:t>(Ký, ghi rõ họ tên)</w:t>
-      </w:r>
-      <w:r>
-        <w:rPr>
-          <w:rFonts w:ascii="Times New Roman" w:hAnsi="Times New Roman"/>
-          <w:i/>
-          <w:sz w:val="28"/>
-        </w:rPr>
-        <w:tab/>
-      </w:r>
-      <w:r>
-        <w:rPr>
-          <w:rFonts w:ascii="Times New Roman" w:hAnsi="Times New Roman"/>
-          <w:i/>
-          <w:sz w:val="28"/>
-        </w:rPr>
-        <w:t xml:space="preserve">  </w:t>
-      </w:r>
-      <w:r>
-        <w:rPr>
-          <w:rFonts w:ascii="Times New Roman" w:hAnsi="Times New Roman"/>
-          <w:i/>
-          <w:sz w:val="26"/>
-        </w:rPr>
-        <w:t>(Ký, ghi rõ họ tên)</w:t>
-      </w:r>
-      <w:r>
-        <w:rPr>
-          <w:rFonts w:ascii="Times New Roman" w:hAnsi="Times New Roman"/>
-          <w:i/>
-          <w:sz w:val="28"/>
-        </w:rPr>
-        <w:tab/>
-      </w:r>
-      <w:r>
-        <w:rPr>
-          <w:rFonts w:ascii="Times New Roman" w:hAnsi="Times New Roman"/>
-          <w:i/>
-          <w:sz w:val="28"/>
-        </w:rPr>
-        <w:t xml:space="preserve">     </w:t>
-      </w:r>
-      <w:r>
-        <w:rPr>
-          <w:rFonts w:ascii="Times New Roman" w:hAnsi="Times New Roman"/>
-          <w:i/>
-          <w:sz w:val="28"/>
-        </w:rPr>
-        <w:t xml:space="preserve">    </w:t>
-      </w:r>
-      <w:r>
-        <w:rPr>
-          <w:rFonts w:ascii="Times New Roman" w:hAnsi="Times New Roman"/>
-          <w:i/>
-          <w:sz w:val="26"/>
-        </w:rPr>
-        <w:t>(Ký tên, và đóng dấu</w:t>
-      </w:r>
-      <w:r>
-        <w:rPr>
-          <w:rFonts w:ascii="Times New Roman" w:hAnsi="Times New Roman"/>
-          <w:i/>
-          <w:sz w:val="26"/>
-        </w:rPr>
-        <w:t>)</w:t>
-      </w:r>
-      <w:r>
-        <w:rPr>
-          <w:rFonts w:ascii="Times New Roman" w:hAnsi="Times New Roman"/>
-          <w:i/>
-          <w:sz w:val="28"/>
-        </w:rPr>
-        <w:tab/>
-      </w:r>
-    </w:p>
-    <w:p>
-      <w:pPr>
-        <w:rPr>
-          <w:rFonts w:ascii="Times New Roman" w:hAnsi="Times New Roman"/>
-          <w:i/>
-          <w:sz w:val="28"/>
-        </w:rPr>
-      </w:pPr>
-    </w:p>
-    <w:p>
-      <w:pPr>
-        <w:rPr>
-          <w:rFonts w:ascii="Times New Roman" w:hAnsi="Times New Roman"/>
-          <w:i/>
-          <w:sz w:val="28"/>
-        </w:rPr>
-      </w:pPr>
-    </w:p>
-    <w:p>
-      <w:pPr>
-        <w:rPr>
-          <w:rFonts w:ascii="Times New Roman" w:hAnsi="Times New Roman"/>
-          <w:b/>
-          <w:i/>
-          <w:sz w:val="28"/>
-        </w:rPr>
-      </w:pPr>
-      <w:r>
-        <w:rPr>
-          <w:rFonts w:ascii="Times New Roman" w:hAnsi="Times New Roman"/>
-          <w:i/>
-          <w:sz w:val="28"/>
-        </w:rPr>
-        <w:t xml:space="preserve">           </w:t>
-      </w:r>
-      <w:r>
-        <w:rPr>
-          <w:rFonts w:ascii="Times New Roman" w:hAnsi="Times New Roman"/>
-          <w:i/>
-          <w:sz w:val="28"/>
-        </w:rPr>
-        <w:t xml:space="preserve">                    </w:t>
-      </w:r>
-      <w:r>
-        <w:rPr>
-          <w:rFonts w:ascii="Times New Roman" w:hAnsi="Times New Roman"/>
-          <w:b/>
-          <w:i/>
-          <w:sz w:val="28"/>
+          <w:i/>
+          <w:sz w:val="26"/>
+          <w:szCs w:val="26"/>
         </w:rPr>
         <w:t>{{canBoTDVT}}</w:t>
       </w:r>
@@ -2021,16 +2534,18 @@
         <w:rPr>
           <w:rFonts w:ascii="Times New Roman" w:hAnsi="Times New Roman"/>
           <w:i/>
-          <w:sz w:val="28"/>
-        </w:rPr>
-      </w:pPr>
-    </w:p>
-    <w:p>
-      <w:pPr>
-        <w:rPr>
-          <w:rFonts w:ascii="Times New Roman" w:hAnsi="Times New Roman"/>
-          <w:i/>
-          <w:sz w:val="28"/>
+          <w:sz w:val="26"/>
+          <w:szCs w:val="26"/>
+        </w:rPr>
+      </w:pPr>
+    </w:p>
+    <w:p>
+      <w:pPr>
+        <w:rPr>
+          <w:rFonts w:ascii="Times New Roman" w:hAnsi="Times New Roman"/>
+          <w:i/>
+          <w:sz w:val="26"/>
+          <w:szCs w:val="26"/>
         </w:rPr>
       </w:pPr>
     </w:p>

</xml_diff>

<commit_message>
fix cap lai ngay
</commit_message>
<xml_diff>
--- a/src/main/resources/templates/BaoCaoDeNghiGiaiNganKiemGiayNhanNo.docx
+++ b/src/main/resources/templates/BaoCaoDeNghiGiaiNganKiemGiayNhanNo.docx
@@ -429,6 +429,14 @@
           <w:sz w:val="26"/>
           <w:szCs w:val="26"/>
         </w:rPr>
+        <w:t xml:space="preserve">        </w:t>
+      </w:r>
+      <w:r>
+        <w:rPr>
+          <w:rFonts w:ascii="Times New Roman" w:hAnsi="Times New Roman"/>
+          <w:sz w:val="26"/>
+          <w:szCs w:val="26"/>
+        </w:rPr>
         <w:t>Ngày cấ</w:t>
       </w:r>
       <w:r>
@@ -552,6 +560,14 @@
           <w:szCs w:val="26"/>
         </w:rPr>
         <w:t xml:space="preserve">             </w:t>
+      </w:r>
+      <w:r>
+        <w:rPr>
+          <w:rFonts w:ascii="Times New Roman" w:hAnsi="Times New Roman"/>
+          <w:sz w:val="26"/>
+          <w:szCs w:val="26"/>
+        </w:rPr>
+        <w:t xml:space="preserve">  </w:t>
       </w:r>
       <w:r>
         <w:rPr>
@@ -1068,7 +1084,23 @@
           <w:sz w:val="26"/>
           <w:szCs w:val="26"/>
         </w:rPr>
-        <w:t xml:space="preserve">Vốn tự có:                        {{vonTuCo}}           </w:t>
+        <w:t>Vốn tự</w:t>
+      </w:r>
+      <w:r>
+        <w:rPr>
+          <w:rFonts w:ascii="Times New Roman" w:hAnsi="Times New Roman"/>
+          <w:sz w:val="26"/>
+          <w:szCs w:val="26"/>
+        </w:rPr>
+        <w:t xml:space="preserve"> có:                       </w:t>
+      </w:r>
+      <w:r>
+        <w:rPr>
+          <w:rFonts w:ascii="Times New Roman" w:hAnsi="Times New Roman"/>
+          <w:sz w:val="26"/>
+          <w:szCs w:val="26"/>
+        </w:rPr>
+        <w:t xml:space="preserve">{{vonTuCo}}           </w:t>
       </w:r>
       <w:r>
         <w:rPr>
@@ -1125,7 +1157,7 @@
           <w:sz w:val="26"/>
           <w:szCs w:val="26"/>
         </w:rPr>
-        <w:t xml:space="preserve">Vốn khác:                         </w:t>
+        <w:t xml:space="preserve">Vốn khác:                         {{vonKhac}}                             </w:t>
       </w:r>
       <w:r>
         <w:rPr>
@@ -1141,22 +1173,6 @@
           <w:sz w:val="26"/>
           <w:szCs w:val="26"/>
         </w:rPr>
-        <w:t xml:space="preserve">{{vonKhac}}                             </w:t>
-      </w:r>
-      <w:r>
-        <w:rPr>
-          <w:rFonts w:ascii="Times New Roman" w:hAnsi="Times New Roman"/>
-          <w:sz w:val="26"/>
-          <w:szCs w:val="26"/>
-        </w:rPr>
-        <w:t xml:space="preserve">  </w:t>
-      </w:r>
-      <w:r>
-        <w:rPr>
-          <w:rFonts w:ascii="Times New Roman" w:hAnsi="Times New Roman"/>
-          <w:sz w:val="26"/>
-          <w:szCs w:val="26"/>
-        </w:rPr>
         <w:t>đồng</w:t>
       </w:r>
     </w:p>
@@ -1182,7 +1198,23 @@
           <w:sz w:val="26"/>
           <w:szCs w:val="26"/>
         </w:rPr>
-        <w:t xml:space="preserve">Vốn xin vay của Quỹ:      {{tienso}}                </w:t>
+        <w:t>Vốn xin vay của Quỹ</w:t>
+      </w:r>
+      <w:r>
+        <w:rPr>
+          <w:rFonts w:ascii="Times New Roman" w:hAnsi="Times New Roman"/>
+          <w:sz w:val="26"/>
+          <w:szCs w:val="26"/>
+        </w:rPr>
+        <w:t xml:space="preserve">:     </w:t>
+      </w:r>
+      <w:r>
+        <w:rPr>
+          <w:rFonts w:ascii="Times New Roman" w:hAnsi="Times New Roman"/>
+          <w:sz w:val="26"/>
+          <w:szCs w:val="26"/>
+        </w:rPr>
+        <w:t xml:space="preserve">{{tienso}}                </w:t>
       </w:r>
       <w:r>
         <w:rPr>
@@ -1399,7 +1431,7 @@
           <w:sz w:val="26"/>
           <w:szCs w:val="26"/>
         </w:rPr>
-        <w:t xml:space="preserve">  </w:t>
+        <w:t xml:space="preserve"> </w:t>
       </w:r>
       <w:r>
         <w:rPr>
@@ -1705,7 +1737,16 @@
           <w:sz w:val="26"/>
           <w:szCs w:val="26"/>
         </w:rPr>
-        <w:t>Tôi: {{canBoTDVT}}</w:t>
+        <w:t xml:space="preserve">Tôi: </w:t>
+      </w:r>
+      <w:r>
+        <w:rPr>
+          <w:rFonts w:ascii="Times New Roman" w:hAnsi="Times New Roman"/>
+          <w:b/>
+          <w:sz w:val="26"/>
+          <w:szCs w:val="26"/>
+        </w:rPr>
+        <w:t>{{canBoTDVT}}</w:t>
       </w:r>
       <w:r>
         <w:rPr>
@@ -1721,7 +1762,25 @@
           <w:sz w:val="26"/>
           <w:szCs w:val="26"/>
         </w:rPr>
-        <w:t>– Cán bộ tín dụng, đề nghị giải ngân tiền vay theo mục 2, phần nhận nợ Giấy đề nghị này.</w:t>
+        <w:t>– Cán bộ</w:t>
+      </w:r>
+      <w:r>
+        <w:rPr>
+          <w:rFonts w:ascii="Times New Roman" w:hAnsi="Times New Roman"/>
+          <w:sz w:val="26"/>
+          <w:szCs w:val="26"/>
+        </w:rPr>
+        <w:t xml:space="preserve"> thẩm định</w:t>
+      </w:r>
+      <w:bookmarkStart w:id="0" w:name="_GoBack"/>
+      <w:bookmarkEnd w:id="0"/>
+      <w:r>
+        <w:rPr>
+          <w:rFonts w:ascii="Times New Roman" w:hAnsi="Times New Roman"/>
+          <w:sz w:val="26"/>
+          <w:szCs w:val="26"/>
+        </w:rPr>
+        <w:t>, đề nghị giải ngân tiền vay theo mục 2, phần nhận nợ Giấy đề nghị này.</w:t>
       </w:r>
     </w:p>
     <w:p>
@@ -2275,8 +2334,6 @@
         </w:rPr>
         <w:t xml:space="preserve"> thẩm định</w:t>
       </w:r>
-      <w:bookmarkStart w:id="0" w:name="_GoBack"/>
-      <w:bookmarkEnd w:id="0"/>
       <w:r>
         <w:rPr>
           <w:rFonts w:ascii="Times New Roman" w:hAnsi="Times New Roman"/>
@@ -2377,6 +2434,15 @@
           <w:sz w:val="26"/>
           <w:szCs w:val="26"/>
         </w:rPr>
+        <w:t xml:space="preserve">  </w:t>
+      </w:r>
+      <w:r>
+        <w:rPr>
+          <w:rFonts w:ascii="Times New Roman" w:hAnsi="Times New Roman"/>
+          <w:i/>
+          <w:sz w:val="26"/>
+          <w:szCs w:val="26"/>
+        </w:rPr>
         <w:t>(Ký, ghi rõ họ tên)</w:t>
       </w:r>
       <w:r>
@@ -2404,6 +2470,15 @@
           <w:sz w:val="26"/>
           <w:szCs w:val="26"/>
         </w:rPr>
+        <w:t xml:space="preserve">          </w:t>
+      </w:r>
+      <w:r>
+        <w:rPr>
+          <w:rFonts w:ascii="Times New Roman" w:hAnsi="Times New Roman"/>
+          <w:i/>
+          <w:sz w:val="26"/>
+          <w:szCs w:val="26"/>
+        </w:rPr>
         <w:t>(Ký, ghi rõ họ tên)</w:t>
       </w:r>
       <w:r>
@@ -2431,7 +2506,7 @@
           <w:sz w:val="26"/>
           <w:szCs w:val="26"/>
         </w:rPr>
-        <w:t xml:space="preserve">    </w:t>
+        <w:t xml:space="preserve">  </w:t>
       </w:r>
       <w:r>
         <w:rPr>

</xml_diff>

<commit_message>
hoan thanh fix thong bao
</commit_message>
<xml_diff>
--- a/src/main/resources/templates/BaoCaoDeNghiGiaiNganKiemGiayNhanNo.docx
+++ b/src/main/resources/templates/BaoCaoDeNghiGiaiNganKiemGiayNhanNo.docx
@@ -4,32 +4,34 @@
   <w:body>
     <w:p>
       <w:pPr>
+        <w:spacing w:after="0" w:line="288" w:lineRule="auto"/>
         <w:jc w:val="center"/>
         <w:rPr>
           <w:rFonts w:ascii="Times New Roman" w:hAnsi="Times New Roman"/>
           <w:b/>
-          <w:sz w:val="26"/>
-          <w:szCs w:val="26"/>
+          <w:sz w:val="28"/>
+          <w:szCs w:val="28"/>
         </w:rPr>
       </w:pPr>
       <w:r>
         <w:rPr>
           <w:rFonts w:ascii="Times New Roman" w:hAnsi="Times New Roman"/>
           <w:b/>
-          <w:sz w:val="26"/>
-          <w:szCs w:val="26"/>
+          <w:sz w:val="28"/>
+          <w:szCs w:val="28"/>
         </w:rPr>
         <w:t>CỘNG HÒA XÃ HỘI CHỦ NGHĨA VIỆT NAM</w:t>
       </w:r>
     </w:p>
     <w:p>
       <w:pPr>
+        <w:spacing w:after="0" w:line="288" w:lineRule="auto"/>
         <w:jc w:val="center"/>
         <w:rPr>
           <w:rFonts w:ascii="Times New Roman" w:hAnsi="Times New Roman"/>
           <w:b/>
-          <w:sz w:val="26"/>
-          <w:szCs w:val="26"/>
+          <w:sz w:val="28"/>
+          <w:szCs w:val="28"/>
         </w:rPr>
       </w:pPr>
       <w:r>
@@ -37,8 +39,8 @@
           <w:rFonts w:ascii="Times New Roman" w:hAnsi="Times New Roman"/>
           <w:b/>
           <w:noProof/>
-          <w:sz w:val="26"/>
-          <w:szCs w:val="26"/>
+          <w:sz w:val="28"/>
+          <w:szCs w:val="28"/>
         </w:rPr>
         <mc:AlternateContent>
           <mc:Choice Requires="wps">
@@ -46,13 +48,13 @@
               <wp:anchor distT="0" distB="0" distL="114300" distR="114300" simplePos="0" relativeHeight="251658240" behindDoc="0" locked="0" layoutInCell="1" allowOverlap="1">
                 <wp:simplePos x="0" y="0"/>
                 <wp:positionH relativeFrom="column">
-                  <wp:posOffset>1941195</wp:posOffset>
+                  <wp:posOffset>2141068</wp:posOffset>
                 </wp:positionH>
                 <wp:positionV relativeFrom="paragraph">
-                  <wp:posOffset>233045</wp:posOffset>
+                  <wp:posOffset>191135</wp:posOffset>
                 </wp:positionV>
                 <wp:extent cx="2061210" cy="17780"/>
-                <wp:effectExtent l="7620" t="13970" r="7620" b="6350"/>
+                <wp:effectExtent l="0" t="0" r="34290" b="20320"/>
                 <wp:wrapNone/>
                 <wp:docPr id="1" name="AutoShape 2"/>
                 <wp:cNvGraphicFramePr>
@@ -104,11 +106,11 @@
           </mc:Choice>
           <mc:Fallback>
             <w:pict>
-              <v:shapetype w14:anchorId="701AC84A" id="_x0000_t32" coordsize="21600,21600" o:spt="32" o:oned="t" path="m,l21600,21600e" filled="f">
+              <v:shapetype w14:anchorId="5BE06472" id="_x0000_t32" coordsize="21600,21600" o:spt="32" o:oned="t" path="m,l21600,21600e" filled="f">
                 <v:path arrowok="t" fillok="f" o:connecttype="none"/>
                 <o:lock v:ext="edit" shapetype="t"/>
               </v:shapetype>
-              <v:shape id="AutoShape 2" o:spid="_x0000_s1026" type="#_x0000_t32" style="position:absolute;margin-left:152.85pt;margin-top:18.35pt;width:162.3pt;height:1.4pt;flip:y;z-index:251658240;visibility:visible;mso-wrap-style:square;mso-width-percent:0;mso-height-percent:0;mso-wrap-distance-left:9pt;mso-wrap-distance-top:0;mso-wrap-distance-right:9pt;mso-wrap-distance-bottom:0;mso-position-horizontal:absolute;mso-position-horizontal-relative:text;mso-position-vertical:absolute;mso-position-vertical-relative:text;mso-width-percent:0;mso-height-percent:0;mso-width-relative:page;mso-height-relative:page" o:gfxdata="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"/>
+              <v:shape id="AutoShape 2" o:spid="_x0000_s1026" type="#_x0000_t32" style="position:absolute;margin-left:168.6pt;margin-top:15.05pt;width:162.3pt;height:1.4pt;flip:y;z-index:251658240;visibility:visible;mso-wrap-style:square;mso-width-percent:0;mso-height-percent:0;mso-wrap-distance-left:9pt;mso-wrap-distance-top:0;mso-wrap-distance-right:9pt;mso-wrap-distance-bottom:0;mso-position-horizontal:absolute;mso-position-horizontal-relative:text;mso-position-vertical:absolute;mso-position-vertical-relative:text;mso-width-percent:0;mso-height-percent:0;mso-width-relative:page;mso-height-relative:page" o:gfxdata="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"/>
             </w:pict>
           </mc:Fallback>
         </mc:AlternateContent>
@@ -117,28 +119,29 @@
         <w:rPr>
           <w:rFonts w:ascii="Times New Roman" w:hAnsi="Times New Roman"/>
           <w:b/>
-          <w:sz w:val="26"/>
-          <w:szCs w:val="26"/>
+          <w:sz w:val="28"/>
+          <w:szCs w:val="28"/>
         </w:rPr>
         <w:t>Độc lập – Tự do – Hạnh phúc</w:t>
       </w:r>
     </w:p>
     <w:p>
       <w:pPr>
+        <w:spacing w:after="0" w:line="288" w:lineRule="auto"/>
         <w:jc w:val="right"/>
         <w:rPr>
           <w:rFonts w:ascii="Times New Roman" w:hAnsi="Times New Roman"/>
           <w:i/>
-          <w:sz w:val="26"/>
-          <w:szCs w:val="26"/>
+          <w:sz w:val="28"/>
+          <w:szCs w:val="28"/>
         </w:rPr>
       </w:pPr>
       <w:r>
         <w:rPr>
           <w:rFonts w:ascii="Times New Roman" w:hAnsi="Times New Roman"/>
           <w:i/>
-          <w:sz w:val="26"/>
-          <w:szCs w:val="26"/>
+          <w:sz w:val="28"/>
+          <w:szCs w:val="28"/>
         </w:rPr>
         <w:t>{{phuong}}</w:t>
       </w:r>
@@ -146,8 +149,8 @@
         <w:rPr>
           <w:rFonts w:ascii="Times New Roman" w:hAnsi="Times New Roman"/>
           <w:i/>
-          <w:sz w:val="26"/>
-          <w:szCs w:val="26"/>
+          <w:sz w:val="28"/>
+          <w:szCs w:val="28"/>
         </w:rPr>
         <w:t>, ngày…. t</w:t>
       </w:r>
@@ -155,8 +158,8 @@
         <w:rPr>
           <w:rFonts w:ascii="Times New Roman" w:hAnsi="Times New Roman"/>
           <w:i/>
-          <w:sz w:val="26"/>
-          <w:szCs w:val="26"/>
+          <w:sz w:val="28"/>
+          <w:szCs w:val="28"/>
         </w:rPr>
         <w:t>háng….</w:t>
       </w:r>
@@ -164,54 +167,58 @@
         <w:rPr>
           <w:rFonts w:ascii="Times New Roman" w:hAnsi="Times New Roman"/>
           <w:i/>
-          <w:sz w:val="26"/>
-          <w:szCs w:val="26"/>
+          <w:sz w:val="28"/>
+          <w:szCs w:val="28"/>
         </w:rPr>
         <w:t xml:space="preserve"> năm 2026</w:t>
       </w:r>
     </w:p>
     <w:p>
       <w:pPr>
+        <w:spacing w:after="0" w:line="288" w:lineRule="auto"/>
         <w:jc w:val="center"/>
         <w:rPr>
           <w:rFonts w:ascii="Times New Roman" w:hAnsi="Times New Roman"/>
           <w:b/>
-          <w:sz w:val="26"/>
-          <w:szCs w:val="26"/>
+          <w:sz w:val="28"/>
+          <w:szCs w:val="28"/>
         </w:rPr>
       </w:pPr>
       <w:r>
         <w:rPr>
           <w:rFonts w:ascii="Times New Roman" w:hAnsi="Times New Roman"/>
           <w:b/>
-          <w:sz w:val="26"/>
-          <w:szCs w:val="26"/>
+          <w:sz w:val="28"/>
+          <w:szCs w:val="28"/>
         </w:rPr>
         <w:t>BÁO CÁO ĐỀ NGHỊ GIẢI NGÂN KIÊM GIẤY NHẬN NỢ</w:t>
       </w:r>
     </w:p>
     <w:p>
       <w:pPr>
+        <w:spacing w:after="0" w:line="288" w:lineRule="auto"/>
         <w:jc w:val="center"/>
         <w:rPr>
           <w:rFonts w:ascii="Times New Roman" w:hAnsi="Times New Roman"/>
-          <w:sz w:val="26"/>
-          <w:szCs w:val="26"/>
-        </w:rPr>
-      </w:pPr>
-      <w:r>
-        <w:rPr>
-          <w:rFonts w:ascii="Times New Roman" w:hAnsi="Times New Roman"/>
-          <w:sz w:val="26"/>
-          <w:szCs w:val="26"/>
+          <w:b/>
+          <w:sz w:val="28"/>
+          <w:szCs w:val="28"/>
+        </w:rPr>
+      </w:pPr>
+      <w:r>
+        <w:rPr>
+          <w:rFonts w:ascii="Times New Roman" w:hAnsi="Times New Roman"/>
+          <w:sz w:val="28"/>
+          <w:szCs w:val="28"/>
         </w:rPr>
         <w:t xml:space="preserve">Số giải ngân: </w:t>
       </w:r>
       <w:r>
         <w:rPr>
           <w:rFonts w:ascii="Times New Roman" w:hAnsi="Times New Roman"/>
-          <w:sz w:val="26"/>
-          <w:szCs w:val="26"/>
+          <w:b/>
+          <w:sz w:val="28"/>
+          <w:szCs w:val="28"/>
         </w:rPr>
         <w:t>{{shdtd}}</w:t>
       </w:r>
@@ -223,19 +230,20 @@
           <w:ilvl w:val="0"/>
           <w:numId w:val="1"/>
         </w:numPr>
+        <w:spacing w:after="0" w:line="288" w:lineRule="auto"/>
         <w:rPr>
           <w:rFonts w:ascii="Times New Roman" w:hAnsi="Times New Roman"/>
           <w:b/>
-          <w:sz w:val="26"/>
-          <w:szCs w:val="26"/>
+          <w:sz w:val="28"/>
+          <w:szCs w:val="28"/>
         </w:rPr>
       </w:pPr>
       <w:r>
         <w:rPr>
           <w:rFonts w:ascii="Times New Roman" w:hAnsi="Times New Roman"/>
           <w:b/>
-          <w:sz w:val="26"/>
-          <w:szCs w:val="26"/>
+          <w:sz w:val="28"/>
+          <w:szCs w:val="28"/>
         </w:rPr>
         <w:t>ĐỀ NGHỊ GIẢI NGÂN</w:t>
       </w:r>
@@ -247,17 +255,18 @@
           <w:ilvl w:val="1"/>
           <w:numId w:val="1"/>
         </w:numPr>
-        <w:rPr>
-          <w:rFonts w:ascii="Times New Roman" w:hAnsi="Times New Roman"/>
-          <w:sz w:val="26"/>
-          <w:szCs w:val="26"/>
-        </w:rPr>
-      </w:pPr>
-      <w:r>
-        <w:rPr>
-          <w:rFonts w:ascii="Times New Roman" w:hAnsi="Times New Roman"/>
-          <w:sz w:val="26"/>
-          <w:szCs w:val="26"/>
+        <w:spacing w:after="0" w:line="288" w:lineRule="auto"/>
+        <w:rPr>
+          <w:rFonts w:ascii="Times New Roman" w:hAnsi="Times New Roman"/>
+          <w:sz w:val="28"/>
+          <w:szCs w:val="28"/>
+        </w:rPr>
+      </w:pPr>
+      <w:r>
+        <w:rPr>
+          <w:rFonts w:ascii="Times New Roman" w:hAnsi="Times New Roman"/>
+          <w:sz w:val="28"/>
+          <w:szCs w:val="28"/>
         </w:rPr>
         <w:t>Thông tin về tín dụng:</w:t>
       </w:r>
@@ -265,26 +274,27 @@
     <w:p>
       <w:pPr>
         <w:pStyle w:val="ListParagraph"/>
+        <w:spacing w:after="0" w:line="288" w:lineRule="auto"/>
         <w:ind w:left="1140"/>
         <w:rPr>
           <w:rFonts w:ascii="Times New Roman" w:hAnsi="Times New Roman"/>
-          <w:sz w:val="26"/>
-          <w:szCs w:val="26"/>
-        </w:rPr>
-      </w:pPr>
-      <w:r>
-        <w:rPr>
-          <w:rFonts w:ascii="Times New Roman" w:hAnsi="Times New Roman"/>
-          <w:sz w:val="26"/>
-          <w:szCs w:val="26"/>
+          <w:sz w:val="28"/>
+          <w:szCs w:val="28"/>
+        </w:rPr>
+      </w:pPr>
+      <w:r>
+        <w:rPr>
+          <w:rFonts w:ascii="Times New Roman" w:hAnsi="Times New Roman"/>
+          <w:sz w:val="28"/>
+          <w:szCs w:val="28"/>
         </w:rPr>
         <w:t>Họ và tên người nhận nợ</w:t>
       </w:r>
       <w:r>
         <w:rPr>
           <w:rFonts w:ascii="Times New Roman" w:hAnsi="Times New Roman"/>
-          <w:sz w:val="26"/>
-          <w:szCs w:val="26"/>
+          <w:sz w:val="28"/>
+          <w:szCs w:val="28"/>
         </w:rPr>
         <w:t xml:space="preserve">: </w:t>
       </w:r>
@@ -292,16 +302,16 @@
         <w:rPr>
           <w:rFonts w:ascii="Times New Roman" w:hAnsi="Times New Roman"/>
           <w:b/>
-          <w:sz w:val="26"/>
-          <w:szCs w:val="26"/>
+          <w:sz w:val="28"/>
+          <w:szCs w:val="28"/>
         </w:rPr>
         <w:t>{{kh}}</w:t>
       </w:r>
       <w:r>
         <w:rPr>
           <w:rFonts w:ascii="Times New Roman" w:hAnsi="Times New Roman"/>
-          <w:sz w:val="26"/>
-          <w:szCs w:val="26"/>
+          <w:sz w:val="28"/>
+          <w:szCs w:val="28"/>
         </w:rPr>
         <w:t>.</w:t>
       </w:r>
@@ -309,50 +319,51 @@
     <w:p>
       <w:pPr>
         <w:pStyle w:val="ListParagraph"/>
+        <w:spacing w:after="0" w:line="288" w:lineRule="auto"/>
         <w:ind w:left="1140"/>
         <w:rPr>
           <w:rFonts w:ascii="Times New Roman" w:hAnsi="Times New Roman"/>
-          <w:sz w:val="26"/>
-          <w:szCs w:val="26"/>
-        </w:rPr>
-      </w:pPr>
-      <w:r>
-        <w:rPr>
-          <w:rFonts w:ascii="Times New Roman" w:hAnsi="Times New Roman"/>
-          <w:sz w:val="26"/>
-          <w:szCs w:val="26"/>
+          <w:sz w:val="28"/>
+          <w:szCs w:val="28"/>
+        </w:rPr>
+      </w:pPr>
+      <w:r>
+        <w:rPr>
+          <w:rFonts w:ascii="Times New Roman" w:hAnsi="Times New Roman"/>
+          <w:sz w:val="28"/>
+          <w:szCs w:val="28"/>
         </w:rPr>
         <w:t>Số thẻ thành</w:t>
       </w:r>
       <w:r>
         <w:rPr>
           <w:rFonts w:ascii="Times New Roman" w:hAnsi="Times New Roman"/>
-          <w:sz w:val="26"/>
-          <w:szCs w:val="26"/>
+          <w:sz w:val="28"/>
+          <w:szCs w:val="28"/>
         </w:rPr>
         <w:t xml:space="preserve"> viên: {{sttv}}</w:t>
       </w:r>
       <w:r>
         <w:rPr>
           <w:rFonts w:ascii="Times New Roman" w:hAnsi="Times New Roman"/>
-          <w:sz w:val="26"/>
-          <w:szCs w:val="26"/>
+          <w:sz w:val="28"/>
+          <w:szCs w:val="28"/>
         </w:rPr>
         <w:t xml:space="preserve">                    </w:t>
       </w:r>
       <w:r>
         <w:rPr>
           <w:rFonts w:ascii="Times New Roman" w:hAnsi="Times New Roman"/>
-          <w:sz w:val="26"/>
-          <w:szCs w:val="26"/>
+          <w:sz w:val="28"/>
+          <w:szCs w:val="28"/>
         </w:rPr>
         <w:t xml:space="preserve">     </w:t>
       </w:r>
       <w:r>
         <w:rPr>
           <w:rFonts w:ascii="Times New Roman" w:hAnsi="Times New Roman"/>
-          <w:sz w:val="26"/>
-          <w:szCs w:val="26"/>
+          <w:sz w:val="28"/>
+          <w:szCs w:val="28"/>
         </w:rPr>
         <w:t>Số điện thoại: {{sdtkh}}.</w:t>
       </w:r>
@@ -360,106 +371,107 @@
     <w:p>
       <w:pPr>
         <w:pStyle w:val="ListParagraph"/>
+        <w:spacing w:after="0" w:line="288" w:lineRule="auto"/>
         <w:ind w:left="1140"/>
         <w:rPr>
           <w:rFonts w:ascii="Times New Roman" w:hAnsi="Times New Roman"/>
-          <w:sz w:val="26"/>
-          <w:szCs w:val="26"/>
-        </w:rPr>
-      </w:pPr>
-      <w:r>
-        <w:rPr>
-          <w:rFonts w:ascii="Times New Roman" w:hAnsi="Times New Roman"/>
-          <w:sz w:val="26"/>
-          <w:szCs w:val="26"/>
+          <w:sz w:val="28"/>
+          <w:szCs w:val="28"/>
+        </w:rPr>
+      </w:pPr>
+      <w:r>
+        <w:rPr>
+          <w:rFonts w:ascii="Times New Roman" w:hAnsi="Times New Roman"/>
+          <w:sz w:val="28"/>
+          <w:szCs w:val="28"/>
         </w:rPr>
         <w:t>Số</w:t>
       </w:r>
       <w:r>
         <w:rPr>
           <w:rFonts w:ascii="Times New Roman" w:hAnsi="Times New Roman"/>
-          <w:sz w:val="26"/>
-          <w:szCs w:val="26"/>
+          <w:sz w:val="28"/>
+          <w:szCs w:val="28"/>
         </w:rPr>
         <w:t xml:space="preserve"> CC/C</w:t>
       </w:r>
       <w:r>
         <w:rPr>
           <w:rFonts w:ascii="Times New Roman" w:hAnsi="Times New Roman"/>
-          <w:sz w:val="26"/>
-          <w:szCs w:val="26"/>
+          <w:sz w:val="28"/>
+          <w:szCs w:val="28"/>
         </w:rPr>
         <w:t>CCD: {{cccdkh}}</w:t>
       </w:r>
       <w:r>
         <w:rPr>
           <w:rFonts w:ascii="Times New Roman" w:hAnsi="Times New Roman"/>
-          <w:sz w:val="26"/>
-          <w:szCs w:val="26"/>
+          <w:sz w:val="28"/>
+          <w:szCs w:val="28"/>
         </w:rPr>
         <w:t xml:space="preserve">           </w:t>
       </w:r>
       <w:r>
         <w:rPr>
           <w:rFonts w:ascii="Times New Roman" w:hAnsi="Times New Roman"/>
-          <w:sz w:val="26"/>
-          <w:szCs w:val="26"/>
+          <w:sz w:val="28"/>
+          <w:szCs w:val="28"/>
         </w:rPr>
         <w:t xml:space="preserve"> </w:t>
       </w:r>
       <w:r>
         <w:rPr>
           <w:rFonts w:ascii="Times New Roman" w:hAnsi="Times New Roman"/>
-          <w:sz w:val="26"/>
-          <w:szCs w:val="26"/>
+          <w:sz w:val="28"/>
+          <w:szCs w:val="28"/>
         </w:rPr>
         <w:t xml:space="preserve"> </w:t>
       </w:r>
       <w:r>
         <w:rPr>
           <w:rFonts w:ascii="Times New Roman" w:hAnsi="Times New Roman"/>
-          <w:sz w:val="26"/>
-          <w:szCs w:val="26"/>
+          <w:sz w:val="28"/>
+          <w:szCs w:val="28"/>
         </w:rPr>
         <w:t xml:space="preserve">         </w:t>
       </w:r>
       <w:r>
         <w:rPr>
           <w:rFonts w:ascii="Times New Roman" w:hAnsi="Times New Roman"/>
-          <w:sz w:val="26"/>
-          <w:szCs w:val="26"/>
+          <w:sz w:val="28"/>
+          <w:szCs w:val="28"/>
         </w:rPr>
         <w:t xml:space="preserve">        </w:t>
       </w:r>
       <w:r>
         <w:rPr>
           <w:rFonts w:ascii="Times New Roman" w:hAnsi="Times New Roman"/>
-          <w:sz w:val="26"/>
-          <w:szCs w:val="26"/>
+          <w:sz w:val="28"/>
+          <w:szCs w:val="28"/>
         </w:rPr>
         <w:t>Ngày cấ</w:t>
       </w:r>
       <w:r>
         <w:rPr>
           <w:rFonts w:ascii="Times New Roman" w:hAnsi="Times New Roman"/>
-          <w:sz w:val="26"/>
-          <w:szCs w:val="26"/>
+          <w:sz w:val="28"/>
+          <w:szCs w:val="28"/>
         </w:rPr>
         <w:t>p: {{nckh}}</w:t>
       </w:r>
       <w:r>
         <w:rPr>
           <w:rFonts w:ascii="Times New Roman" w:hAnsi="Times New Roman"/>
-          <w:sz w:val="26"/>
-          <w:szCs w:val="26"/>
+          <w:sz w:val="28"/>
+          <w:szCs w:val="28"/>
         </w:rPr>
         <w:t>.</w:t>
       </w:r>
       <w:r>
         <w:rPr>
           <w:rFonts w:ascii="Times New Roman" w:hAnsi="Times New Roman"/>
-          <w:sz w:val="26"/>
-          <w:szCs w:val="26"/>
+          <w:sz w:val="28"/>
+          <w:szCs w:val="28"/>
         </w:rPr>
         <w:tab/>
       </w:r>
@@ -467,18 +479,19 @@
     <w:p>
       <w:pPr>
         <w:pStyle w:val="ListParagraph"/>
+        <w:spacing w:after="0" w:line="288" w:lineRule="auto"/>
         <w:ind w:left="1140"/>
         <w:rPr>
           <w:rFonts w:ascii="Times New Roman" w:hAnsi="Times New Roman"/>
-          <w:sz w:val="26"/>
-          <w:szCs w:val="26"/>
-        </w:rPr>
-      </w:pPr>
-      <w:r>
-        <w:rPr>
-          <w:rFonts w:ascii="Times New Roman" w:hAnsi="Times New Roman"/>
-          <w:sz w:val="26"/>
-          <w:szCs w:val="26"/>
+          <w:sz w:val="28"/>
+          <w:szCs w:val="28"/>
+        </w:rPr>
+      </w:pPr>
+      <w:r>
+        <w:rPr>
+          <w:rFonts w:ascii="Times New Roman" w:hAnsi="Times New Roman"/>
+          <w:sz w:val="28"/>
+          <w:szCs w:val="28"/>
         </w:rPr>
         <w:t>Nơi cấp: {{nccccdkh}}.</w:t>
       </w:r>
@@ -486,34 +499,35 @@
     <w:p>
       <w:pPr>
         <w:pStyle w:val="ListParagraph"/>
+        <w:spacing w:after="0" w:line="288" w:lineRule="auto"/>
         <w:ind w:left="1140"/>
         <w:rPr>
           <w:rFonts w:ascii="Times New Roman" w:hAnsi="Times New Roman"/>
-          <w:sz w:val="26"/>
-          <w:szCs w:val="26"/>
-        </w:rPr>
-      </w:pPr>
-      <w:r>
-        <w:rPr>
-          <w:rFonts w:ascii="Times New Roman" w:hAnsi="Times New Roman"/>
-          <w:sz w:val="26"/>
-          <w:szCs w:val="26"/>
+          <w:sz w:val="28"/>
+          <w:szCs w:val="28"/>
+        </w:rPr>
+      </w:pPr>
+      <w:r>
+        <w:rPr>
+          <w:rFonts w:ascii="Times New Roman" w:hAnsi="Times New Roman"/>
+          <w:sz w:val="28"/>
+          <w:szCs w:val="28"/>
         </w:rPr>
         <w:t>Địa chỉ thườ</w:t>
       </w:r>
       <w:r>
         <w:rPr>
           <w:rFonts w:ascii="Times New Roman" w:hAnsi="Times New Roman"/>
-          <w:sz w:val="26"/>
-          <w:szCs w:val="26"/>
+          <w:sz w:val="28"/>
+          <w:szCs w:val="28"/>
         </w:rPr>
         <w:t>ng tr</w:t>
       </w:r>
       <w:r>
         <w:rPr>
           <w:rFonts w:ascii="Times New Roman" w:hAnsi="Times New Roman"/>
-          <w:sz w:val="26"/>
-          <w:szCs w:val="26"/>
+          <w:sz w:val="28"/>
+          <w:szCs w:val="28"/>
         </w:rPr>
         <w:t>ú: {{ttkh}}</w:t>
       </w:r>
@@ -521,75 +535,108 @@
     <w:p>
       <w:pPr>
         <w:pStyle w:val="ListParagraph"/>
+        <w:spacing w:after="0" w:line="288" w:lineRule="auto"/>
         <w:ind w:left="1140"/>
         <w:rPr>
           <w:rFonts w:ascii="Times New Roman" w:hAnsi="Times New Roman"/>
-          <w:sz w:val="26"/>
-          <w:szCs w:val="26"/>
-        </w:rPr>
-      </w:pPr>
-      <w:r>
-        <w:rPr>
-          <w:rFonts w:ascii="Times New Roman" w:hAnsi="Times New Roman"/>
-          <w:sz w:val="26"/>
-          <w:szCs w:val="26"/>
-        </w:rPr>
-        <w:t xml:space="preserve">Và ông/bà: </w:t>
+          <w:sz w:val="28"/>
+          <w:szCs w:val="28"/>
+        </w:rPr>
+      </w:pPr>
+      <w:r>
+        <w:rPr>
+          <w:rFonts w:ascii="Times New Roman" w:hAnsi="Times New Roman"/>
+          <w:sz w:val="28"/>
+          <w:szCs w:val="28"/>
+        </w:rPr>
+        <w:t xml:space="preserve">Và </w:t>
+      </w:r>
+      <w:r>
+        <w:rPr>
+          <w:rFonts w:ascii="Times New Roman" w:hAnsi="Times New Roman"/>
+          <w:sz w:val="28"/>
+          <w:szCs w:val="28"/>
+        </w:rPr>
+        <w:t>(</w:t>
+      </w:r>
+      <w:r>
+        <w:rPr>
+          <w:rFonts w:ascii="Times New Roman" w:hAnsi="Times New Roman"/>
+          <w:sz w:val="28"/>
+          <w:szCs w:val="28"/>
+        </w:rPr>
+        <w:t>ông/bà</w:t>
+      </w:r>
+      <w:r>
+        <w:rPr>
+          <w:rFonts w:ascii="Times New Roman" w:hAnsi="Times New Roman"/>
+          <w:sz w:val="28"/>
+          <w:szCs w:val="28"/>
+        </w:rPr>
+        <w:t>)</w:t>
+      </w:r>
+      <w:r>
+        <w:rPr>
+          <w:rFonts w:ascii="Times New Roman" w:hAnsi="Times New Roman"/>
+          <w:sz w:val="28"/>
+          <w:szCs w:val="28"/>
+        </w:rPr>
+        <w:t xml:space="preserve">: </w:t>
       </w:r>
       <w:r>
         <w:rPr>
           <w:rFonts w:ascii="Times New Roman" w:hAnsi="Times New Roman"/>
           <w:b/>
-          <w:sz w:val="26"/>
-          <w:szCs w:val="26"/>
+          <w:sz w:val="28"/>
+          <w:szCs w:val="28"/>
         </w:rPr>
         <w:t>{{ntkh}}</w:t>
       </w:r>
       <w:r>
         <w:rPr>
           <w:rFonts w:ascii="Times New Roman" w:hAnsi="Times New Roman"/>
-          <w:sz w:val="26"/>
-          <w:szCs w:val="26"/>
+          <w:sz w:val="28"/>
+          <w:szCs w:val="28"/>
         </w:rPr>
         <w:t xml:space="preserve">           </w:t>
       </w:r>
       <w:r>
         <w:rPr>
           <w:rFonts w:ascii="Times New Roman" w:hAnsi="Times New Roman"/>
-          <w:sz w:val="26"/>
-          <w:szCs w:val="26"/>
+          <w:sz w:val="28"/>
+          <w:szCs w:val="28"/>
         </w:rPr>
         <w:t xml:space="preserve">             </w:t>
       </w:r>
       <w:r>
         <w:rPr>
           <w:rFonts w:ascii="Times New Roman" w:hAnsi="Times New Roman"/>
-          <w:sz w:val="26"/>
-          <w:szCs w:val="26"/>
+          <w:sz w:val="28"/>
+          <w:szCs w:val="28"/>
         </w:rPr>
         <w:t xml:space="preserve">  </w:t>
       </w:r>
       <w:r>
         <w:rPr>
           <w:rFonts w:ascii="Times New Roman" w:hAnsi="Times New Roman"/>
-          <w:sz w:val="26"/>
-          <w:szCs w:val="26"/>
+          <w:sz w:val="28"/>
+          <w:szCs w:val="28"/>
         </w:rPr>
         <w:t>Sinh ngày</w:t>
       </w:r>
       <w:r>
         <w:rPr>
           <w:rFonts w:ascii="Times New Roman" w:hAnsi="Times New Roman"/>
-          <w:sz w:val="26"/>
-          <w:szCs w:val="26"/>
+          <w:sz w:val="28"/>
+          <w:szCs w:val="28"/>
         </w:rPr>
         <w:t>: {{nsnt}}</w:t>
       </w:r>
       <w:r>
         <w:rPr>
           <w:rFonts w:ascii="Times New Roman" w:hAnsi="Times New Roman"/>
-          <w:sz w:val="26"/>
-          <w:szCs w:val="26"/>
+          <w:sz w:val="28"/>
+          <w:szCs w:val="28"/>
         </w:rPr>
         <w:t>.</w:t>
       </w:r>
@@ -597,58 +644,75 @@
     <w:p>
       <w:pPr>
         <w:pStyle w:val="ListParagraph"/>
+        <w:spacing w:after="0" w:line="288" w:lineRule="auto"/>
         <w:ind w:left="1140"/>
         <w:rPr>
           <w:rFonts w:ascii="Times New Roman" w:hAnsi="Times New Roman"/>
-          <w:sz w:val="26"/>
-          <w:szCs w:val="26"/>
-        </w:rPr>
-      </w:pPr>
-      <w:r>
-        <w:rPr>
-          <w:rFonts w:ascii="Times New Roman" w:hAnsi="Times New Roman"/>
-          <w:sz w:val="26"/>
-          <w:szCs w:val="26"/>
+          <w:sz w:val="28"/>
+          <w:szCs w:val="28"/>
+        </w:rPr>
+      </w:pPr>
+      <w:r>
+        <w:rPr>
+          <w:rFonts w:ascii="Times New Roman" w:hAnsi="Times New Roman"/>
+          <w:sz w:val="28"/>
+          <w:szCs w:val="28"/>
         </w:rPr>
         <w:t>Số</w:t>
       </w:r>
       <w:r>
         <w:rPr>
           <w:rFonts w:ascii="Times New Roman" w:hAnsi="Times New Roman"/>
-          <w:sz w:val="26"/>
-          <w:szCs w:val="26"/>
+          <w:sz w:val="28"/>
+          <w:szCs w:val="28"/>
         </w:rPr>
         <w:t xml:space="preserve"> CC/CCCD: {{cccdnt}}</w:t>
       </w:r>
       <w:r>
         <w:rPr>
           <w:rFonts w:ascii="Times New Roman" w:hAnsi="Times New Roman"/>
-          <w:sz w:val="26"/>
-          <w:szCs w:val="26"/>
+          <w:sz w:val="28"/>
+          <w:szCs w:val="28"/>
         </w:rPr>
         <w:t xml:space="preserve">                      </w:t>
       </w:r>
       <w:r>
         <w:rPr>
           <w:rFonts w:ascii="Times New Roman" w:hAnsi="Times New Roman"/>
-          <w:sz w:val="26"/>
-          <w:szCs w:val="26"/>
+          <w:sz w:val="28"/>
+          <w:szCs w:val="28"/>
+        </w:rPr>
+        <w:tab/>
+      </w:r>
+      <w:r>
+        <w:rPr>
+          <w:rFonts w:ascii="Times New Roman" w:hAnsi="Times New Roman"/>
+          <w:sz w:val="28"/>
+          <w:szCs w:val="28"/>
+        </w:rPr>
+        <w:tab/>
+      </w:r>
+      <w:r>
+        <w:rPr>
+          <w:rFonts w:ascii="Times New Roman" w:hAnsi="Times New Roman"/>
+          <w:sz w:val="28"/>
+          <w:szCs w:val="28"/>
         </w:rPr>
         <w:t>Ngày cấ</w:t>
       </w:r>
       <w:r>
         <w:rPr>
           <w:rFonts w:ascii="Times New Roman" w:hAnsi="Times New Roman"/>
-          <w:sz w:val="26"/>
-          <w:szCs w:val="26"/>
+          <w:sz w:val="28"/>
+          <w:szCs w:val="28"/>
         </w:rPr>
         <w:t>p: {{ncnt}}</w:t>
       </w:r>
       <w:r>
         <w:rPr>
           <w:rFonts w:ascii="Times New Roman" w:hAnsi="Times New Roman"/>
-          <w:sz w:val="26"/>
-          <w:szCs w:val="26"/>
+          <w:sz w:val="28"/>
+          <w:szCs w:val="28"/>
         </w:rPr>
         <w:t>.</w:t>
       </w:r>
@@ -656,18 +720,19 @@
     <w:p>
       <w:pPr>
         <w:pStyle w:val="ListParagraph"/>
+        <w:spacing w:after="0" w:line="288" w:lineRule="auto"/>
         <w:ind w:left="1140"/>
         <w:rPr>
           <w:rFonts w:ascii="Times New Roman" w:hAnsi="Times New Roman"/>
-          <w:sz w:val="26"/>
-          <w:szCs w:val="26"/>
-        </w:rPr>
-      </w:pPr>
-      <w:r>
-        <w:rPr>
-          <w:rFonts w:ascii="Times New Roman" w:hAnsi="Times New Roman"/>
-          <w:sz w:val="26"/>
-          <w:szCs w:val="26"/>
+          <w:sz w:val="28"/>
+          <w:szCs w:val="28"/>
+        </w:rPr>
+      </w:pPr>
+      <w:r>
+        <w:rPr>
+          <w:rFonts w:ascii="Times New Roman" w:hAnsi="Times New Roman"/>
+          <w:sz w:val="28"/>
+          <w:szCs w:val="28"/>
         </w:rPr>
         <w:t>Nơi cấp: {{nccccdnt}}.</w:t>
       </w:r>
@@ -675,34 +740,35 @@
     <w:p>
       <w:pPr>
         <w:pStyle w:val="ListParagraph"/>
+        <w:spacing w:after="0" w:line="288" w:lineRule="auto"/>
         <w:ind w:left="1140"/>
         <w:rPr>
           <w:rFonts w:ascii="Times New Roman" w:hAnsi="Times New Roman"/>
-          <w:sz w:val="26"/>
-          <w:szCs w:val="26"/>
-        </w:rPr>
-      </w:pPr>
-      <w:r>
-        <w:rPr>
-          <w:rFonts w:ascii="Times New Roman" w:hAnsi="Times New Roman"/>
-          <w:sz w:val="26"/>
-          <w:szCs w:val="26"/>
+          <w:sz w:val="28"/>
+          <w:szCs w:val="28"/>
+        </w:rPr>
+      </w:pPr>
+      <w:r>
+        <w:rPr>
+          <w:rFonts w:ascii="Times New Roman" w:hAnsi="Times New Roman"/>
+          <w:sz w:val="28"/>
+          <w:szCs w:val="28"/>
         </w:rPr>
         <w:t>Địa chỉ thườ</w:t>
       </w:r>
       <w:r>
         <w:rPr>
           <w:rFonts w:ascii="Times New Roman" w:hAnsi="Times New Roman"/>
-          <w:sz w:val="26"/>
-          <w:szCs w:val="26"/>
+          <w:sz w:val="28"/>
+          <w:szCs w:val="28"/>
         </w:rPr>
         <w:t>ng tr</w:t>
       </w:r>
       <w:r>
         <w:rPr>
           <w:rFonts w:ascii="Times New Roman" w:hAnsi="Times New Roman"/>
-          <w:sz w:val="26"/>
-          <w:szCs w:val="26"/>
+          <w:sz w:val="28"/>
+          <w:szCs w:val="28"/>
         </w:rPr>
         <w:t>ú: {{ttnt}}.</w:t>
       </w:r>
@@ -710,58 +776,59 @@
     <w:p>
       <w:pPr>
         <w:pStyle w:val="ListParagraph"/>
+        <w:spacing w:after="0" w:line="288" w:lineRule="auto"/>
         <w:ind w:left="1140"/>
         <w:rPr>
           <w:rFonts w:ascii="Times New Roman" w:hAnsi="Times New Roman"/>
-          <w:sz w:val="26"/>
-          <w:szCs w:val="26"/>
-        </w:rPr>
-      </w:pPr>
-      <w:r>
-        <w:rPr>
-          <w:rFonts w:ascii="Times New Roman" w:hAnsi="Times New Roman"/>
-          <w:sz w:val="26"/>
-          <w:szCs w:val="26"/>
+          <w:sz w:val="28"/>
+          <w:szCs w:val="28"/>
+        </w:rPr>
+      </w:pPr>
+      <w:r>
+        <w:rPr>
+          <w:rFonts w:ascii="Times New Roman" w:hAnsi="Times New Roman"/>
+          <w:sz w:val="28"/>
+          <w:szCs w:val="28"/>
         </w:rPr>
         <w:t>Hợp đồ</w:t>
       </w:r>
       <w:r>
         <w:rPr>
           <w:rFonts w:ascii="Times New Roman" w:hAnsi="Times New Roman"/>
-          <w:sz w:val="26"/>
-          <w:szCs w:val="26"/>
+          <w:sz w:val="28"/>
+          <w:szCs w:val="28"/>
         </w:rPr>
         <w:t>ng tín dụng</w:t>
       </w:r>
       <w:r>
         <w:rPr>
           <w:rFonts w:ascii="Times New Roman" w:hAnsi="Times New Roman"/>
-          <w:sz w:val="26"/>
-          <w:szCs w:val="26"/>
+          <w:sz w:val="28"/>
+          <w:szCs w:val="28"/>
         </w:rPr>
         <w:t xml:space="preserve"> số</w:t>
       </w:r>
       <w:r>
         <w:rPr>
           <w:rFonts w:ascii="Times New Roman" w:hAnsi="Times New Roman"/>
-          <w:sz w:val="26"/>
-          <w:szCs w:val="26"/>
+          <w:sz w:val="28"/>
+          <w:szCs w:val="28"/>
         </w:rPr>
         <w:t>: {{shdtd}}</w:t>
       </w:r>
       <w:r>
         <w:rPr>
           <w:rFonts w:ascii="Times New Roman" w:hAnsi="Times New Roman"/>
-          <w:sz w:val="26"/>
-          <w:szCs w:val="26"/>
+          <w:sz w:val="28"/>
+          <w:szCs w:val="28"/>
         </w:rPr>
         <w:t>/HĐTD</w:t>
       </w:r>
       <w:r>
         <w:rPr>
           <w:rFonts w:ascii="Times New Roman" w:hAnsi="Times New Roman"/>
-          <w:sz w:val="26"/>
-          <w:szCs w:val="26"/>
+          <w:sz w:val="28"/>
+          <w:szCs w:val="28"/>
         </w:rPr>
         <w:t xml:space="preserve"> ký ngày {{day}}/{{month}}/{{year}}.</w:t>
       </w:r>
@@ -769,18 +836,19 @@
     <w:p>
       <w:pPr>
         <w:pStyle w:val="ListParagraph"/>
+        <w:spacing w:after="0" w:line="288" w:lineRule="auto"/>
         <w:ind w:left="1140"/>
         <w:rPr>
           <w:rFonts w:ascii="Times New Roman" w:hAnsi="Times New Roman"/>
-          <w:sz w:val="26"/>
-          <w:szCs w:val="26"/>
-        </w:rPr>
-      </w:pPr>
-      <w:r>
-        <w:rPr>
-          <w:rFonts w:ascii="Times New Roman" w:hAnsi="Times New Roman"/>
-          <w:sz w:val="26"/>
-          <w:szCs w:val="26"/>
+          <w:sz w:val="28"/>
+          <w:szCs w:val="28"/>
+        </w:rPr>
+      </w:pPr>
+      <w:r>
+        <w:rPr>
+          <w:rFonts w:ascii="Times New Roman" w:hAnsi="Times New Roman"/>
+          <w:sz w:val="28"/>
+          <w:szCs w:val="28"/>
         </w:rPr>
         <w:t>{{thvGNN}}</w:t>
       </w:r>
@@ -788,18 +856,19 @@
     <w:p>
       <w:pPr>
         <w:pStyle w:val="ListParagraph"/>
+        <w:spacing w:after="0" w:line="288" w:lineRule="auto"/>
         <w:ind w:left="1140"/>
         <w:rPr>
           <w:rFonts w:ascii="Times New Roman" w:hAnsi="Times New Roman"/>
-          <w:sz w:val="26"/>
-          <w:szCs w:val="26"/>
-        </w:rPr>
-      </w:pPr>
-      <w:r>
-        <w:rPr>
-          <w:rFonts w:ascii="Times New Roman" w:hAnsi="Times New Roman"/>
-          <w:sz w:val="26"/>
-          <w:szCs w:val="26"/>
+          <w:sz w:val="28"/>
+          <w:szCs w:val="28"/>
+        </w:rPr>
+      </w:pPr>
+      <w:r>
+        <w:rPr>
+          <w:rFonts w:ascii="Times New Roman" w:hAnsi="Times New Roman"/>
+          <w:sz w:val="28"/>
+          <w:szCs w:val="28"/>
         </w:rPr>
         <w:t>{{tienGNN}}</w:t>
       </w:r>
@@ -807,18 +876,19 @@
     <w:p>
       <w:pPr>
         <w:pStyle w:val="ListParagraph"/>
+        <w:spacing w:after="0" w:line="288" w:lineRule="auto"/>
         <w:ind w:left="1140"/>
         <w:rPr>
           <w:rFonts w:ascii="Times New Roman" w:hAnsi="Times New Roman"/>
-          <w:sz w:val="26"/>
-          <w:szCs w:val="26"/>
-        </w:rPr>
-      </w:pPr>
-      <w:r>
-        <w:rPr>
-          <w:rFonts w:ascii="Times New Roman" w:hAnsi="Times New Roman"/>
-          <w:sz w:val="26"/>
-          <w:szCs w:val="26"/>
+          <w:sz w:val="28"/>
+          <w:szCs w:val="28"/>
+        </w:rPr>
+      </w:pPr>
+      <w:r>
+        <w:rPr>
+          <w:rFonts w:ascii="Times New Roman" w:hAnsi="Times New Roman"/>
+          <w:sz w:val="28"/>
+          <w:szCs w:val="28"/>
         </w:rPr>
         <w:t>Bằng chữ: {{tc}}.</w:t>
       </w:r>
@@ -830,33 +900,34 @@
           <w:ilvl w:val="1"/>
           <w:numId w:val="1"/>
         </w:numPr>
-        <w:rPr>
-          <w:rFonts w:ascii="Times New Roman" w:hAnsi="Times New Roman"/>
-          <w:sz w:val="26"/>
-          <w:szCs w:val="26"/>
-        </w:rPr>
-      </w:pPr>
-      <w:r>
-        <w:rPr>
-          <w:rFonts w:ascii="Times New Roman" w:hAnsi="Times New Roman"/>
-          <w:sz w:val="26"/>
-          <w:szCs w:val="26"/>
+        <w:spacing w:after="0" w:line="288" w:lineRule="auto"/>
+        <w:rPr>
+          <w:rFonts w:ascii="Times New Roman" w:hAnsi="Times New Roman"/>
+          <w:sz w:val="28"/>
+          <w:szCs w:val="28"/>
+        </w:rPr>
+      </w:pPr>
+      <w:r>
+        <w:rPr>
+          <w:rFonts w:ascii="Times New Roman" w:hAnsi="Times New Roman"/>
+          <w:sz w:val="28"/>
+          <w:szCs w:val="28"/>
         </w:rPr>
         <w:t>Việc chấp hành cam kết của khách hàng theo Hợp đồ</w:t>
       </w:r>
       <w:r>
         <w:rPr>
           <w:rFonts w:ascii="Times New Roman" w:hAnsi="Times New Roman"/>
-          <w:sz w:val="26"/>
-          <w:szCs w:val="26"/>
+          <w:sz w:val="28"/>
+          <w:szCs w:val="28"/>
         </w:rPr>
         <w:t>ng tín dụng</w:t>
       </w:r>
       <w:r>
         <w:rPr>
           <w:rFonts w:ascii="Times New Roman" w:hAnsi="Times New Roman"/>
-          <w:sz w:val="26"/>
-          <w:szCs w:val="26"/>
+          <w:sz w:val="28"/>
+          <w:szCs w:val="28"/>
         </w:rPr>
         <w:t>:</w:t>
       </w:r>
@@ -864,34 +935,35 @@
     <w:p>
       <w:pPr>
         <w:pStyle w:val="ListParagraph"/>
+        <w:spacing w:after="0" w:line="288" w:lineRule="auto"/>
         <w:ind w:left="1140"/>
         <w:rPr>
           <w:rFonts w:ascii="Times New Roman" w:hAnsi="Times New Roman"/>
-          <w:sz w:val="26"/>
-          <w:szCs w:val="26"/>
-        </w:rPr>
-      </w:pPr>
-      <w:r>
-        <w:rPr>
-          <w:rFonts w:ascii="Times New Roman" w:hAnsi="Times New Roman"/>
-          <w:sz w:val="26"/>
-          <w:szCs w:val="26"/>
+          <w:sz w:val="28"/>
+          <w:szCs w:val="28"/>
+        </w:rPr>
+      </w:pPr>
+      <w:r>
+        <w:rPr>
+          <w:rFonts w:ascii="Times New Roman" w:hAnsi="Times New Roman"/>
+          <w:sz w:val="28"/>
+          <w:szCs w:val="28"/>
         </w:rPr>
         <w:t>Chấp hành đúng các thỏa thuận, cam kết của Hợp đồ</w:t>
       </w:r>
       <w:r>
         <w:rPr>
           <w:rFonts w:ascii="Times New Roman" w:hAnsi="Times New Roman"/>
-          <w:sz w:val="26"/>
-          <w:szCs w:val="26"/>
+          <w:sz w:val="28"/>
+          <w:szCs w:val="28"/>
         </w:rPr>
         <w:t>ng tín dụng</w:t>
       </w:r>
       <w:r>
         <w:rPr>
           <w:rFonts w:ascii="Times New Roman" w:hAnsi="Times New Roman"/>
-          <w:sz w:val="26"/>
-          <w:szCs w:val="26"/>
+          <w:sz w:val="28"/>
+          <w:szCs w:val="28"/>
         </w:rPr>
         <w:t>.</w:t>
       </w:r>
@@ -903,33 +975,34 @@
           <w:ilvl w:val="1"/>
           <w:numId w:val="1"/>
         </w:numPr>
-        <w:rPr>
-          <w:rFonts w:ascii="Times New Roman" w:hAnsi="Times New Roman"/>
-          <w:sz w:val="26"/>
-          <w:szCs w:val="26"/>
-        </w:rPr>
-      </w:pPr>
-      <w:r>
-        <w:rPr>
-          <w:rFonts w:ascii="Times New Roman" w:hAnsi="Times New Roman"/>
-          <w:sz w:val="26"/>
-          <w:szCs w:val="26"/>
+        <w:spacing w:after="0" w:line="288" w:lineRule="auto"/>
+        <w:rPr>
+          <w:rFonts w:ascii="Times New Roman" w:hAnsi="Times New Roman"/>
+          <w:sz w:val="28"/>
+          <w:szCs w:val="28"/>
+        </w:rPr>
+      </w:pPr>
+      <w:r>
+        <w:rPr>
+          <w:rFonts w:ascii="Times New Roman" w:hAnsi="Times New Roman"/>
+          <w:sz w:val="28"/>
+          <w:szCs w:val="28"/>
         </w:rPr>
         <w:t>Mục đích sử dụ</w:t>
       </w:r>
       <w:r>
         <w:rPr>
           <w:rFonts w:ascii="Times New Roman" w:hAnsi="Times New Roman"/>
-          <w:sz w:val="26"/>
-          <w:szCs w:val="26"/>
+          <w:sz w:val="28"/>
+          <w:szCs w:val="28"/>
         </w:rPr>
         <w:t>ng: {{mdvay}}</w:t>
       </w:r>
       <w:r>
         <w:rPr>
           <w:rFonts w:ascii="Times New Roman" w:hAnsi="Times New Roman"/>
-          <w:sz w:val="26"/>
-          <w:szCs w:val="26"/>
+          <w:sz w:val="28"/>
+          <w:szCs w:val="28"/>
         </w:rPr>
         <w:t>.</w:t>
       </w:r>
@@ -941,17 +1014,18 @@
           <w:ilvl w:val="1"/>
           <w:numId w:val="1"/>
         </w:numPr>
-        <w:rPr>
-          <w:rFonts w:ascii="Times New Roman" w:hAnsi="Times New Roman"/>
-          <w:sz w:val="26"/>
-          <w:szCs w:val="26"/>
-        </w:rPr>
-      </w:pPr>
-      <w:r>
-        <w:rPr>
-          <w:rFonts w:ascii="Times New Roman" w:hAnsi="Times New Roman"/>
-          <w:sz w:val="26"/>
-          <w:szCs w:val="26"/>
+        <w:spacing w:after="0" w:line="288" w:lineRule="auto"/>
+        <w:rPr>
+          <w:rFonts w:ascii="Times New Roman" w:hAnsi="Times New Roman"/>
+          <w:sz w:val="28"/>
+          <w:szCs w:val="28"/>
+        </w:rPr>
+      </w:pPr>
+      <w:r>
+        <w:rPr>
+          <w:rFonts w:ascii="Times New Roman" w:hAnsi="Times New Roman"/>
+          <w:sz w:val="28"/>
+          <w:szCs w:val="28"/>
         </w:rPr>
         <w:t>Đánh giá phương án sử dụng vốn.</w:t>
       </w:r>
@@ -963,304 +1037,358 @@
           <w:ilvl w:val="0"/>
           <w:numId w:val="4"/>
         </w:numPr>
-        <w:rPr>
-          <w:rFonts w:ascii="Times New Roman" w:hAnsi="Times New Roman"/>
-          <w:sz w:val="26"/>
-          <w:szCs w:val="26"/>
-        </w:rPr>
-      </w:pPr>
-      <w:r>
-        <w:rPr>
-          <w:rFonts w:ascii="Times New Roman" w:hAnsi="Times New Roman"/>
-          <w:sz w:val="26"/>
-          <w:szCs w:val="26"/>
+        <w:spacing w:after="0" w:line="288" w:lineRule="auto"/>
+        <w:rPr>
+          <w:rFonts w:ascii="Times New Roman" w:hAnsi="Times New Roman"/>
+          <w:sz w:val="28"/>
+          <w:szCs w:val="28"/>
+        </w:rPr>
+      </w:pPr>
+      <w:r>
+        <w:rPr>
+          <w:rFonts w:ascii="Times New Roman" w:hAnsi="Times New Roman"/>
+          <w:sz w:val="28"/>
+          <w:szCs w:val="28"/>
         </w:rPr>
         <w:t xml:space="preserve">Tổng nhu cầu vốn của phương án = tổng chi phí của phương án – tổng chi phí gián tiếp:              </w:t>
       </w:r>
       <w:r>
         <w:rPr>
           <w:rFonts w:ascii="Times New Roman" w:hAnsi="Times New Roman"/>
-          <w:sz w:val="26"/>
-          <w:szCs w:val="26"/>
+          <w:sz w:val="28"/>
+          <w:szCs w:val="28"/>
         </w:rPr>
         <w:t xml:space="preserve">      </w:t>
       </w:r>
       <w:r>
         <w:rPr>
           <w:rFonts w:ascii="Times New Roman" w:hAnsi="Times New Roman"/>
-          <w:sz w:val="26"/>
-          <w:szCs w:val="26"/>
+          <w:sz w:val="28"/>
+          <w:szCs w:val="28"/>
         </w:rPr>
         <w:t xml:space="preserve">{{tongNCV}}           </w:t>
       </w:r>
       <w:r>
         <w:rPr>
           <w:rFonts w:ascii="Times New Roman" w:hAnsi="Times New Roman"/>
-          <w:sz w:val="26"/>
-          <w:szCs w:val="26"/>
+          <w:sz w:val="28"/>
+          <w:szCs w:val="28"/>
         </w:rPr>
         <w:t xml:space="preserve">          </w:t>
       </w:r>
       <w:r>
         <w:rPr>
           <w:rFonts w:ascii="Times New Roman" w:hAnsi="Times New Roman"/>
-          <w:sz w:val="26"/>
-          <w:szCs w:val="26"/>
+          <w:sz w:val="28"/>
+          <w:szCs w:val="28"/>
         </w:rPr>
         <w:t xml:space="preserve">     </w:t>
       </w:r>
       <w:r>
         <w:rPr>
           <w:rFonts w:ascii="Times New Roman" w:hAnsi="Times New Roman"/>
-          <w:sz w:val="26"/>
-          <w:szCs w:val="26"/>
+          <w:sz w:val="28"/>
+          <w:szCs w:val="28"/>
         </w:rPr>
         <w:t xml:space="preserve">   </w:t>
       </w:r>
       <w:r>
         <w:rPr>
           <w:rFonts w:ascii="Times New Roman" w:hAnsi="Times New Roman"/>
-          <w:sz w:val="26"/>
-          <w:szCs w:val="26"/>
+          <w:sz w:val="28"/>
+          <w:szCs w:val="28"/>
         </w:rPr>
         <w:t>đồng</w:t>
       </w:r>
     </w:p>
     <w:p>
       <w:pPr>
+        <w:spacing w:after="0" w:line="288" w:lineRule="auto"/>
         <w:ind w:left="1140"/>
         <w:rPr>
           <w:rFonts w:ascii="Times New Roman" w:hAnsi="Times New Roman"/>
-          <w:sz w:val="26"/>
-          <w:szCs w:val="26"/>
-        </w:rPr>
-      </w:pPr>
-      <w:r>
-        <w:rPr>
-          <w:rFonts w:ascii="Times New Roman" w:hAnsi="Times New Roman"/>
-          <w:sz w:val="26"/>
-          <w:szCs w:val="26"/>
+          <w:sz w:val="28"/>
+          <w:szCs w:val="28"/>
+        </w:rPr>
+      </w:pPr>
+      <w:r>
+        <w:rPr>
+          <w:rFonts w:ascii="Times New Roman" w:hAnsi="Times New Roman"/>
+          <w:sz w:val="28"/>
+          <w:szCs w:val="28"/>
         </w:rPr>
         <w:t>{{vongQuayGNN}}</w:t>
       </w:r>
     </w:p>
     <w:p>
       <w:pPr>
+        <w:spacing w:after="0" w:line="288" w:lineRule="auto"/>
         <w:ind w:left="1140"/>
         <w:rPr>
           <w:rFonts w:ascii="Times New Roman" w:hAnsi="Times New Roman"/>
-          <w:sz w:val="26"/>
-          <w:szCs w:val="26"/>
-        </w:rPr>
-      </w:pPr>
-      <w:r>
-        <w:rPr>
-          <w:rFonts w:ascii="Times New Roman" w:hAnsi="Times New Roman"/>
-          <w:sz w:val="26"/>
-          <w:szCs w:val="26"/>
+          <w:sz w:val="28"/>
+          <w:szCs w:val="28"/>
+        </w:rPr>
+      </w:pPr>
+      <w:r>
+        <w:rPr>
+          <w:rFonts w:ascii="Times New Roman" w:hAnsi="Times New Roman"/>
+          <w:sz w:val="28"/>
+          <w:szCs w:val="28"/>
         </w:rPr>
         <w:t>{{vld}}</w:t>
       </w:r>
     </w:p>
     <w:p>
       <w:pPr>
-        <w:rPr>
-          <w:rFonts w:ascii="Times New Roman" w:hAnsi="Times New Roman"/>
-          <w:sz w:val="26"/>
-          <w:szCs w:val="26"/>
-        </w:rPr>
-      </w:pPr>
-      <w:r>
-        <w:rPr>
-          <w:rFonts w:ascii="Times New Roman" w:hAnsi="Times New Roman"/>
-          <w:sz w:val="26"/>
-          <w:szCs w:val="26"/>
-        </w:rPr>
-        <w:t xml:space="preserve">                - </w:t>
-      </w:r>
-      <w:r>
-        <w:rPr>
-          <w:rFonts w:ascii="Times New Roman" w:hAnsi="Times New Roman"/>
-          <w:sz w:val="26"/>
-          <w:szCs w:val="26"/>
+        <w:spacing w:after="0" w:line="288" w:lineRule="auto"/>
+        <w:rPr>
+          <w:rFonts w:ascii="Times New Roman" w:hAnsi="Times New Roman"/>
+          <w:sz w:val="28"/>
+          <w:szCs w:val="28"/>
+        </w:rPr>
+      </w:pPr>
+      <w:r>
+        <w:rPr>
+          <w:rFonts w:ascii="Times New Roman" w:hAnsi="Times New Roman"/>
+          <w:sz w:val="28"/>
+          <w:szCs w:val="28"/>
+        </w:rPr>
+        <w:t xml:space="preserve">                </w:t>
+      </w:r>
+      <w:r>
+        <w:rPr>
+          <w:rFonts w:ascii="Times New Roman" w:hAnsi="Times New Roman"/>
+          <w:sz w:val="28"/>
+          <w:szCs w:val="28"/>
+        </w:rPr>
+        <w:t xml:space="preserve"> </w:t>
+      </w:r>
+      <w:r>
+        <w:rPr>
+          <w:rFonts w:ascii="Times New Roman" w:hAnsi="Times New Roman"/>
+          <w:sz w:val="28"/>
+          <w:szCs w:val="28"/>
+        </w:rPr>
+        <w:t xml:space="preserve">- </w:t>
+      </w:r>
+      <w:r>
+        <w:rPr>
+          <w:rFonts w:ascii="Times New Roman" w:hAnsi="Times New Roman"/>
+          <w:sz w:val="28"/>
+          <w:szCs w:val="28"/>
         </w:rPr>
         <w:t>Vốn tự</w:t>
       </w:r>
       <w:r>
         <w:rPr>
           <w:rFonts w:ascii="Times New Roman" w:hAnsi="Times New Roman"/>
-          <w:sz w:val="26"/>
-          <w:szCs w:val="26"/>
+          <w:sz w:val="28"/>
+          <w:szCs w:val="28"/>
         </w:rPr>
         <w:t xml:space="preserve"> có:                       </w:t>
       </w:r>
       <w:r>
         <w:rPr>
           <w:rFonts w:ascii="Times New Roman" w:hAnsi="Times New Roman"/>
-          <w:sz w:val="26"/>
-          <w:szCs w:val="26"/>
+          <w:sz w:val="28"/>
+          <w:szCs w:val="28"/>
         </w:rPr>
         <w:t xml:space="preserve">{{vonTuCo}}           </w:t>
       </w:r>
       <w:r>
         <w:rPr>
           <w:rFonts w:ascii="Times New Roman" w:hAnsi="Times New Roman"/>
-          <w:sz w:val="26"/>
-          <w:szCs w:val="26"/>
+          <w:sz w:val="28"/>
+          <w:szCs w:val="28"/>
         </w:rPr>
         <w:t xml:space="preserve">          </w:t>
       </w:r>
       <w:r>
         <w:rPr>
           <w:rFonts w:ascii="Times New Roman" w:hAnsi="Times New Roman"/>
-          <w:sz w:val="26"/>
-          <w:szCs w:val="26"/>
+          <w:sz w:val="28"/>
+          <w:szCs w:val="28"/>
         </w:rPr>
         <w:t xml:space="preserve">     </w:t>
       </w:r>
       <w:r>
         <w:rPr>
           <w:rFonts w:ascii="Times New Roman" w:hAnsi="Times New Roman"/>
-          <w:sz w:val="26"/>
-          <w:szCs w:val="26"/>
+          <w:sz w:val="28"/>
+          <w:szCs w:val="28"/>
         </w:rPr>
         <w:t xml:space="preserve">   </w:t>
       </w:r>
       <w:r>
         <w:rPr>
           <w:rFonts w:ascii="Times New Roman" w:hAnsi="Times New Roman"/>
-          <w:sz w:val="26"/>
-          <w:szCs w:val="26"/>
+          <w:sz w:val="28"/>
+          <w:szCs w:val="28"/>
         </w:rPr>
         <w:t>đồng</w:t>
       </w:r>
     </w:p>
     <w:p>
       <w:pPr>
-        <w:rPr>
-          <w:rFonts w:ascii="Times New Roman" w:hAnsi="Times New Roman"/>
-          <w:sz w:val="26"/>
-          <w:szCs w:val="26"/>
-        </w:rPr>
-      </w:pPr>
-      <w:r>
-        <w:rPr>
-          <w:rFonts w:ascii="Times New Roman" w:hAnsi="Times New Roman"/>
-          <w:sz w:val="26"/>
-          <w:szCs w:val="26"/>
-        </w:rPr>
-        <w:t xml:space="preserve">                - </w:t>
-      </w:r>
-      <w:r>
-        <w:rPr>
-          <w:rFonts w:ascii="Times New Roman" w:hAnsi="Times New Roman"/>
-          <w:sz w:val="26"/>
-          <w:szCs w:val="26"/>
+        <w:spacing w:after="0" w:line="288" w:lineRule="auto"/>
+        <w:rPr>
+          <w:rFonts w:ascii="Times New Roman" w:hAnsi="Times New Roman"/>
+          <w:sz w:val="28"/>
+          <w:szCs w:val="28"/>
+        </w:rPr>
+      </w:pPr>
+      <w:r>
+        <w:rPr>
+          <w:rFonts w:ascii="Times New Roman" w:hAnsi="Times New Roman"/>
+          <w:sz w:val="28"/>
+          <w:szCs w:val="28"/>
+        </w:rPr>
+        <w:t xml:space="preserve">                </w:t>
+      </w:r>
+      <w:r>
+        <w:rPr>
+          <w:rFonts w:ascii="Times New Roman" w:hAnsi="Times New Roman"/>
+          <w:sz w:val="28"/>
+          <w:szCs w:val="28"/>
+        </w:rPr>
+        <w:t xml:space="preserve"> </w:t>
+      </w:r>
+      <w:r>
+        <w:rPr>
+          <w:rFonts w:ascii="Times New Roman" w:hAnsi="Times New Roman"/>
+          <w:sz w:val="28"/>
+          <w:szCs w:val="28"/>
+        </w:rPr>
+        <w:t xml:space="preserve">- </w:t>
+      </w:r>
+      <w:r>
+        <w:rPr>
+          <w:rFonts w:ascii="Times New Roman" w:hAnsi="Times New Roman"/>
+          <w:sz w:val="28"/>
+          <w:szCs w:val="28"/>
         </w:rPr>
         <w:t xml:space="preserve">Vốn khác:                         {{vonKhac}}                             </w:t>
       </w:r>
       <w:r>
         <w:rPr>
           <w:rFonts w:ascii="Times New Roman" w:hAnsi="Times New Roman"/>
-          <w:sz w:val="26"/>
-          <w:szCs w:val="26"/>
+          <w:sz w:val="28"/>
+          <w:szCs w:val="28"/>
         </w:rPr>
         <w:t xml:space="preserve">  </w:t>
       </w:r>
       <w:r>
         <w:rPr>
           <w:rFonts w:ascii="Times New Roman" w:hAnsi="Times New Roman"/>
-          <w:sz w:val="26"/>
-          <w:szCs w:val="26"/>
+          <w:sz w:val="28"/>
+          <w:szCs w:val="28"/>
         </w:rPr>
         <w:t>đồng</w:t>
       </w:r>
     </w:p>
     <w:p>
       <w:pPr>
-        <w:rPr>
-          <w:rFonts w:ascii="Times New Roman" w:hAnsi="Times New Roman"/>
-          <w:sz w:val="26"/>
-          <w:szCs w:val="26"/>
-        </w:rPr>
-      </w:pPr>
-      <w:r>
-        <w:rPr>
-          <w:rFonts w:ascii="Times New Roman" w:hAnsi="Times New Roman"/>
-          <w:sz w:val="26"/>
-          <w:szCs w:val="26"/>
-        </w:rPr>
-        <w:t xml:space="preserve">                - </w:t>
-      </w:r>
-      <w:r>
-        <w:rPr>
-          <w:rFonts w:ascii="Times New Roman" w:hAnsi="Times New Roman"/>
-          <w:sz w:val="26"/>
-          <w:szCs w:val="26"/>
+        <w:spacing w:after="0" w:line="288" w:lineRule="auto"/>
+        <w:rPr>
+          <w:rFonts w:ascii="Times New Roman" w:hAnsi="Times New Roman"/>
+          <w:sz w:val="28"/>
+          <w:szCs w:val="28"/>
+        </w:rPr>
+      </w:pPr>
+      <w:r>
+        <w:rPr>
+          <w:rFonts w:ascii="Times New Roman" w:hAnsi="Times New Roman"/>
+          <w:sz w:val="28"/>
+          <w:szCs w:val="28"/>
+        </w:rPr>
+        <w:t xml:space="preserve">                </w:t>
+      </w:r>
+      <w:r>
+        <w:rPr>
+          <w:rFonts w:ascii="Times New Roman" w:hAnsi="Times New Roman"/>
+          <w:sz w:val="28"/>
+          <w:szCs w:val="28"/>
+        </w:rPr>
+        <w:t xml:space="preserve"> </w:t>
+      </w:r>
+      <w:r>
+        <w:rPr>
+          <w:rFonts w:ascii="Times New Roman" w:hAnsi="Times New Roman"/>
+          <w:sz w:val="28"/>
+          <w:szCs w:val="28"/>
+        </w:rPr>
+        <w:t xml:space="preserve">- </w:t>
+      </w:r>
+      <w:r>
+        <w:rPr>
+          <w:rFonts w:ascii="Times New Roman" w:hAnsi="Times New Roman"/>
+          <w:sz w:val="28"/>
+          <w:szCs w:val="28"/>
         </w:rPr>
         <w:t>Vốn xin vay của Quỹ</w:t>
       </w:r>
       <w:r>
         <w:rPr>
           <w:rFonts w:ascii="Times New Roman" w:hAnsi="Times New Roman"/>
-          <w:sz w:val="26"/>
-          <w:szCs w:val="26"/>
+          <w:sz w:val="28"/>
+          <w:szCs w:val="28"/>
         </w:rPr>
         <w:t xml:space="preserve">:     </w:t>
       </w:r>
       <w:r>
         <w:rPr>
           <w:rFonts w:ascii="Times New Roman" w:hAnsi="Times New Roman"/>
-          <w:sz w:val="26"/>
-          <w:szCs w:val="26"/>
+          <w:sz w:val="28"/>
+          <w:szCs w:val="28"/>
         </w:rPr>
         <w:t xml:space="preserve">{{tienso}}                </w:t>
       </w:r>
       <w:r>
         <w:rPr>
           <w:rFonts w:ascii="Times New Roman" w:hAnsi="Times New Roman"/>
-          <w:sz w:val="26"/>
-          <w:szCs w:val="26"/>
+          <w:sz w:val="28"/>
+          <w:szCs w:val="28"/>
         </w:rPr>
         <w:t xml:space="preserve">     </w:t>
       </w:r>
       <w:r>
         <w:rPr>
           <w:rFonts w:ascii="Times New Roman" w:hAnsi="Times New Roman"/>
-          <w:sz w:val="26"/>
-          <w:szCs w:val="26"/>
+          <w:sz w:val="28"/>
+          <w:szCs w:val="28"/>
         </w:rPr>
         <w:t xml:space="preserve"> </w:t>
       </w:r>
       <w:r>
         <w:rPr>
           <w:rFonts w:ascii="Times New Roman" w:hAnsi="Times New Roman"/>
-          <w:sz w:val="26"/>
-          <w:szCs w:val="26"/>
+          <w:sz w:val="28"/>
+          <w:szCs w:val="28"/>
         </w:rPr>
         <w:t xml:space="preserve">   </w:t>
       </w:r>
       <w:r>
         <w:rPr>
           <w:rFonts w:ascii="Times New Roman" w:hAnsi="Times New Roman"/>
-          <w:sz w:val="26"/>
-          <w:szCs w:val="26"/>
+          <w:sz w:val="28"/>
+          <w:szCs w:val="28"/>
         </w:rPr>
         <w:t xml:space="preserve">   </w:t>
       </w:r>
       <w:r>
         <w:rPr>
           <w:rFonts w:ascii="Times New Roman" w:hAnsi="Times New Roman"/>
-          <w:sz w:val="26"/>
-          <w:szCs w:val="26"/>
+          <w:sz w:val="28"/>
+          <w:szCs w:val="28"/>
         </w:rPr>
         <w:t xml:space="preserve"> </w:t>
       </w:r>
       <w:r>
         <w:rPr>
           <w:rFonts w:ascii="Times New Roman" w:hAnsi="Times New Roman"/>
-          <w:sz w:val="26"/>
-          <w:szCs w:val="26"/>
+          <w:sz w:val="28"/>
+          <w:szCs w:val="28"/>
         </w:rPr>
         <w:t>đồng</w:t>
       </w:r>
@@ -1272,17 +1400,18 @@
           <w:ilvl w:val="0"/>
           <w:numId w:val="4"/>
         </w:numPr>
-        <w:rPr>
-          <w:rFonts w:ascii="Times New Roman" w:hAnsi="Times New Roman"/>
-          <w:sz w:val="26"/>
-          <w:szCs w:val="26"/>
-        </w:rPr>
-      </w:pPr>
-      <w:r>
-        <w:rPr>
-          <w:rFonts w:ascii="Times New Roman" w:hAnsi="Times New Roman"/>
-          <w:sz w:val="26"/>
-          <w:szCs w:val="26"/>
+        <w:spacing w:after="0" w:line="288" w:lineRule="auto"/>
+        <w:rPr>
+          <w:rFonts w:ascii="Times New Roman" w:hAnsi="Times New Roman"/>
+          <w:sz w:val="28"/>
+          <w:szCs w:val="28"/>
+        </w:rPr>
+      </w:pPr>
+      <w:r>
+        <w:rPr>
+          <w:rFonts w:ascii="Times New Roman" w:hAnsi="Times New Roman"/>
+          <w:sz w:val="28"/>
+          <w:szCs w:val="28"/>
         </w:rPr>
         <w:t>Hiệu quả của phương án:</w:t>
       </w:r>
@@ -1294,57 +1423,58 @@
           <w:ilvl w:val="0"/>
           <w:numId w:val="5"/>
         </w:numPr>
-        <w:rPr>
-          <w:rFonts w:ascii="Times New Roman" w:hAnsi="Times New Roman"/>
-          <w:sz w:val="26"/>
-          <w:szCs w:val="26"/>
-        </w:rPr>
-      </w:pPr>
-      <w:r>
-        <w:rPr>
-          <w:rFonts w:ascii="Times New Roman" w:hAnsi="Times New Roman"/>
-          <w:sz w:val="26"/>
-          <w:szCs w:val="26"/>
+        <w:spacing w:after="0" w:line="288" w:lineRule="auto"/>
+        <w:rPr>
+          <w:rFonts w:ascii="Times New Roman" w:hAnsi="Times New Roman"/>
+          <w:sz w:val="28"/>
+          <w:szCs w:val="28"/>
+        </w:rPr>
+      </w:pPr>
+      <w:r>
+        <w:rPr>
+          <w:rFonts w:ascii="Times New Roman" w:hAnsi="Times New Roman"/>
+          <w:sz w:val="28"/>
+          <w:szCs w:val="28"/>
         </w:rPr>
         <w:t xml:space="preserve">Dự kiến thu nhập: </w:t>
       </w:r>
       <w:r>
         <w:rPr>
           <w:rFonts w:ascii="Times New Roman" w:hAnsi="Times New Roman"/>
-          <w:sz w:val="26"/>
-          <w:szCs w:val="26"/>
+          <w:sz w:val="28"/>
+          <w:szCs w:val="28"/>
         </w:rPr>
         <w:t xml:space="preserve">            {{tongDoanhThu}}</w:t>
       </w:r>
       <w:r>
         <w:rPr>
           <w:rFonts w:ascii="Times New Roman" w:hAnsi="Times New Roman"/>
-          <w:sz w:val="26"/>
-          <w:szCs w:val="26"/>
+          <w:sz w:val="28"/>
+          <w:szCs w:val="28"/>
         </w:rPr>
         <w:t xml:space="preserve">        </w:t>
       </w:r>
       <w:r>
         <w:rPr>
           <w:rFonts w:ascii="Times New Roman" w:hAnsi="Times New Roman"/>
-          <w:sz w:val="26"/>
-          <w:szCs w:val="26"/>
+          <w:sz w:val="28"/>
+          <w:szCs w:val="28"/>
         </w:rPr>
         <w:t xml:space="preserve">               </w:t>
       </w:r>
       <w:r>
         <w:rPr>
           <w:rFonts w:ascii="Times New Roman" w:hAnsi="Times New Roman"/>
-          <w:sz w:val="26"/>
-          <w:szCs w:val="26"/>
+          <w:sz w:val="28"/>
+          <w:szCs w:val="28"/>
         </w:rPr>
         <w:t xml:space="preserve">  </w:t>
       </w:r>
       <w:r>
         <w:rPr>
           <w:rFonts w:ascii="Times New Roman" w:hAnsi="Times New Roman"/>
-          <w:sz w:val="26"/>
-          <w:szCs w:val="26"/>
+          <w:sz w:val="28"/>
+          <w:szCs w:val="28"/>
         </w:rPr>
         <w:t>đồng</w:t>
       </w:r>
@@ -1356,41 +1486,42 @@
           <w:ilvl w:val="0"/>
           <w:numId w:val="5"/>
         </w:numPr>
-        <w:rPr>
-          <w:rFonts w:ascii="Times New Roman" w:hAnsi="Times New Roman"/>
-          <w:sz w:val="26"/>
-          <w:szCs w:val="26"/>
-        </w:rPr>
-      </w:pPr>
-      <w:r>
-        <w:rPr>
-          <w:rFonts w:ascii="Times New Roman" w:hAnsi="Times New Roman"/>
-          <w:sz w:val="26"/>
-          <w:szCs w:val="26"/>
+        <w:spacing w:after="0" w:line="288" w:lineRule="auto"/>
+        <w:rPr>
+          <w:rFonts w:ascii="Times New Roman" w:hAnsi="Times New Roman"/>
+          <w:sz w:val="28"/>
+          <w:szCs w:val="28"/>
+        </w:rPr>
+      </w:pPr>
+      <w:r>
+        <w:rPr>
+          <w:rFonts w:ascii="Times New Roman" w:hAnsi="Times New Roman"/>
+          <w:sz w:val="28"/>
+          <w:szCs w:val="28"/>
         </w:rPr>
         <w:t xml:space="preserve">Dự kiến chi phí:                {{tongChiPhi}}                 </w:t>
       </w:r>
       <w:r>
         <w:rPr>
           <w:rFonts w:ascii="Times New Roman" w:hAnsi="Times New Roman"/>
-          <w:sz w:val="26"/>
-          <w:szCs w:val="26"/>
+          <w:sz w:val="28"/>
+          <w:szCs w:val="28"/>
         </w:rPr>
         <w:t xml:space="preserve">   </w:t>
       </w:r>
       <w:r>
         <w:rPr>
           <w:rFonts w:ascii="Times New Roman" w:hAnsi="Times New Roman"/>
-          <w:sz w:val="26"/>
-          <w:szCs w:val="26"/>
+          <w:sz w:val="28"/>
+          <w:szCs w:val="28"/>
         </w:rPr>
         <w:t xml:space="preserve">     </w:t>
       </w:r>
       <w:r>
         <w:rPr>
           <w:rFonts w:ascii="Times New Roman" w:hAnsi="Times New Roman"/>
-          <w:sz w:val="26"/>
-          <w:szCs w:val="26"/>
+          <w:sz w:val="28"/>
+          <w:szCs w:val="28"/>
         </w:rPr>
         <w:t>đồng</w:t>
       </w:r>
@@ -1402,90 +1533,90 @@
           <w:ilvl w:val="0"/>
           <w:numId w:val="5"/>
         </w:numPr>
-        <w:rPr>
-          <w:rFonts w:ascii="Times New Roman" w:hAnsi="Times New Roman"/>
-          <w:sz w:val="26"/>
-          <w:szCs w:val="26"/>
-        </w:rPr>
-      </w:pPr>
-      <w:r>
-        <w:rPr>
-          <w:rFonts w:ascii="Times New Roman" w:hAnsi="Times New Roman"/>
-          <w:sz w:val="26"/>
-          <w:szCs w:val="26"/>
-        </w:rPr>
-        <w:lastRenderedPageBreak/>
+        <w:spacing w:after="0" w:line="288" w:lineRule="auto"/>
+        <w:rPr>
+          <w:rFonts w:ascii="Times New Roman" w:hAnsi="Times New Roman"/>
+          <w:sz w:val="28"/>
+          <w:szCs w:val="28"/>
+        </w:rPr>
+      </w:pPr>
+      <w:r>
+        <w:rPr>
+          <w:rFonts w:ascii="Times New Roman" w:hAnsi="Times New Roman"/>
+          <w:sz w:val="28"/>
+          <w:szCs w:val="28"/>
+        </w:rPr>
         <w:t>Chênh lệ</w:t>
       </w:r>
       <w:r>
         <w:rPr>
           <w:rFonts w:ascii="Times New Roman" w:hAnsi="Times New Roman"/>
-          <w:sz w:val="26"/>
-          <w:szCs w:val="26"/>
+          <w:sz w:val="28"/>
+          <w:szCs w:val="28"/>
         </w:rPr>
         <w:t xml:space="preserve">ch thu – chi         </w:t>
       </w:r>
       <w:r>
         <w:rPr>
           <w:rFonts w:ascii="Times New Roman" w:hAnsi="Times New Roman"/>
-          <w:sz w:val="26"/>
-          <w:szCs w:val="26"/>
+          <w:sz w:val="28"/>
+          <w:szCs w:val="28"/>
         </w:rPr>
         <w:t xml:space="preserve"> </w:t>
       </w:r>
       <w:r>
         <w:rPr>
           <w:rFonts w:ascii="Times New Roman" w:hAnsi="Times New Roman"/>
-          <w:sz w:val="26"/>
-          <w:szCs w:val="26"/>
+          <w:sz w:val="28"/>
+          <w:szCs w:val="28"/>
         </w:rPr>
         <w:t>{{loiNhuan}}</w:t>
       </w:r>
       <w:r>
         <w:rPr>
           <w:rFonts w:ascii="Times New Roman" w:hAnsi="Times New Roman"/>
-          <w:sz w:val="26"/>
-          <w:szCs w:val="26"/>
+          <w:sz w:val="28"/>
+          <w:szCs w:val="28"/>
         </w:rPr>
         <w:t xml:space="preserve">     </w:t>
       </w:r>
       <w:r>
         <w:rPr>
           <w:rFonts w:ascii="Times New Roman" w:hAnsi="Times New Roman"/>
-          <w:sz w:val="26"/>
-          <w:szCs w:val="26"/>
+          <w:sz w:val="28"/>
+          <w:szCs w:val="28"/>
         </w:rPr>
         <w:t xml:space="preserve">               </w:t>
       </w:r>
       <w:r>
         <w:rPr>
           <w:rFonts w:ascii="Times New Roman" w:hAnsi="Times New Roman"/>
-          <w:sz w:val="26"/>
-          <w:szCs w:val="26"/>
+          <w:sz w:val="28"/>
+          <w:szCs w:val="28"/>
         </w:rPr>
         <w:t xml:space="preserve">   </w:t>
       </w:r>
       <w:r>
         <w:rPr>
           <w:rFonts w:ascii="Times New Roman" w:hAnsi="Times New Roman"/>
-          <w:sz w:val="26"/>
-          <w:szCs w:val="26"/>
+          <w:sz w:val="28"/>
+          <w:szCs w:val="28"/>
         </w:rPr>
         <w:t xml:space="preserve">  </w:t>
       </w:r>
       <w:r>
         <w:rPr>
           <w:rFonts w:ascii="Times New Roman" w:hAnsi="Times New Roman"/>
-          <w:sz w:val="26"/>
-          <w:szCs w:val="26"/>
+          <w:sz w:val="28"/>
+          <w:szCs w:val="28"/>
         </w:rPr>
         <w:t xml:space="preserve">  </w:t>
       </w:r>
       <w:r>
         <w:rPr>
           <w:rFonts w:ascii="Times New Roman" w:hAnsi="Times New Roman"/>
-          <w:sz w:val="26"/>
-          <w:szCs w:val="26"/>
+          <w:sz w:val="28"/>
+          <w:szCs w:val="28"/>
         </w:rPr>
         <w:t>đồng</w:t>
       </w:r>
@@ -1497,18 +1628,20 @@
           <w:ilvl w:val="1"/>
           <w:numId w:val="1"/>
         </w:numPr>
-        <w:rPr>
-          <w:rFonts w:ascii="Times New Roman" w:hAnsi="Times New Roman"/>
-          <w:sz w:val="26"/>
-          <w:szCs w:val="26"/>
-        </w:rPr>
-      </w:pPr>
-      <w:r>
-        <w:rPr>
-          <w:rFonts w:ascii="Times New Roman" w:hAnsi="Times New Roman"/>
-          <w:sz w:val="26"/>
-          <w:szCs w:val="26"/>
-        </w:rPr>
+        <w:spacing w:after="0" w:line="288" w:lineRule="auto"/>
+        <w:rPr>
+          <w:rFonts w:ascii="Times New Roman" w:hAnsi="Times New Roman"/>
+          <w:sz w:val="28"/>
+          <w:szCs w:val="28"/>
+        </w:rPr>
+      </w:pPr>
+      <w:r>
+        <w:rPr>
+          <w:rFonts w:ascii="Times New Roman" w:hAnsi="Times New Roman"/>
+          <w:sz w:val="28"/>
+          <w:szCs w:val="28"/>
+        </w:rPr>
+        <w:lastRenderedPageBreak/>
         <w:t>Nguồn trả nợ</w:t>
       </w:r>
     </w:p>
@@ -1519,49 +1652,50 @@
           <w:ilvl w:val="0"/>
           <w:numId w:val="5"/>
         </w:numPr>
-        <w:rPr>
-          <w:rFonts w:ascii="Times New Roman" w:hAnsi="Times New Roman"/>
-          <w:sz w:val="26"/>
-          <w:szCs w:val="26"/>
-        </w:rPr>
-      </w:pPr>
-      <w:r>
-        <w:rPr>
-          <w:rFonts w:ascii="Times New Roman" w:hAnsi="Times New Roman"/>
-          <w:sz w:val="26"/>
-          <w:szCs w:val="26"/>
+        <w:spacing w:after="0" w:line="288" w:lineRule="auto"/>
+        <w:rPr>
+          <w:rFonts w:ascii="Times New Roman" w:hAnsi="Times New Roman"/>
+          <w:sz w:val="28"/>
+          <w:szCs w:val="28"/>
+        </w:rPr>
+      </w:pPr>
+      <w:r>
+        <w:rPr>
+          <w:rFonts w:ascii="Times New Roman" w:hAnsi="Times New Roman"/>
+          <w:sz w:val="28"/>
+          <w:szCs w:val="28"/>
         </w:rPr>
         <w:t xml:space="preserve">Từ thu nhập hoạt động của phương án:         </w:t>
       </w:r>
       <w:r>
         <w:rPr>
           <w:rFonts w:ascii="Times New Roman" w:hAnsi="Times New Roman"/>
-          <w:sz w:val="26"/>
-          <w:szCs w:val="26"/>
+          <w:sz w:val="28"/>
+          <w:szCs w:val="28"/>
         </w:rPr>
         <w:t xml:space="preserve">{{loiNhuan}}       </w:t>
       </w:r>
       <w:r>
         <w:rPr>
           <w:rFonts w:ascii="Times New Roman" w:hAnsi="Times New Roman"/>
-          <w:sz w:val="26"/>
-          <w:szCs w:val="26"/>
+          <w:sz w:val="28"/>
+          <w:szCs w:val="28"/>
         </w:rPr>
         <w:t xml:space="preserve">   </w:t>
       </w:r>
       <w:r>
         <w:rPr>
           <w:rFonts w:ascii="Times New Roman" w:hAnsi="Times New Roman"/>
-          <w:sz w:val="26"/>
-          <w:szCs w:val="26"/>
+          <w:sz w:val="28"/>
+          <w:szCs w:val="28"/>
         </w:rPr>
         <w:t>đồng</w:t>
       </w:r>
       <w:r>
         <w:rPr>
           <w:rFonts w:ascii="Times New Roman" w:hAnsi="Times New Roman"/>
-          <w:sz w:val="26"/>
-          <w:szCs w:val="26"/>
+          <w:sz w:val="28"/>
+          <w:szCs w:val="28"/>
         </w:rPr>
         <w:t xml:space="preserve">   </w:t>
       </w:r>
@@ -1573,33 +1707,34 @@
           <w:ilvl w:val="0"/>
           <w:numId w:val="5"/>
         </w:numPr>
-        <w:rPr>
-          <w:rFonts w:ascii="Times New Roman" w:hAnsi="Times New Roman"/>
-          <w:sz w:val="26"/>
-          <w:szCs w:val="26"/>
-        </w:rPr>
-      </w:pPr>
-      <w:r>
-        <w:rPr>
-          <w:rFonts w:ascii="Times New Roman" w:hAnsi="Times New Roman"/>
-          <w:sz w:val="26"/>
-          <w:szCs w:val="26"/>
+        <w:spacing w:after="0" w:line="288" w:lineRule="auto"/>
+        <w:rPr>
+          <w:rFonts w:ascii="Times New Roman" w:hAnsi="Times New Roman"/>
+          <w:sz w:val="28"/>
+          <w:szCs w:val="28"/>
+        </w:rPr>
+      </w:pPr>
+      <w:r>
+        <w:rPr>
+          <w:rFonts w:ascii="Times New Roman" w:hAnsi="Times New Roman"/>
+          <w:sz w:val="28"/>
+          <w:szCs w:val="28"/>
         </w:rPr>
         <w:t>Thu nhậ</w:t>
       </w:r>
       <w:r>
         <w:rPr>
           <w:rFonts w:ascii="Times New Roman" w:hAnsi="Times New Roman"/>
-          <w:sz w:val="26"/>
-          <w:szCs w:val="26"/>
+          <w:sz w:val="28"/>
+          <w:szCs w:val="28"/>
         </w:rPr>
         <w:t>p khác</w:t>
       </w:r>
       <w:r>
         <w:rPr>
           <w:rFonts w:ascii="Times New Roman" w:hAnsi="Times New Roman"/>
-          <w:sz w:val="26"/>
-          <w:szCs w:val="26"/>
+          <w:sz w:val="28"/>
+          <w:szCs w:val="28"/>
         </w:rPr>
         <w:t>:</w:t>
       </w:r>
@@ -1611,41 +1746,42 @@
           <w:ilvl w:val="0"/>
           <w:numId w:val="5"/>
         </w:numPr>
-        <w:rPr>
-          <w:rFonts w:ascii="Times New Roman" w:hAnsi="Times New Roman"/>
-          <w:sz w:val="26"/>
-          <w:szCs w:val="26"/>
-        </w:rPr>
-      </w:pPr>
-      <w:r>
-        <w:rPr>
-          <w:rFonts w:ascii="Times New Roman" w:hAnsi="Times New Roman"/>
-          <w:sz w:val="26"/>
-          <w:szCs w:val="26"/>
+        <w:spacing w:after="0" w:line="288" w:lineRule="auto"/>
+        <w:rPr>
+          <w:rFonts w:ascii="Times New Roman" w:hAnsi="Times New Roman"/>
+          <w:sz w:val="28"/>
+          <w:szCs w:val="28"/>
+        </w:rPr>
+      </w:pPr>
+      <w:r>
+        <w:rPr>
+          <w:rFonts w:ascii="Times New Roman" w:hAnsi="Times New Roman"/>
+          <w:sz w:val="28"/>
+          <w:szCs w:val="28"/>
         </w:rPr>
         <w:t xml:space="preserve">Thu hồi vốn đầu tư phương án:                     {{thuHoiVon}}   </w:t>
       </w:r>
       <w:r>
         <w:rPr>
           <w:rFonts w:ascii="Times New Roman" w:hAnsi="Times New Roman"/>
-          <w:sz w:val="26"/>
-          <w:szCs w:val="26"/>
+          <w:sz w:val="28"/>
+          <w:szCs w:val="28"/>
         </w:rPr>
         <w:t xml:space="preserve"> </w:t>
       </w:r>
       <w:r>
         <w:rPr>
           <w:rFonts w:ascii="Times New Roman" w:hAnsi="Times New Roman"/>
-          <w:sz w:val="26"/>
-          <w:szCs w:val="26"/>
+          <w:sz w:val="28"/>
+          <w:szCs w:val="28"/>
         </w:rPr>
         <w:t xml:space="preserve">   </w:t>
       </w:r>
       <w:r>
         <w:rPr>
           <w:rFonts w:ascii="Times New Roman" w:hAnsi="Times New Roman"/>
-          <w:sz w:val="26"/>
-          <w:szCs w:val="26"/>
+          <w:sz w:val="28"/>
+          <w:szCs w:val="28"/>
         </w:rPr>
         <w:t>đồng</w:t>
       </w:r>
@@ -1657,17 +1793,18 @@
           <w:ilvl w:val="1"/>
           <w:numId w:val="1"/>
         </w:numPr>
-        <w:rPr>
-          <w:rFonts w:ascii="Times New Roman" w:hAnsi="Times New Roman"/>
-          <w:sz w:val="26"/>
-          <w:szCs w:val="26"/>
-        </w:rPr>
-      </w:pPr>
-      <w:r>
-        <w:rPr>
-          <w:rFonts w:ascii="Times New Roman" w:hAnsi="Times New Roman"/>
-          <w:sz w:val="26"/>
-          <w:szCs w:val="26"/>
+        <w:spacing w:after="0" w:line="288" w:lineRule="auto"/>
+        <w:rPr>
+          <w:rFonts w:ascii="Times New Roman" w:hAnsi="Times New Roman"/>
+          <w:sz w:val="28"/>
+          <w:szCs w:val="28"/>
+        </w:rPr>
+      </w:pPr>
+      <w:r>
+        <w:rPr>
+          <w:rFonts w:ascii="Times New Roman" w:hAnsi="Times New Roman"/>
+          <w:sz w:val="28"/>
+          <w:szCs w:val="28"/>
         </w:rPr>
         <w:t>Đánh giá khả năng trả nợ:</w:t>
       </w:r>
@@ -1675,26 +1812,27 @@
     <w:p>
       <w:pPr>
         <w:pStyle w:val="ListParagraph"/>
+        <w:spacing w:after="0" w:line="288" w:lineRule="auto"/>
         <w:ind w:left="1140"/>
         <w:rPr>
           <w:rFonts w:ascii="Times New Roman" w:hAnsi="Times New Roman"/>
-          <w:sz w:val="26"/>
-          <w:szCs w:val="26"/>
-        </w:rPr>
-      </w:pPr>
-      <w:r>
-        <w:rPr>
-          <w:rFonts w:ascii="Times New Roman" w:hAnsi="Times New Roman"/>
-          <w:sz w:val="26"/>
-          <w:szCs w:val="26"/>
+          <w:sz w:val="28"/>
+          <w:szCs w:val="28"/>
+        </w:rPr>
+      </w:pPr>
+      <w:r>
+        <w:rPr>
+          <w:rFonts w:ascii="Times New Roman" w:hAnsi="Times New Roman"/>
+          <w:sz w:val="28"/>
+          <w:szCs w:val="28"/>
         </w:rPr>
         <w:t>Khách hàng có hoạt động sản xuất kinh doanh tốt, ổn định, đảm bảo khả năng trả nợ theo đúng thỏa thuận</w:t>
       </w:r>
       <w:r>
         <w:rPr>
           <w:rFonts w:ascii="Times New Roman" w:hAnsi="Times New Roman"/>
-          <w:sz w:val="26"/>
-          <w:szCs w:val="26"/>
+          <w:sz w:val="28"/>
+          <w:szCs w:val="28"/>
         </w:rPr>
         <w:t>.</w:t>
       </w:r>
@@ -1706,17 +1844,18 @@
           <w:ilvl w:val="1"/>
           <w:numId w:val="1"/>
         </w:numPr>
-        <w:rPr>
-          <w:rFonts w:ascii="Times New Roman" w:hAnsi="Times New Roman"/>
-          <w:sz w:val="26"/>
-          <w:szCs w:val="26"/>
-        </w:rPr>
-      </w:pPr>
-      <w:r>
-        <w:rPr>
-          <w:rFonts w:ascii="Times New Roman" w:hAnsi="Times New Roman"/>
-          <w:sz w:val="26"/>
-          <w:szCs w:val="26"/>
+        <w:spacing w:after="0" w:line="288" w:lineRule="auto"/>
+        <w:rPr>
+          <w:rFonts w:ascii="Times New Roman" w:hAnsi="Times New Roman"/>
+          <w:sz w:val="28"/>
+          <w:szCs w:val="28"/>
+        </w:rPr>
+      </w:pPr>
+      <w:r>
+        <w:rPr>
+          <w:rFonts w:ascii="Times New Roman" w:hAnsi="Times New Roman"/>
+          <w:sz w:val="28"/>
+          <w:szCs w:val="28"/>
         </w:rPr>
         <w:t>Đề nghị giải ngân.</w:t>
       </w:r>
@@ -1724,18 +1863,19 @@
     <w:p>
       <w:pPr>
         <w:pStyle w:val="ListParagraph"/>
+        <w:spacing w:after="0" w:line="288" w:lineRule="auto"/>
         <w:ind w:left="1140"/>
         <w:rPr>
           <w:rFonts w:ascii="Times New Roman" w:hAnsi="Times New Roman"/>
-          <w:sz w:val="26"/>
-          <w:szCs w:val="26"/>
-        </w:rPr>
-      </w:pPr>
-      <w:r>
-        <w:rPr>
-          <w:rFonts w:ascii="Times New Roman" w:hAnsi="Times New Roman"/>
-          <w:sz w:val="26"/>
-          <w:szCs w:val="26"/>
+          <w:sz w:val="28"/>
+          <w:szCs w:val="28"/>
+        </w:rPr>
+      </w:pPr>
+      <w:r>
+        <w:rPr>
+          <w:rFonts w:ascii="Times New Roman" w:hAnsi="Times New Roman"/>
+          <w:sz w:val="28"/>
+          <w:szCs w:val="28"/>
         </w:rPr>
         <w:t xml:space="preserve">Tôi: </w:t>
       </w:r>
@@ -1743,42 +1883,40 @@
         <w:rPr>
           <w:rFonts w:ascii="Times New Roman" w:hAnsi="Times New Roman"/>
           <w:b/>
-          <w:sz w:val="26"/>
-          <w:szCs w:val="26"/>
+          <w:sz w:val="28"/>
+          <w:szCs w:val="28"/>
         </w:rPr>
         <w:t>{{canBoTDVT}}</w:t>
       </w:r>
       <w:r>
         <w:rPr>
           <w:rFonts w:ascii="Times New Roman" w:hAnsi="Times New Roman"/>
-          <w:sz w:val="26"/>
-          <w:szCs w:val="26"/>
+          <w:sz w:val="28"/>
+          <w:szCs w:val="28"/>
         </w:rPr>
         <w:t xml:space="preserve"> </w:t>
       </w:r>
       <w:r>
         <w:rPr>
           <w:rFonts w:ascii="Times New Roman" w:hAnsi="Times New Roman"/>
-          <w:sz w:val="26"/>
-          <w:szCs w:val="26"/>
+          <w:sz w:val="28"/>
+          <w:szCs w:val="28"/>
         </w:rPr>
         <w:t>– Cán bộ</w:t>
       </w:r>
       <w:r>
         <w:rPr>
           <w:rFonts w:ascii="Times New Roman" w:hAnsi="Times New Roman"/>
-          <w:sz w:val="26"/>
-          <w:szCs w:val="26"/>
-        </w:rPr>
-        <w:t xml:space="preserve"> thẩm định</w:t>
-      </w:r>
-      <w:bookmarkStart w:id="0" w:name="_GoBack"/>
-      <w:bookmarkEnd w:id="0"/>
-      <w:r>
-        <w:rPr>
-          <w:rFonts w:ascii="Times New Roman" w:hAnsi="Times New Roman"/>
-          <w:sz w:val="26"/>
-          <w:szCs w:val="26"/>
+          <w:sz w:val="28"/>
+          <w:szCs w:val="28"/>
+        </w:rPr>
+        <w:t xml:space="preserve"> tín dụng</w:t>
+      </w:r>
+      <w:r>
+        <w:rPr>
+          <w:rFonts w:ascii="Times New Roman" w:hAnsi="Times New Roman"/>
+          <w:sz w:val="28"/>
+          <w:szCs w:val="28"/>
         </w:rPr>
         <w:t>, đề nghị giải ngân tiền vay theo mục 2, phần nhận nợ Giấy đề nghị này.</w:t>
       </w:r>
@@ -1790,19 +1928,20 @@
           <w:ilvl w:val="0"/>
           <w:numId w:val="1"/>
         </w:numPr>
+        <w:spacing w:after="0" w:line="288" w:lineRule="auto"/>
         <w:rPr>
           <w:rFonts w:ascii="Times New Roman" w:hAnsi="Times New Roman"/>
           <w:b/>
-          <w:sz w:val="26"/>
-          <w:szCs w:val="26"/>
+          <w:sz w:val="28"/>
+          <w:szCs w:val="28"/>
         </w:rPr>
       </w:pPr>
       <w:r>
         <w:rPr>
           <w:rFonts w:ascii="Times New Roman" w:hAnsi="Times New Roman"/>
           <w:b/>
-          <w:sz w:val="26"/>
-          <w:szCs w:val="26"/>
+          <w:sz w:val="28"/>
+          <w:szCs w:val="28"/>
         </w:rPr>
         <w:t>NHẬN NỢ</w:t>
       </w:r>
@@ -1814,49 +1953,50 @@
           <w:ilvl w:val="1"/>
           <w:numId w:val="1"/>
         </w:numPr>
-        <w:rPr>
-          <w:rFonts w:ascii="Times New Roman" w:hAnsi="Times New Roman"/>
-          <w:sz w:val="26"/>
-          <w:szCs w:val="26"/>
-        </w:rPr>
-      </w:pPr>
-      <w:r>
-        <w:rPr>
-          <w:rFonts w:ascii="Times New Roman" w:hAnsi="Times New Roman"/>
-          <w:sz w:val="26"/>
-          <w:szCs w:val="26"/>
+        <w:spacing w:after="0" w:line="288" w:lineRule="auto"/>
+        <w:rPr>
+          <w:rFonts w:ascii="Times New Roman" w:hAnsi="Times New Roman"/>
+          <w:sz w:val="28"/>
+          <w:szCs w:val="28"/>
+        </w:rPr>
+      </w:pPr>
+      <w:r>
+        <w:rPr>
+          <w:rFonts w:ascii="Times New Roman" w:hAnsi="Times New Roman"/>
+          <w:sz w:val="28"/>
+          <w:szCs w:val="28"/>
         </w:rPr>
         <w:t xml:space="preserve">Hợp đồng </w:t>
       </w:r>
       <w:r>
         <w:rPr>
           <w:rFonts w:ascii="Times New Roman" w:hAnsi="Times New Roman"/>
-          <w:sz w:val="26"/>
-          <w:szCs w:val="26"/>
+          <w:sz w:val="28"/>
+          <w:szCs w:val="28"/>
         </w:rPr>
         <w:t>tín dụng</w:t>
       </w:r>
       <w:r>
         <w:rPr>
           <w:rFonts w:ascii="Times New Roman" w:hAnsi="Times New Roman"/>
-          <w:sz w:val="26"/>
-          <w:szCs w:val="26"/>
+          <w:sz w:val="28"/>
+          <w:szCs w:val="28"/>
         </w:rPr>
         <w:t xml:space="preserve"> số: {{shdtd}}</w:t>
       </w:r>
       <w:r>
         <w:rPr>
           <w:rFonts w:ascii="Times New Roman" w:hAnsi="Times New Roman"/>
-          <w:sz w:val="26"/>
-          <w:szCs w:val="26"/>
+          <w:sz w:val="28"/>
+          <w:szCs w:val="28"/>
         </w:rPr>
         <w:t>/HĐTD</w:t>
       </w:r>
       <w:r>
         <w:rPr>
           <w:rFonts w:ascii="Times New Roman" w:hAnsi="Times New Roman"/>
-          <w:sz w:val="26"/>
-          <w:szCs w:val="26"/>
+          <w:sz w:val="28"/>
+          <w:szCs w:val="28"/>
         </w:rPr>
         <w:t xml:space="preserve"> ký ngày {{day}}/{{month}}/{{year}}.</w:t>
       </w:r>
@@ -1868,25 +2008,26 @@
           <w:ilvl w:val="1"/>
           <w:numId w:val="1"/>
         </w:numPr>
-        <w:rPr>
-          <w:rFonts w:ascii="Times New Roman" w:hAnsi="Times New Roman"/>
-          <w:sz w:val="26"/>
-          <w:szCs w:val="26"/>
-        </w:rPr>
-      </w:pPr>
-      <w:r>
-        <w:rPr>
-          <w:rFonts w:ascii="Times New Roman" w:hAnsi="Times New Roman"/>
-          <w:sz w:val="26"/>
-          <w:szCs w:val="26"/>
+        <w:spacing w:after="0" w:line="288" w:lineRule="auto"/>
+        <w:rPr>
+          <w:rFonts w:ascii="Times New Roman" w:hAnsi="Times New Roman"/>
+          <w:sz w:val="28"/>
+          <w:szCs w:val="28"/>
+        </w:rPr>
+      </w:pPr>
+      <w:r>
+        <w:rPr>
+          <w:rFonts w:ascii="Times New Roman" w:hAnsi="Times New Roman"/>
+          <w:sz w:val="28"/>
+          <w:szCs w:val="28"/>
         </w:rPr>
         <w:t>{{tienGNN}}</w:t>
       </w:r>
       <w:r>
         <w:rPr>
           <w:rFonts w:ascii="Times New Roman" w:hAnsi="Times New Roman"/>
-          <w:sz w:val="26"/>
-          <w:szCs w:val="26"/>
+          <w:sz w:val="28"/>
+          <w:szCs w:val="28"/>
         </w:rPr>
         <w:t>.</w:t>
       </w:r>
@@ -1894,20 +2035,21 @@
     <w:p>
       <w:pPr>
         <w:pStyle w:val="ListParagraph"/>
+        <w:spacing w:after="0" w:line="288" w:lineRule="auto"/>
         <w:ind w:left="1140"/>
         <w:rPr>
           <w:rFonts w:ascii="Times New Roman" w:hAnsi="Times New Roman"/>
           <w:i/>
-          <w:sz w:val="26"/>
-          <w:szCs w:val="26"/>
+          <w:sz w:val="28"/>
+          <w:szCs w:val="28"/>
         </w:rPr>
       </w:pPr>
       <w:r>
         <w:rPr>
           <w:rFonts w:ascii="Times New Roman" w:hAnsi="Times New Roman"/>
           <w:i/>
-          <w:sz w:val="26"/>
-          <w:szCs w:val="26"/>
+          <w:sz w:val="28"/>
+          <w:szCs w:val="28"/>
         </w:rPr>
         <w:t>(</w:t>
       </w:r>
@@ -1915,8 +2057,8 @@
         <w:rPr>
           <w:rFonts w:ascii="Times New Roman" w:hAnsi="Times New Roman"/>
           <w:i/>
-          <w:sz w:val="26"/>
-          <w:szCs w:val="26"/>
+          <w:sz w:val="28"/>
+          <w:szCs w:val="28"/>
         </w:rPr>
         <w:t>Bằng chữ</w:t>
       </w:r>
@@ -1924,8 +2066,8 @@
         <w:rPr>
           <w:rFonts w:ascii="Times New Roman" w:hAnsi="Times New Roman"/>
           <w:i/>
-          <w:sz w:val="26"/>
-          <w:szCs w:val="26"/>
+          <w:sz w:val="28"/>
+          <w:szCs w:val="28"/>
         </w:rPr>
         <w:t>: {{tc}})</w:t>
       </w:r>
@@ -1933,8 +2075,8 @@
         <w:rPr>
           <w:rFonts w:ascii="Times New Roman" w:hAnsi="Times New Roman"/>
           <w:i/>
-          <w:sz w:val="26"/>
-          <w:szCs w:val="26"/>
+          <w:sz w:val="28"/>
+          <w:szCs w:val="28"/>
         </w:rPr>
         <w:t>.</w:t>
       </w:r>
@@ -1946,41 +2088,42 @@
           <w:ilvl w:val="1"/>
           <w:numId w:val="1"/>
         </w:numPr>
-        <w:rPr>
-          <w:rFonts w:ascii="Times New Roman" w:hAnsi="Times New Roman"/>
-          <w:sz w:val="26"/>
-          <w:szCs w:val="26"/>
-        </w:rPr>
-      </w:pPr>
-      <w:r>
-        <w:rPr>
-          <w:rFonts w:ascii="Times New Roman" w:hAnsi="Times New Roman"/>
-          <w:sz w:val="26"/>
-          <w:szCs w:val="26"/>
+        <w:spacing w:after="0" w:line="288" w:lineRule="auto"/>
+        <w:rPr>
+          <w:rFonts w:ascii="Times New Roman" w:hAnsi="Times New Roman"/>
+          <w:sz w:val="28"/>
+          <w:szCs w:val="28"/>
+        </w:rPr>
+      </w:pPr>
+      <w:r>
+        <w:rPr>
+          <w:rFonts w:ascii="Times New Roman" w:hAnsi="Times New Roman"/>
+          <w:sz w:val="28"/>
+          <w:szCs w:val="28"/>
         </w:rPr>
         <w:t xml:space="preserve">Dư nợ trước nhận nợ  </w:t>
       </w:r>
       <w:r>
         <w:rPr>
           <w:rFonts w:ascii="Times New Roman" w:hAnsi="Times New Roman"/>
-          <w:sz w:val="26"/>
-          <w:szCs w:val="26"/>
+          <w:sz w:val="28"/>
+          <w:szCs w:val="28"/>
         </w:rPr>
         <w:t xml:space="preserve">                     </w:t>
       </w:r>
       <w:r>
         <w:rPr>
           <w:rFonts w:ascii="Times New Roman" w:hAnsi="Times New Roman"/>
-          <w:sz w:val="26"/>
-          <w:szCs w:val="26"/>
+          <w:sz w:val="28"/>
+          <w:szCs w:val="28"/>
         </w:rPr>
         <w:t>{{duNoTruoc}}</w:t>
       </w:r>
       <w:r>
         <w:rPr>
           <w:rFonts w:ascii="Times New Roman" w:hAnsi="Times New Roman"/>
-          <w:sz w:val="26"/>
-          <w:szCs w:val="26"/>
+          <w:sz w:val="28"/>
+          <w:szCs w:val="28"/>
         </w:rPr>
         <w:t xml:space="preserve"> đồng.</w:t>
       </w:r>
@@ -1988,20 +2131,21 @@
     <w:p>
       <w:pPr>
         <w:pStyle w:val="ListParagraph"/>
+        <w:spacing w:after="0" w:line="288" w:lineRule="auto"/>
         <w:ind w:left="1140"/>
         <w:rPr>
           <w:rFonts w:ascii="Times New Roman" w:hAnsi="Times New Roman"/>
           <w:i/>
-          <w:sz w:val="26"/>
-          <w:szCs w:val="26"/>
+          <w:sz w:val="28"/>
+          <w:szCs w:val="28"/>
         </w:rPr>
       </w:pPr>
       <w:r>
         <w:rPr>
           <w:rFonts w:ascii="Times New Roman" w:hAnsi="Times New Roman"/>
           <w:i/>
-          <w:sz w:val="26"/>
-          <w:szCs w:val="26"/>
+          <w:sz w:val="28"/>
+          <w:szCs w:val="28"/>
         </w:rPr>
         <w:t>(</w:t>
       </w:r>
@@ -2009,8 +2153,8 @@
         <w:rPr>
           <w:rFonts w:ascii="Times New Roman" w:hAnsi="Times New Roman"/>
           <w:i/>
-          <w:sz w:val="26"/>
-          <w:szCs w:val="26"/>
+          <w:sz w:val="28"/>
+          <w:szCs w:val="28"/>
         </w:rPr>
         <w:t>Bằng chữ</w:t>
       </w:r>
@@ -2018,8 +2162,8 @@
         <w:rPr>
           <w:rFonts w:ascii="Times New Roman" w:hAnsi="Times New Roman"/>
           <w:i/>
-          <w:sz w:val="26"/>
-          <w:szCs w:val="26"/>
+          <w:sz w:val="28"/>
+          <w:szCs w:val="28"/>
         </w:rPr>
         <w:t>: {{duNoTruocChu}})</w:t>
       </w:r>
@@ -2031,33 +2175,34 @@
           <w:ilvl w:val="1"/>
           <w:numId w:val="1"/>
         </w:numPr>
-        <w:rPr>
-          <w:rFonts w:ascii="Times New Roman" w:hAnsi="Times New Roman"/>
-          <w:sz w:val="26"/>
-          <w:szCs w:val="26"/>
-        </w:rPr>
-      </w:pPr>
-      <w:r>
-        <w:rPr>
-          <w:rFonts w:ascii="Times New Roman" w:hAnsi="Times New Roman"/>
-          <w:sz w:val="26"/>
-          <w:szCs w:val="26"/>
+        <w:spacing w:after="0" w:line="288" w:lineRule="auto"/>
+        <w:rPr>
+          <w:rFonts w:ascii="Times New Roman" w:hAnsi="Times New Roman"/>
+          <w:sz w:val="28"/>
+          <w:szCs w:val="28"/>
+        </w:rPr>
+      </w:pPr>
+      <w:r>
+        <w:rPr>
+          <w:rFonts w:ascii="Times New Roman" w:hAnsi="Times New Roman"/>
+          <w:sz w:val="28"/>
+          <w:szCs w:val="28"/>
         </w:rPr>
         <w:t>Số tiền nhận nợ lầ</w:t>
       </w:r>
       <w:r>
         <w:rPr>
           <w:rFonts w:ascii="Times New Roman" w:hAnsi="Times New Roman"/>
-          <w:sz w:val="26"/>
-          <w:szCs w:val="26"/>
+          <w:sz w:val="28"/>
+          <w:szCs w:val="28"/>
         </w:rPr>
         <w:t>n này:  {{tienVayLai}}</w:t>
       </w:r>
       <w:r>
         <w:rPr>
           <w:rFonts w:ascii="Times New Roman" w:hAnsi="Times New Roman"/>
-          <w:sz w:val="26"/>
-          <w:szCs w:val="26"/>
+          <w:sz w:val="28"/>
+          <w:szCs w:val="28"/>
         </w:rPr>
         <w:t xml:space="preserve"> đồng</w:t>
       </w:r>
@@ -2065,18 +2210,19 @@
     <w:p>
       <w:pPr>
         <w:pStyle w:val="ListParagraph"/>
+        <w:spacing w:after="0" w:line="288" w:lineRule="auto"/>
         <w:ind w:left="1140"/>
         <w:rPr>
           <w:rFonts w:ascii="Times New Roman" w:hAnsi="Times New Roman"/>
-          <w:sz w:val="26"/>
-          <w:szCs w:val="26"/>
-        </w:rPr>
-      </w:pPr>
-      <w:r>
-        <w:rPr>
-          <w:rFonts w:ascii="Times New Roman" w:hAnsi="Times New Roman"/>
-          <w:sz w:val="26"/>
-          <w:szCs w:val="26"/>
+          <w:sz w:val="28"/>
+          <w:szCs w:val="28"/>
+        </w:rPr>
+      </w:pPr>
+      <w:r>
+        <w:rPr>
+          <w:rFonts w:ascii="Times New Roman" w:hAnsi="Times New Roman"/>
+          <w:sz w:val="28"/>
+          <w:szCs w:val="28"/>
         </w:rPr>
         <w:t>(</w:t>
       </w:r>
@@ -2084,8 +2230,8 @@
         <w:rPr>
           <w:rFonts w:ascii="Times New Roman" w:hAnsi="Times New Roman"/>
           <w:i/>
-          <w:sz w:val="26"/>
-          <w:szCs w:val="26"/>
+          <w:sz w:val="28"/>
+          <w:szCs w:val="28"/>
         </w:rPr>
         <w:t>Bằng chữ</w:t>
       </w:r>
@@ -2093,8 +2239,8 @@
         <w:rPr>
           <w:rFonts w:ascii="Times New Roman" w:hAnsi="Times New Roman"/>
           <w:i/>
-          <w:sz w:val="26"/>
-          <w:szCs w:val="26"/>
+          <w:sz w:val="28"/>
+          <w:szCs w:val="28"/>
         </w:rPr>
         <w:t>: {{tienVayLaiChu}})</w:t>
       </w:r>
@@ -2106,33 +2252,34 @@
           <w:ilvl w:val="1"/>
           <w:numId w:val="1"/>
         </w:numPr>
-        <w:rPr>
-          <w:rFonts w:ascii="Times New Roman" w:hAnsi="Times New Roman"/>
-          <w:sz w:val="26"/>
-          <w:szCs w:val="26"/>
-        </w:rPr>
-      </w:pPr>
-      <w:r>
-        <w:rPr>
-          <w:rFonts w:ascii="Times New Roman" w:hAnsi="Times New Roman"/>
-          <w:sz w:val="26"/>
-          <w:szCs w:val="26"/>
+        <w:spacing w:after="0" w:line="288" w:lineRule="auto"/>
+        <w:rPr>
+          <w:rFonts w:ascii="Times New Roman" w:hAnsi="Times New Roman"/>
+          <w:sz w:val="28"/>
+          <w:szCs w:val="28"/>
+        </w:rPr>
+      </w:pPr>
+      <w:r>
+        <w:rPr>
+          <w:rFonts w:ascii="Times New Roman" w:hAnsi="Times New Roman"/>
+          <w:sz w:val="28"/>
+          <w:szCs w:val="28"/>
         </w:rPr>
         <w:t>Dư nợ sau nhận nợ</w:t>
       </w:r>
       <w:r>
         <w:rPr>
           <w:rFonts w:ascii="Times New Roman" w:hAnsi="Times New Roman"/>
-          <w:sz w:val="26"/>
-          <w:szCs w:val="26"/>
+          <w:sz w:val="28"/>
+          <w:szCs w:val="28"/>
         </w:rPr>
         <w:t>: {{duNoSau}}</w:t>
       </w:r>
       <w:r>
         <w:rPr>
           <w:rFonts w:ascii="Times New Roman" w:hAnsi="Times New Roman"/>
-          <w:sz w:val="26"/>
-          <w:szCs w:val="26"/>
+          <w:sz w:val="28"/>
+          <w:szCs w:val="28"/>
         </w:rPr>
         <w:t xml:space="preserve"> đồng.</w:t>
       </w:r>
@@ -2140,20 +2287,21 @@
     <w:p>
       <w:pPr>
         <w:pStyle w:val="ListParagraph"/>
+        <w:spacing w:after="0" w:line="288" w:lineRule="auto"/>
         <w:ind w:left="1140"/>
         <w:rPr>
           <w:rFonts w:ascii="Times New Roman" w:hAnsi="Times New Roman"/>
           <w:i/>
-          <w:sz w:val="26"/>
-          <w:szCs w:val="26"/>
+          <w:sz w:val="28"/>
+          <w:szCs w:val="28"/>
         </w:rPr>
       </w:pPr>
       <w:r>
         <w:rPr>
           <w:rFonts w:ascii="Times New Roman" w:hAnsi="Times New Roman"/>
           <w:i/>
-          <w:sz w:val="26"/>
-          <w:szCs w:val="26"/>
+          <w:sz w:val="28"/>
+          <w:szCs w:val="28"/>
         </w:rPr>
         <w:t>(Bằng chữ: {{duNoSauChu}})</w:t>
       </w:r>
@@ -2165,25 +2313,26 @@
           <w:ilvl w:val="1"/>
           <w:numId w:val="1"/>
         </w:numPr>
-        <w:rPr>
-          <w:rFonts w:ascii="Times New Roman" w:hAnsi="Times New Roman"/>
-          <w:sz w:val="26"/>
-          <w:szCs w:val="26"/>
-        </w:rPr>
-      </w:pPr>
-      <w:r>
-        <w:rPr>
-          <w:rFonts w:ascii="Times New Roman" w:hAnsi="Times New Roman"/>
-          <w:sz w:val="26"/>
-          <w:szCs w:val="26"/>
+        <w:spacing w:after="0" w:line="288" w:lineRule="auto"/>
+        <w:rPr>
+          <w:rFonts w:ascii="Times New Roman" w:hAnsi="Times New Roman"/>
+          <w:sz w:val="28"/>
+          <w:szCs w:val="28"/>
+        </w:rPr>
+      </w:pPr>
+      <w:r>
+        <w:rPr>
+          <w:rFonts w:ascii="Times New Roman" w:hAnsi="Times New Roman"/>
+          <w:sz w:val="28"/>
+          <w:szCs w:val="28"/>
         </w:rPr>
         <w:t xml:space="preserve">Thời hạn vay: </w:t>
       </w:r>
       <w:r>
         <w:rPr>
           <w:rFonts w:ascii="Times New Roman" w:hAnsi="Times New Roman"/>
-          <w:sz w:val="26"/>
-          <w:szCs w:val="26"/>
+          <w:sz w:val="28"/>
+          <w:szCs w:val="28"/>
         </w:rPr>
         <w:t>{{thv}} năm.</w:t>
       </w:r>
@@ -2195,17 +2344,18 @@
           <w:ilvl w:val="1"/>
           <w:numId w:val="1"/>
         </w:numPr>
-        <w:rPr>
-          <w:rFonts w:ascii="Times New Roman" w:hAnsi="Times New Roman"/>
-          <w:sz w:val="26"/>
-          <w:szCs w:val="26"/>
-        </w:rPr>
-      </w:pPr>
-      <w:r>
-        <w:rPr>
-          <w:rFonts w:ascii="Times New Roman" w:hAnsi="Times New Roman"/>
-          <w:sz w:val="26"/>
-          <w:szCs w:val="26"/>
+        <w:spacing w:after="0" w:line="288" w:lineRule="auto"/>
+        <w:rPr>
+          <w:rFonts w:ascii="Times New Roman" w:hAnsi="Times New Roman"/>
+          <w:sz w:val="28"/>
+          <w:szCs w:val="28"/>
+        </w:rPr>
+      </w:pPr>
+      <w:r>
+        <w:rPr>
+          <w:rFonts w:ascii="Times New Roman" w:hAnsi="Times New Roman"/>
+          <w:sz w:val="28"/>
+          <w:szCs w:val="28"/>
         </w:rPr>
         <w:t>Lãi suất cho vay lần này là {{ls}}. Lãi suất quá hạn: 150%. Lãi suất chậm trả lãi : 9%/năm.</w:t>
       </w:r>
@@ -2217,17 +2367,18 @@
           <w:ilvl w:val="1"/>
           <w:numId w:val="1"/>
         </w:numPr>
-        <w:rPr>
-          <w:rFonts w:ascii="Times New Roman" w:hAnsi="Times New Roman"/>
-          <w:sz w:val="26"/>
-          <w:szCs w:val="26"/>
-        </w:rPr>
-      </w:pPr>
-      <w:r>
-        <w:rPr>
-          <w:rFonts w:ascii="Times New Roman" w:hAnsi="Times New Roman"/>
-          <w:sz w:val="26"/>
-          <w:szCs w:val="26"/>
+        <w:spacing w:after="0" w:line="288" w:lineRule="auto"/>
+        <w:rPr>
+          <w:rFonts w:ascii="Times New Roman" w:hAnsi="Times New Roman"/>
+          <w:sz w:val="28"/>
+          <w:szCs w:val="28"/>
+        </w:rPr>
+      </w:pPr>
+      <w:r>
+        <w:rPr>
+          <w:rFonts w:ascii="Times New Roman" w:hAnsi="Times New Roman"/>
+          <w:sz w:val="28"/>
+          <w:szCs w:val="28"/>
         </w:rPr>
         <w:t>Định kỳ trả lãi tiền vay: Trả lãi tiền vay theo thỏa thuận tại hợp đồng cho vay.</w:t>
       </w:r>
@@ -2239,62 +2390,65 @@
           <w:ilvl w:val="1"/>
           <w:numId w:val="1"/>
         </w:numPr>
-        <w:rPr>
-          <w:rFonts w:ascii="Times New Roman" w:hAnsi="Times New Roman"/>
-          <w:sz w:val="26"/>
-          <w:szCs w:val="26"/>
-        </w:rPr>
-      </w:pPr>
-      <w:r>
-        <w:rPr>
-          <w:rFonts w:ascii="Times New Roman" w:hAnsi="Times New Roman"/>
-          <w:sz w:val="26"/>
-          <w:szCs w:val="26"/>
+        <w:spacing w:after="0" w:line="288" w:lineRule="auto"/>
+        <w:rPr>
+          <w:rFonts w:ascii="Times New Roman" w:hAnsi="Times New Roman"/>
+          <w:sz w:val="28"/>
+          <w:szCs w:val="28"/>
+        </w:rPr>
+      </w:pPr>
+      <w:r>
+        <w:rPr>
+          <w:rFonts w:ascii="Times New Roman" w:hAnsi="Times New Roman"/>
+          <w:sz w:val="28"/>
+          <w:szCs w:val="28"/>
         </w:rPr>
         <w:t>Phương thức giả</w:t>
       </w:r>
       <w:r>
         <w:rPr>
           <w:rFonts w:ascii="Times New Roman" w:hAnsi="Times New Roman"/>
-          <w:sz w:val="26"/>
-          <w:szCs w:val="26"/>
+          <w:sz w:val="28"/>
+          <w:szCs w:val="28"/>
         </w:rPr>
         <w:t>i ngân: {{nguoiChuyenKhoan}}</w:t>
       </w:r>
     </w:p>
     <w:p>
       <w:pPr>
+        <w:spacing w:after="0" w:line="288" w:lineRule="auto"/>
         <w:ind w:left="720"/>
         <w:rPr>
           <w:rFonts w:ascii="Times New Roman" w:hAnsi="Times New Roman"/>
-          <w:sz w:val="26"/>
-          <w:szCs w:val="26"/>
-        </w:rPr>
-      </w:pPr>
-      <w:r>
-        <w:rPr>
-          <w:rFonts w:ascii="Times New Roman" w:hAnsi="Times New Roman"/>
-          <w:sz w:val="26"/>
-          <w:szCs w:val="26"/>
+          <w:sz w:val="28"/>
+          <w:szCs w:val="28"/>
+        </w:rPr>
+      </w:pPr>
+      <w:r>
+        <w:rPr>
+          <w:rFonts w:ascii="Times New Roman" w:hAnsi="Times New Roman"/>
+          <w:sz w:val="28"/>
+          <w:szCs w:val="28"/>
         </w:rPr>
         <w:t>Báo cáo đề nghị giải ngân kiêm giấy nhận nợ được thành lập thành 02 bản có giá trị pháp lý như nhau, mỗi bên giữ 01 bản.</w:t>
       </w:r>
     </w:p>
     <w:p>
       <w:pPr>
+        <w:spacing w:after="0" w:line="288" w:lineRule="auto"/>
         <w:rPr>
           <w:rFonts w:ascii="Times New Roman" w:hAnsi="Times New Roman"/>
           <w:b/>
-          <w:sz w:val="26"/>
-          <w:szCs w:val="26"/>
+          <w:sz w:val="28"/>
+          <w:szCs w:val="28"/>
         </w:rPr>
       </w:pPr>
       <w:r>
         <w:rPr>
           <w:rFonts w:ascii="Times New Roman" w:hAnsi="Times New Roman"/>
           <w:b/>
-          <w:sz w:val="26"/>
-          <w:szCs w:val="26"/>
+          <w:sz w:val="28"/>
+          <w:szCs w:val="28"/>
         </w:rPr>
         <w:t>Người nhận nợ</w:t>
       </w:r>
@@ -2302,8 +2456,8 @@
         <w:rPr>
           <w:rFonts w:ascii="Times New Roman" w:hAnsi="Times New Roman"/>
           <w:b/>
-          <w:sz w:val="26"/>
-          <w:szCs w:val="26"/>
+          <w:sz w:val="28"/>
+          <w:szCs w:val="28"/>
         </w:rPr>
         <w:tab/>
       </w:r>
@@ -2311,8 +2465,8 @@
         <w:rPr>
           <w:rFonts w:ascii="Times New Roman" w:hAnsi="Times New Roman"/>
           <w:b/>
-          <w:sz w:val="26"/>
-          <w:szCs w:val="26"/>
+          <w:sz w:val="28"/>
+          <w:szCs w:val="28"/>
         </w:rPr>
         <w:t xml:space="preserve">   </w:t>
       </w:r>
@@ -2320,8 +2474,8 @@
         <w:rPr>
           <w:rFonts w:ascii="Times New Roman" w:hAnsi="Times New Roman"/>
           <w:b/>
-          <w:sz w:val="26"/>
-          <w:szCs w:val="26"/>
+          <w:sz w:val="28"/>
+          <w:szCs w:val="28"/>
         </w:rPr>
         <w:t>Cán bộ</w:t>
       </w:r>
@@ -2329,17 +2483,17 @@
         <w:rPr>
           <w:rFonts w:ascii="Times New Roman" w:hAnsi="Times New Roman"/>
           <w:b/>
-          <w:sz w:val="26"/>
-          <w:szCs w:val="26"/>
-        </w:rPr>
-        <w:t xml:space="preserve"> thẩm định</w:t>
+          <w:sz w:val="28"/>
+          <w:szCs w:val="28"/>
+        </w:rPr>
+        <w:t xml:space="preserve"> tín dụng</w:t>
       </w:r>
       <w:r>
         <w:rPr>
           <w:rFonts w:ascii="Times New Roman" w:hAnsi="Times New Roman"/>
           <w:b/>
-          <w:sz w:val="26"/>
-          <w:szCs w:val="26"/>
+          <w:sz w:val="28"/>
+          <w:szCs w:val="28"/>
         </w:rPr>
         <w:tab/>
         <w:t xml:space="preserve">      </w:t>
@@ -2348,8 +2502,8 @@
         <w:rPr>
           <w:rFonts w:ascii="Times New Roman" w:hAnsi="Times New Roman"/>
           <w:b/>
-          <w:sz w:val="26"/>
-          <w:szCs w:val="26"/>
+          <w:sz w:val="28"/>
+          <w:szCs w:val="28"/>
         </w:rPr>
         <w:t xml:space="preserve">   </w:t>
       </w:r>
@@ -2357,8 +2511,17 @@
         <w:rPr>
           <w:rFonts w:ascii="Times New Roman" w:hAnsi="Times New Roman"/>
           <w:b/>
-          <w:sz w:val="26"/>
-          <w:szCs w:val="26"/>
+          <w:sz w:val="28"/>
+          <w:szCs w:val="28"/>
+        </w:rPr>
+        <w:t xml:space="preserve">           </w:t>
+      </w:r>
+      <w:r>
+        <w:rPr>
+          <w:rFonts w:ascii="Times New Roman" w:hAnsi="Times New Roman"/>
+          <w:b/>
+          <w:sz w:val="28"/>
+          <w:szCs w:val="28"/>
         </w:rPr>
         <w:t>Kế</w:t>
       </w:r>
@@ -2366,8 +2529,8 @@
         <w:rPr>
           <w:rFonts w:ascii="Times New Roman" w:hAnsi="Times New Roman"/>
           <w:b/>
-          <w:sz w:val="26"/>
-          <w:szCs w:val="26"/>
+          <w:sz w:val="28"/>
+          <w:szCs w:val="28"/>
         </w:rPr>
         <w:t xml:space="preserve"> </w:t>
       </w:r>
@@ -2375,8 +2538,8 @@
         <w:rPr>
           <w:rFonts w:ascii="Times New Roman" w:hAnsi="Times New Roman"/>
           <w:b/>
-          <w:sz w:val="26"/>
-          <w:szCs w:val="26"/>
+          <w:sz w:val="28"/>
+          <w:szCs w:val="28"/>
         </w:rPr>
         <w:t>toán</w:t>
       </w:r>
@@ -2384,8 +2547,8 @@
         <w:rPr>
           <w:rFonts w:ascii="Times New Roman" w:hAnsi="Times New Roman"/>
           <w:b/>
-          <w:sz w:val="26"/>
-          <w:szCs w:val="26"/>
+          <w:sz w:val="28"/>
+          <w:szCs w:val="28"/>
         </w:rPr>
         <w:tab/>
         <w:t xml:space="preserve">          </w:t>
@@ -2394,27 +2557,37 @@
         <w:rPr>
           <w:rFonts w:ascii="Times New Roman" w:hAnsi="Times New Roman"/>
           <w:b/>
-          <w:sz w:val="26"/>
-          <w:szCs w:val="26"/>
-        </w:rPr>
-        <w:t xml:space="preserve">    {{nddpl}}                   </w:t>
-      </w:r>
-    </w:p>
-    <w:p>
-      <w:pPr>
+          <w:sz w:val="28"/>
+          <w:szCs w:val="28"/>
+        </w:rPr>
+        <w:t xml:space="preserve"> </w:t>
+      </w:r>
+      <w:r>
         <w:rPr>
           <w:rFonts w:ascii="Times New Roman" w:hAnsi="Times New Roman"/>
           <w:b/>
-          <w:sz w:val="26"/>
-          <w:szCs w:val="26"/>
+          <w:sz w:val="28"/>
+          <w:szCs w:val="28"/>
+        </w:rPr>
+        <w:t xml:space="preserve">{{nddpl}}                   </w:t>
+      </w:r>
+    </w:p>
+    <w:p>
+      <w:pPr>
+        <w:spacing w:after="0" w:line="288" w:lineRule="auto"/>
+        <w:rPr>
+          <w:rFonts w:ascii="Times New Roman" w:hAnsi="Times New Roman"/>
+          <w:b/>
+          <w:sz w:val="28"/>
+          <w:szCs w:val="28"/>
         </w:rPr>
       </w:pPr>
       <w:r>
         <w:rPr>
           <w:rFonts w:ascii="Times New Roman" w:hAnsi="Times New Roman"/>
           <w:i/>
-          <w:sz w:val="26"/>
-          <w:szCs w:val="26"/>
+          <w:sz w:val="28"/>
+          <w:szCs w:val="28"/>
         </w:rPr>
         <w:t>(Ký, ghi rõ họ tên)</w:t>
       </w:r>
@@ -2422,17 +2595,37 @@
         <w:rPr>
           <w:rFonts w:ascii="Times New Roman" w:hAnsi="Times New Roman"/>
           <w:i/>
-          <w:sz w:val="26"/>
-          <w:szCs w:val="26"/>
-        </w:rPr>
-        <w:t xml:space="preserve">     </w:t>
-      </w:r>
+          <w:sz w:val="28"/>
+          <w:szCs w:val="28"/>
+        </w:rPr>
+        <w:t xml:space="preserve">    </w:t>
+      </w:r>
+      <w:bookmarkStart w:id="0" w:name="_GoBack"/>
+      <w:bookmarkEnd w:id="0"/>
       <w:r>
         <w:rPr>
           <w:rFonts w:ascii="Times New Roman" w:hAnsi="Times New Roman"/>
           <w:i/>
-          <w:sz w:val="26"/>
-          <w:szCs w:val="26"/>
+          <w:sz w:val="28"/>
+          <w:szCs w:val="28"/>
+        </w:rPr>
+        <w:t>(Ký, ghi rõ họ tên)</w:t>
+      </w:r>
+      <w:r>
+        <w:rPr>
+          <w:rFonts w:ascii="Times New Roman" w:hAnsi="Times New Roman"/>
+          <w:i/>
+          <w:sz w:val="28"/>
+          <w:szCs w:val="28"/>
+        </w:rPr>
+        <w:tab/>
+      </w:r>
+      <w:r>
+        <w:rPr>
+          <w:rFonts w:ascii="Times New Roman" w:hAnsi="Times New Roman"/>
+          <w:i/>
+          <w:sz w:val="28"/>
+          <w:szCs w:val="28"/>
         </w:rPr>
         <w:t xml:space="preserve">  </w:t>
       </w:r>
@@ -2440,138 +2633,87 @@
         <w:rPr>
           <w:rFonts w:ascii="Times New Roman" w:hAnsi="Times New Roman"/>
           <w:i/>
-          <w:sz w:val="26"/>
-          <w:szCs w:val="26"/>
-        </w:rPr>
-        <w:t>(Ký, ghi rõ họ tên)</w:t>
+          <w:sz w:val="28"/>
+          <w:szCs w:val="28"/>
+        </w:rPr>
+        <w:t>(Ký, ghi rõ họ</w:t>
       </w:r>
       <w:r>
         <w:rPr>
           <w:rFonts w:ascii="Times New Roman" w:hAnsi="Times New Roman"/>
           <w:i/>
-          <w:sz w:val="26"/>
-          <w:szCs w:val="26"/>
+          <w:sz w:val="28"/>
+          <w:szCs w:val="28"/>
+        </w:rPr>
+        <w:t xml:space="preserve"> tên)    </w:t>
+      </w:r>
+      <w:r>
+        <w:rPr>
+          <w:rFonts w:ascii="Times New Roman" w:hAnsi="Times New Roman"/>
+          <w:i/>
+          <w:sz w:val="28"/>
+          <w:szCs w:val="28"/>
+        </w:rPr>
+        <w:t>(Ký tên, và đóng dấu</w:t>
+      </w:r>
+      <w:r>
+        <w:rPr>
+          <w:rFonts w:ascii="Times New Roman" w:hAnsi="Times New Roman"/>
+          <w:i/>
+          <w:sz w:val="28"/>
+          <w:szCs w:val="28"/>
+        </w:rPr>
+        <w:t>)</w:t>
+      </w:r>
+      <w:r>
+        <w:rPr>
+          <w:rFonts w:ascii="Times New Roman" w:hAnsi="Times New Roman"/>
+          <w:i/>
+          <w:sz w:val="28"/>
+          <w:szCs w:val="28"/>
         </w:rPr>
         <w:tab/>
       </w:r>
-      <w:r>
+    </w:p>
+    <w:p>
+      <w:pPr>
+        <w:spacing w:after="0" w:line="288" w:lineRule="auto"/>
         <w:rPr>
           <w:rFonts w:ascii="Times New Roman" w:hAnsi="Times New Roman"/>
           <w:i/>
-          <w:sz w:val="26"/>
-          <w:szCs w:val="26"/>
-        </w:rPr>
-        <w:t xml:space="preserve">  </w:t>
-      </w:r>
-      <w:r>
+          <w:sz w:val="28"/>
+          <w:szCs w:val="28"/>
+        </w:rPr>
+      </w:pPr>
+    </w:p>
+    <w:p>
+      <w:pPr>
+        <w:spacing w:after="0" w:line="288" w:lineRule="auto"/>
         <w:rPr>
           <w:rFonts w:ascii="Times New Roman" w:hAnsi="Times New Roman"/>
           <w:i/>
-          <w:sz w:val="26"/>
-          <w:szCs w:val="26"/>
-        </w:rPr>
-        <w:t xml:space="preserve">          </w:t>
-      </w:r>
-      <w:r>
-        <w:rPr>
-          <w:rFonts w:ascii="Times New Roman" w:hAnsi="Times New Roman"/>
-          <w:i/>
-          <w:sz w:val="26"/>
-          <w:szCs w:val="26"/>
-        </w:rPr>
-        <w:t>(Ký, ghi rõ họ tên)</w:t>
-      </w:r>
-      <w:r>
-        <w:rPr>
-          <w:rFonts w:ascii="Times New Roman" w:hAnsi="Times New Roman"/>
-          <w:i/>
-          <w:sz w:val="26"/>
-          <w:szCs w:val="26"/>
-        </w:rPr>
-        <w:tab/>
-      </w:r>
-      <w:r>
-        <w:rPr>
-          <w:rFonts w:ascii="Times New Roman" w:hAnsi="Times New Roman"/>
-          <w:i/>
-          <w:sz w:val="26"/>
-          <w:szCs w:val="26"/>
-        </w:rPr>
-        <w:t xml:space="preserve">     </w:t>
-      </w:r>
-      <w:r>
-        <w:rPr>
-          <w:rFonts w:ascii="Times New Roman" w:hAnsi="Times New Roman"/>
-          <w:i/>
-          <w:sz w:val="26"/>
-          <w:szCs w:val="26"/>
-        </w:rPr>
-        <w:t xml:space="preserve">  </w:t>
-      </w:r>
-      <w:r>
-        <w:rPr>
-          <w:rFonts w:ascii="Times New Roman" w:hAnsi="Times New Roman"/>
-          <w:i/>
-          <w:sz w:val="26"/>
-          <w:szCs w:val="26"/>
-        </w:rPr>
-        <w:t>(Ký tên, và đóng dấu</w:t>
-      </w:r>
-      <w:r>
-        <w:rPr>
-          <w:rFonts w:ascii="Times New Roman" w:hAnsi="Times New Roman"/>
-          <w:i/>
-          <w:sz w:val="26"/>
-          <w:szCs w:val="26"/>
-        </w:rPr>
-        <w:t>)</w:t>
-      </w:r>
-      <w:r>
-        <w:rPr>
-          <w:rFonts w:ascii="Times New Roman" w:hAnsi="Times New Roman"/>
-          <w:i/>
-          <w:sz w:val="26"/>
-          <w:szCs w:val="26"/>
-        </w:rPr>
-        <w:tab/>
-      </w:r>
-    </w:p>
-    <w:p>
-      <w:pPr>
-        <w:rPr>
-          <w:rFonts w:ascii="Times New Roman" w:hAnsi="Times New Roman"/>
-          <w:i/>
-          <w:sz w:val="26"/>
-          <w:szCs w:val="26"/>
-        </w:rPr>
-      </w:pPr>
-    </w:p>
-    <w:p>
-      <w:pPr>
-        <w:rPr>
-          <w:rFonts w:ascii="Times New Roman" w:hAnsi="Times New Roman"/>
-          <w:i/>
-          <w:sz w:val="26"/>
-          <w:szCs w:val="26"/>
-        </w:rPr>
-      </w:pPr>
-    </w:p>
-    <w:p>
-      <w:pPr>
+          <w:sz w:val="28"/>
+          <w:szCs w:val="28"/>
+        </w:rPr>
+      </w:pPr>
+    </w:p>
+    <w:p>
+      <w:pPr>
+        <w:spacing w:after="0" w:line="288" w:lineRule="auto"/>
         <w:rPr>
           <w:rFonts w:ascii="Times New Roman" w:hAnsi="Times New Roman"/>
           <w:b/>
           <w:i/>
-          <w:sz w:val="26"/>
-          <w:szCs w:val="26"/>
+          <w:sz w:val="28"/>
+          <w:szCs w:val="28"/>
         </w:rPr>
       </w:pPr>
       <w:r>
         <w:rPr>
           <w:rFonts w:ascii="Times New Roman" w:hAnsi="Times New Roman"/>
           <w:i/>
-          <w:sz w:val="26"/>
-          <w:szCs w:val="26"/>
+          <w:sz w:val="28"/>
+          <w:szCs w:val="28"/>
         </w:rPr>
         <w:t xml:space="preserve">           </w:t>
       </w:r>
@@ -2579,8 +2721,8 @@
         <w:rPr>
           <w:rFonts w:ascii="Times New Roman" w:hAnsi="Times New Roman"/>
           <w:i/>
-          <w:sz w:val="26"/>
-          <w:szCs w:val="26"/>
+          <w:sz w:val="28"/>
+          <w:szCs w:val="28"/>
         </w:rPr>
         <w:t xml:space="preserve">                    </w:t>
       </w:r>
@@ -2588,8 +2730,8 @@
         <w:rPr>
           <w:rFonts w:ascii="Times New Roman" w:hAnsi="Times New Roman"/>
           <w:i/>
-          <w:sz w:val="26"/>
-          <w:szCs w:val="26"/>
+          <w:sz w:val="28"/>
+          <w:szCs w:val="28"/>
         </w:rPr>
         <w:t xml:space="preserve">    </w:t>
       </w:r>
@@ -2598,29 +2740,31 @@
           <w:rFonts w:ascii="Times New Roman" w:hAnsi="Times New Roman"/>
           <w:b/>
           <w:i/>
-          <w:sz w:val="26"/>
-          <w:szCs w:val="26"/>
+          <w:sz w:val="28"/>
+          <w:szCs w:val="28"/>
         </w:rPr>
         <w:t>{{canBoTDVT}}</w:t>
       </w:r>
     </w:p>
     <w:p>
       <w:pPr>
+        <w:spacing w:after="0" w:line="288" w:lineRule="auto"/>
         <w:rPr>
           <w:rFonts w:ascii="Times New Roman" w:hAnsi="Times New Roman"/>
           <w:i/>
-          <w:sz w:val="26"/>
-          <w:szCs w:val="26"/>
-        </w:rPr>
-      </w:pPr>
-    </w:p>
-    <w:p>
-      <w:pPr>
+          <w:sz w:val="28"/>
+          <w:szCs w:val="28"/>
+        </w:rPr>
+      </w:pPr>
+    </w:p>
+    <w:p>
+      <w:pPr>
+        <w:spacing w:after="0" w:line="288" w:lineRule="auto"/>
         <w:rPr>
           <w:rFonts w:ascii="Times New Roman" w:hAnsi="Times New Roman"/>
           <w:i/>
-          <w:sz w:val="26"/>
-          <w:szCs w:val="26"/>
+          <w:sz w:val="28"/>
+          <w:szCs w:val="28"/>
         </w:rPr>
       </w:pPr>
     </w:p>

</xml_diff>